<commit_message>
Se actualizó la información de admob
</commit_message>
<xml_diff>
--- a/Android/Jetpack Compose/Jetpack Compose.docx
+++ b/Android/Jetpack Compose/Jetpack Compose.docx
@@ -25042,6 +25042,11 @@
           <w:highlight w:val="none"/>
         </w:rPr>
       </w:r>
+      <w:r>
+        <w:rPr>
+          <w:highlight w:val="none"/>
+        </w:rPr>
+      </w:r>
     </w:p>
     <w:p>
       <w:pPr>
@@ -25113,6 +25118,12 @@
           <w:rStyle w:val="839"/>
         </w:rPr>
         <w:t xml:space="preserve">build.gradle project</w:t>
+      </w:r>
+      <w:r>
+        <w:rPr>
+          <w:rStyle w:val="839"/>
+          <w:highlight w:val="none"/>
+        </w:rPr>
       </w:r>
       <w:r>
         <w:rPr>
@@ -25160,7 +25171,12 @@
       </w:r>
       <w:r>
         <w:rPr>
-          <w:sz w:val="24"/>
+          <w:rFonts w:ascii="Arial" w:hAnsi="Arial" w:eastAsia="Arial" w:cs="Arial"/>
+          <w:b/>
+          <w:bCs/>
+          <w:color w:val="bcbec4"/>
+          <w:sz w:val="20"/>
+          <w:szCs w:val="20"/>
         </w:rPr>
       </w:r>
       <w:r>
@@ -25206,7 +25222,7 @@
           <w:rFonts w:ascii="Arial" w:hAnsi="Arial" w:eastAsia="Arial" w:cs="Arial"/>
           <w:color w:val="cf8e6d"/>
           <w:sz w:val="20"/>
-          <w:highlight w:val="none"/>
+          <w:szCs w:val="20"/>
         </w:rPr>
       </w:r>
       <w:r>
@@ -25483,6 +25499,12 @@
           <w:szCs w:val="24"/>
         </w:rPr>
       </w:r>
+      <w:r>
+        <w:rPr>
+          <w:sz w:val="24"/>
+          <w:szCs w:val="24"/>
+        </w:rPr>
+      </w:r>
     </w:p>
     <w:p>
       <w:pPr>
@@ -25514,6 +25536,12 @@
           <w:highlight w:val="none"/>
         </w:rPr>
         <w:t xml:space="preserve">ón de kotlin usada</w:t>
+      </w:r>
+      <w:r>
+        <w:rPr>
+          <w:rStyle w:val="839"/>
+          <w:highlight w:val="none"/>
+        </w:rPr>
       </w:r>
       <w:r>
         <w:rPr>
@@ -25552,7 +25580,10 @@
       </w:r>
       <w:r>
         <w:rPr>
-          <w:sz w:val="24"/>
+          <w:rFonts w:ascii="Arial" w:hAnsi="Arial" w:eastAsia="Arial" w:cs="Arial"/>
+          <w:color w:val="bcbec4"/>
+          <w:sz w:val="20"/>
+          <w:szCs w:val="20"/>
         </w:rPr>
       </w:r>
       <w:r>
@@ -25601,8 +25632,10 @@
       </w:r>
       <w:r>
         <w:rPr>
-          <w:sz w:val="24"/>
-          <w:szCs w:val="24"/>
+          <w:rFonts w:ascii="Arial" w:hAnsi="Arial" w:eastAsia="Arial" w:cs="Arial"/>
+          <w:color w:val="bcbec4"/>
+          <w:sz w:val="20"/>
+          <w:szCs w:val="20"/>
         </w:rPr>
       </w:r>
       <w:r>
@@ -25711,6 +25744,7 @@
           <w:rFonts w:ascii="Arial" w:hAnsi="Arial" w:eastAsia="Arial" w:cs="Arial"/>
           <w:color w:val="ff0000"/>
           <w:sz w:val="20"/>
+          <w:szCs w:val="20"/>
           <w:highlight w:val="none"/>
         </w:rPr>
       </w:r>
@@ -25762,7 +25796,10 @@
       </w:r>
       <w:r>
         <w:rPr>
-          <w:sz w:val="24"/>
+          <w:rFonts w:ascii="Arial" w:hAnsi="Arial" w:eastAsia="Arial" w:cs="Arial"/>
+          <w:color w:val="6aab73"/>
+          <w:sz w:val="20"/>
+          <w:szCs w:val="20"/>
         </w:rPr>
       </w:r>
       <w:r>
@@ -25806,8 +25843,7 @@
       </w:r>
       <w:r>
         <w:rPr>
-          <w:sz w:val="24"/>
-          <w:szCs w:val="24"/>
+          <w:highlight w:val="none"/>
         </w:rPr>
       </w:r>
       <w:r>
@@ -25877,7 +25913,10 @@
       </w:r>
       <w:r>
         <w:rPr>
-          <w:sz w:val="24"/>
+          <w:rFonts w:ascii="Arial" w:hAnsi="Arial" w:eastAsia="Arial" w:cs="Arial"/>
+          <w:color w:val="bcbec4"/>
+          <w:sz w:val="20"/>
+          <w:szCs w:val="20"/>
         </w:rPr>
       </w:r>
       <w:r>
@@ -25905,7 +25944,6 @@
           <w:color w:val="bcbec4"/>
           <w:sz w:val="20"/>
           <w:szCs w:val="20"/>
-          <w:highlight w:val="none"/>
         </w:rPr>
       </w:pPr>
       <w:r>
@@ -25915,12 +25953,6 @@
           <w:sz w:val="20"/>
         </w:rPr>
         <w:t xml:space="preserve">    implementation(libs.play.services.ads)</w:t>
-      </w:r>
-      <w:r>
-        <w:rPr>
-          <w:sz w:val="24"/>
-          <w:szCs w:val="24"/>
-        </w:rPr>
       </w:r>
       <w:r>
         <w:rPr>
@@ -25944,31 +25976,107 @@
         <w:spacing/>
         <w:ind w:right="0" w:firstLine="0" w:left="0"/>
         <w:rPr>
-          <w:sz w:val="24"/>
-          <w:szCs w:val="24"/>
-        </w:rPr>
-      </w:pPr>
-      <w:r>
-        <w:rPr>
-          <w:rFonts w:ascii="Arial" w:hAnsi="Arial" w:eastAsia="Arial" w:cs="Arial"/>
-          <w:color w:val="bcbec4"/>
-          <w:sz w:val="20"/>
+          <w:rFonts w:ascii="Arial" w:hAnsi="Arial" w:eastAsia="Arial" w:cs="Arial"/>
+          <w:color w:val="bcbec4"/>
+          <w:sz w:val="20"/>
+          <w:szCs w:val="20"/>
           <w:highlight w:val="none"/>
         </w:rPr>
-        <w:t xml:space="preserve">    .......</w:t>
-      </w:r>
-      <w:r>
-        <w:rPr>
-          <w:rFonts w:ascii="Arial" w:hAnsi="Arial" w:eastAsia="Arial" w:cs="Arial"/>
-          <w:color w:val="bcbec4"/>
-          <w:sz w:val="20"/>
+      </w:pPr>
+      <w:r>
+        <w:rPr>
+          <w:rFonts w:ascii="Arial" w:hAnsi="Arial" w:eastAsia="Arial" w:cs="Arial"/>
+          <w:color w:val="bcbec4"/>
+          <w:sz w:val="20"/>
+        </w:rPr>
+        <w:t xml:space="preserve">    </w:t>
+      </w:r>
+      <w:r>
+        <w:rPr>
+          <w:rFonts w:ascii="Arial" w:hAnsi="Arial" w:eastAsia="Arial" w:cs="Arial"/>
+          <w:color w:val="bcbec4"/>
+          <w:sz w:val="20"/>
+        </w:rPr>
+        <w:t xml:space="preserve">implementation(platform(</w:t>
+      </w:r>
+      <w:r>
+        <w:rPr>
+          <w:rFonts w:ascii="Arial" w:hAnsi="Arial" w:eastAsia="Arial" w:cs="Arial"/>
+          <w:color w:val="6aab73"/>
+          <w:sz w:val="20"/>
+        </w:rPr>
+        <w:t xml:space="preserve">"com.google.firebase:firebase-bom:34.16.0"</w:t>
+      </w:r>
+      <w:r>
+        <w:rPr>
+          <w:rFonts w:ascii="Arial" w:hAnsi="Arial" w:eastAsia="Arial" w:cs="Arial"/>
+          <w:color w:val="bcbec4"/>
+          <w:sz w:val="20"/>
+        </w:rPr>
+        <w:t xml:space="preserve">))</w:t>
+        <w:br/>
+        <w:t xml:space="preserve">    implementation(</w:t>
+      </w:r>
+      <w:r>
+        <w:rPr>
+          <w:rFonts w:ascii="Arial" w:hAnsi="Arial" w:eastAsia="Arial" w:cs="Arial"/>
+          <w:color w:val="6aab73"/>
+          <w:sz w:val="20"/>
+        </w:rPr>
+        <w:t xml:space="preserve">"com.google.firebase:firebase-analytics"</w:t>
+      </w:r>
+      <w:r>
+        <w:rPr>
+          <w:rFonts w:ascii="Arial" w:hAnsi="Arial" w:eastAsia="Arial" w:cs="Arial"/>
+          <w:color w:val="bcbec4"/>
+          <w:sz w:val="20"/>
+        </w:rPr>
+        <w:t xml:space="preserve">)</w:t>
+      </w:r>
+      <w:r>
+        <w:rPr>
+          <w:rFonts w:ascii="Arial" w:hAnsi="Arial" w:eastAsia="Arial" w:cs="Arial"/>
+          <w:color w:val="bcbec4"/>
+          <w:sz w:val="20"/>
+          <w:szCs w:val="20"/>
           <w:highlight w:val="none"/>
         </w:rPr>
       </w:r>
-      <w:r>
-        <w:rPr>
-          <w:sz w:val="24"/>
-          <w:szCs w:val="24"/>
+      <w:r/>
+      <w:r>
+        <w:rPr>
+          <w:rFonts w:ascii="Arial" w:hAnsi="Arial" w:eastAsia="Arial" w:cs="Arial"/>
+          <w:color w:val="bcbec4"/>
+          <w:sz w:val="20"/>
+          <w:szCs w:val="20"/>
+          <w:highlight w:val="none"/>
+        </w:rPr>
+      </w:r>
+      <w:r>
+        <w:rPr>
+          <w:rFonts w:ascii="Arial" w:hAnsi="Arial" w:eastAsia="Arial" w:cs="Arial"/>
+          <w:color w:val="bcbec4"/>
+          <w:sz w:val="20"/>
+          <w:szCs w:val="20"/>
+          <w:highlight w:val="none"/>
+        </w:rPr>
+      </w:r>
+      <w:r>
+        <w:rPr>
+          <w:rFonts w:ascii="Arial" w:hAnsi="Arial" w:eastAsia="Arial" w:cs="Arial"/>
+          <w:color w:val="bcbec4"/>
+          <w:sz w:val="20"/>
+          <w:szCs w:val="20"/>
+          <w:highlight w:val="none"/>
+        </w:rPr>
+      </w:r>
+      <w:r>
+        <w:rPr>
+          <w:rFonts w:ascii="Arial" w:hAnsi="Arial" w:eastAsia="Arial" w:cs="Arial"/>
+          <w:color w:val="bcbec4"/>
+          <w:sz w:val="20"/>
+          <w:szCs w:val="20"/>
+          <w:highlight w:val="none"/>
         </w:rPr>
       </w:r>
     </w:p>
@@ -25990,13 +26098,17 @@
       </w:pPr>
       <w:r>
         <w:rPr>
+          <w:rFonts w:ascii="Arial" w:hAnsi="Arial" w:eastAsia="Arial" w:cs="Arial"/>
+          <w:color w:val="bcbec4"/>
+          <w:sz w:val="20"/>
           <w:highlight w:val="none"/>
         </w:rPr>
-        <w:t xml:space="preserve">}</w:t>
-      </w:r>
-      <w:r>
-        <w:rPr>
-          <w:highlight w:val="none"/>
+        <w:t xml:space="preserve">    .......</w:t>
+      </w:r>
+      <w:r>
+        <w:rPr>
+          <w:sz w:val="24"/>
+          <w:szCs w:val="24"/>
         </w:rPr>
       </w:r>
       <w:r>
@@ -26026,11 +26138,7 @@
         <w:rPr>
           <w:highlight w:val="none"/>
         </w:rPr>
-      </w:r>
-      <w:r>
-        <w:rPr>
-          <w:highlight w:val="none"/>
-        </w:rPr>
+        <w:t xml:space="preserve">}</w:t>
       </w:r>
       <w:r>
         <w:rPr>
@@ -26038,9 +26146,49 @@
           <w:szCs w:val="24"/>
         </w:rPr>
       </w:r>
+      <w:r>
+        <w:rPr>
+          <w:sz w:val="24"/>
+          <w:szCs w:val="24"/>
+        </w:rPr>
+      </w:r>
     </w:p>
     <w:p>
       <w:pPr>
+        <w:pBdr>
+          <w:top w:val="none" w:color="000000" w:sz="4" w:space="0"/>
+          <w:left w:val="none" w:color="000000" w:sz="4" w:space="0"/>
+          <w:bottom w:val="none" w:color="000000" w:sz="4" w:space="0"/>
+          <w:right w:val="none" w:color="000000" w:sz="4" w:space="0"/>
+        </w:pBdr>
+        <w:shd w:val="clear" w:color="191a1c" w:fill="191a1c"/>
+        <w:spacing/>
+        <w:ind w:right="0" w:firstLine="0" w:left="0"/>
+        <w:rPr>
+          <w:sz w:val="24"/>
+          <w:szCs w:val="24"/>
+        </w:rPr>
+      </w:pPr>
+      <w:r>
+        <w:rPr>
+          <w:highlight w:val="none"/>
+        </w:rPr>
+      </w:r>
+      <w:r>
+        <w:rPr>
+          <w:sz w:val="24"/>
+          <w:szCs w:val="24"/>
+        </w:rPr>
+      </w:r>
+      <w:r>
+        <w:rPr>
+          <w:sz w:val="24"/>
+          <w:szCs w:val="24"/>
+        </w:rPr>
+      </w:r>
+    </w:p>
+    <w:p>
+      <w:pPr>
         <w:pStyle w:val="828"/>
         <w:pBdr/>
         <w:spacing/>
@@ -26063,6 +26211,12 @@
           <w:highlight w:val="none"/>
         </w:rPr>
       </w:r>
+      <w:r>
+        <w:rPr>
+          <w:rStyle w:val="839"/>
+          <w:highlight w:val="none"/>
+        </w:rPr>
+      </w:r>
     </w:p>
     <w:p>
       <w:pPr>
@@ -26094,6 +26248,7 @@
       <w:r>
         <w:rPr>
           <w:highlight w:val="none"/>
+          <w14:ligatures w14:val="none"/>
         </w:rPr>
       </w:r>
       <w:r>
@@ -26605,7 +26760,7 @@
           <w:color w:val="ff0000"/>
           <w:highlight w:val="none"/>
         </w:rPr>
-        <w:t xml:space="preserve">SOLO SE PUEDE USAR LA CLAVE PRODUCTIVA CUANDO SEA PUBLICADA EN LA PLAY STORE O DE LO CONTRARIO NOS PUEDE SUSPENDER LA APLICACI</w:t>
+        <w:t xml:space="preserve">SOLO SE PUEDE USAR LA CLAVE </w:t>
       </w:r>
       <w:r>
         <w:rPr>
@@ -26615,9 +26770,34 @@
           <w:color w:val="ff0000"/>
           <w:highlight w:val="none"/>
         </w:rPr>
+        <w:t xml:space="preserve">admob_bloque_anuncios_id</w:t>
+      </w:r>
+      <w:r>
+        <w:rPr>
+          <w:rStyle w:val="838"/>
+          <w:b/>
+          <w:bCs/>
+          <w:color w:val="ff0000"/>
+          <w:highlight w:val="none"/>
+        </w:rPr>
+        <w:t xml:space="preserve"> CUANDO SEA PUBLICADA EN LA PLAY STORE O DE LO CONTRARIO NOS PUEDE SUSPENDER LA APLICACI</w:t>
+      </w:r>
+      <w:r>
+        <w:rPr>
+          <w:rStyle w:val="838"/>
+          <w:b/>
+          <w:bCs/>
+          <w:color w:val="ff0000"/>
+          <w:highlight w:val="none"/>
+        </w:rPr>
         <w:t xml:space="preserve">ÓN ADMOB DE GOOGLE.</w:t>
       </w:r>
-      <w:r/>
+      <w:r>
+        <w:rPr>
+          <w:rStyle w:val="838"/>
+          <w:highlight w:val="none"/>
+        </w:rPr>
+      </w:r>
     </w:p>
     <w:p>
       <w:pPr>
@@ -26659,23 +26839,16 @@
           <w:rFonts w:ascii="Arial" w:hAnsi="Arial" w:eastAsia="Arial" w:cs="Arial"/>
           <w:color w:val="d5b778"/>
           <w:sz w:val="20"/>
+          <w:szCs w:val="20"/>
+        </w:rPr>
+      </w:r>
+      <w:r>
+        <w:rPr>
+          <w:rFonts w:ascii="Arial" w:hAnsi="Arial" w:eastAsia="Arial" w:cs="Arial"/>
+          <w:color w:val="d5b778"/>
+          <w:sz w:val="20"/>
+          <w:szCs w:val="20"/>
           <w:highlight w:val="none"/>
-        </w:rPr>
-      </w:r>
-      <w:r>
-        <w:rPr>
-          <w:rFonts w:ascii="Arial" w:hAnsi="Arial" w:eastAsia="Arial" w:cs="Arial"/>
-          <w:color w:val="d5b778"/>
-          <w:sz w:val="20"/>
-          <w:highlight w:val="none"/>
-        </w:rPr>
-      </w:r>
-      <w:r>
-        <w:rPr>
-          <w:rFonts w:ascii="Arial" w:hAnsi="Arial" w:eastAsia="Arial" w:cs="Arial"/>
-          <w:color w:val="d5b778"/>
-          <w:sz w:val="20"/>
-          <w:szCs w:val="20"/>
         </w:rPr>
       </w:r>
     </w:p>
@@ -26719,7 +26892,7 @@
           <w:rFonts w:ascii="Arial" w:hAnsi="Arial" w:eastAsia="Arial" w:cs="Arial"/>
           <w:color w:val="d5b778"/>
           <w:sz w:val="20"/>
-          <w:highlight w:val="none"/>
+          <w:szCs w:val="20"/>
         </w:rPr>
       </w:r>
     </w:p>
@@ -26744,13 +26917,6 @@
       <w:r>
         <w:rPr>
           <w:rFonts w:ascii="Arial" w:hAnsi="Arial" w:eastAsia="Arial" w:cs="Arial"/>
-          <w:color w:val="7a7e85"/>
-          <w:sz w:val="20"/>
-        </w:rPr>
-      </w:r>
-      <w:r>
-        <w:rPr>
-          <w:rFonts w:ascii="Arial" w:hAnsi="Arial" w:eastAsia="Arial" w:cs="Arial"/>
           <w:color w:val="d5b778"/>
           <w:sz w:val="20"/>
         </w:rPr>
@@ -26770,7 +26936,7 @@
           <w:color w:val="6aab73"/>
           <w:sz w:val="20"/>
         </w:rPr>
-        <w:t xml:space="preserve">="banner_ad_unit_id_QA"</w:t>
+        <w:t xml:space="preserve">="admob_app_id"</w:t>
       </w:r>
       <w:r>
         <w:rPr>
@@ -26786,7 +26952,7 @@
           <w:color w:val="bcbec4"/>
           <w:sz w:val="20"/>
         </w:rPr>
-        <w:t xml:space="preserve">ca-app-pub-3940256099942544~6300978111</w:t>
+        <w:t xml:space="preserve">ca-app-pub-2546662781964002~1993811313</w:t>
       </w:r>
       <w:r>
         <w:rPr>
@@ -26794,15 +26960,11 @@
           <w:color w:val="d5b778"/>
           <w:sz w:val="20"/>
         </w:rPr>
-        <w:t xml:space="preserve">&lt;/string&gt;    </w:t>
-      </w:r>
-      <w:r>
-        <w:rPr>
-          <w:rFonts w:ascii="Arial" w:hAnsi="Arial" w:eastAsia="Arial" w:cs="Arial"/>
-          <w:color w:val="d5b778"/>
-          <w:sz w:val="20"/>
-          <w:szCs w:val="20"/>
-          <w:highlight w:val="none"/>
+        <w:t xml:space="preserve">&lt;/string&gt; </w:t>
+      </w:r>
+      <w:r>
+        <w:rPr>
+          <w:sz w:val="24"/>
         </w:rPr>
       </w:r>
     </w:p>
@@ -26818,14 +26980,17 @@
         <w:spacing w:after="0"/>
         <w:ind w:right="0" w:firstLine="0" w:left="0"/>
         <w:rPr>
-          <w:highlight w:val="none"/>
-        </w:rPr>
-      </w:pPr>
-      <w:r>
-        <w:rPr>
           <w:rFonts w:ascii="Arial" w:hAnsi="Arial" w:eastAsia="Arial" w:cs="Arial"/>
           <w:color w:val="d5b778"/>
           <w:sz w:val="20"/>
+          <w:szCs w:val="20"/>
+        </w:rPr>
+      </w:pPr>
+      <w:r>
+        <w:rPr>
+          <w:rFonts w:ascii="Arial" w:hAnsi="Arial" w:eastAsia="Arial" w:cs="Arial"/>
+          <w:color w:val="d5b778"/>
+          <w:sz w:val="20"/>
         </w:rPr>
         <w:t xml:space="preserve">&lt;string </w:t>
       </w:r>
@@ -26843,7 +27008,7 @@
           <w:color w:val="6aab73"/>
           <w:sz w:val="20"/>
         </w:rPr>
-        <w:t xml:space="preserve">="banner_ad_unit_id_PROD"</w:t>
+        <w:t xml:space="preserve">="admob_bloque_anuncios_id"</w:t>
       </w:r>
       <w:r>
         <w:rPr>
@@ -26859,7 +27024,7 @@
           <w:color w:val="bcbec4"/>
           <w:sz w:val="20"/>
         </w:rPr>
-        <w:t xml:space="preserve">ca-app-pub-2546662781964002~1993811313</w:t>
+        <w:t xml:space="preserve">ca-app-pub-2546662781964002/7657321674</w:t>
       </w:r>
       <w:r>
         <w:rPr>
@@ -26869,14 +27034,10 @@
         </w:rPr>
         <w:t xml:space="preserve">&lt;/string&gt;</w:t>
       </w:r>
-      <w:r/>
-      <w:r>
-        <w:rPr>
-          <w:rFonts w:ascii="Arial" w:hAnsi="Arial" w:eastAsia="Arial" w:cs="Arial"/>
-          <w:color w:val="d5b778"/>
-          <w:sz w:val="20"/>
-          <w:szCs w:val="20"/>
-          <w:highlight w:val="none"/>
+      <w:r>
+        <w:rPr>
+          <w:sz w:val="24"/>
+          <w:szCs w:val="24"/>
         </w:rPr>
       </w:r>
     </w:p>
@@ -26892,29 +27053,60 @@
         <w:spacing w:after="0"/>
         <w:ind w:right="0" w:firstLine="0" w:left="0"/>
         <w:rPr>
+          <w:sz w:val="24"/>
+          <w:szCs w:val="24"/>
+        </w:rPr>
+      </w:pPr>
+      <w:r>
+        <w:rPr>
           <w:rFonts w:ascii="Arial" w:hAnsi="Arial" w:eastAsia="Arial" w:cs="Arial"/>
           <w:color w:val="d5b778"/>
           <w:sz w:val="20"/>
-          <w:szCs w:val="20"/>
-          <w:highlight w:val="none"/>
-        </w:rPr>
-      </w:pPr>
-      <w:r>
-        <w:rPr>
-          <w:highlight w:val="none"/>
-        </w:rPr>
-        <w:t xml:space="preserve">.......</w:t>
-      </w:r>
-      <w:r>
-        <w:rPr>
-          <w:highlight w:val="none"/>
-        </w:rPr>
-      </w:r>
-      <w:r>
-        <w:rPr>
-          <w:highlight w:val="none"/>
-        </w:rPr>
-      </w:r>
+        </w:rPr>
+        <w:t xml:space="preserve">&lt;string </w:t>
+      </w:r>
+      <w:r>
+        <w:rPr>
+          <w:rFonts w:ascii="Arial" w:hAnsi="Arial" w:eastAsia="Arial" w:cs="Arial"/>
+          <w:color w:val="bcbec4"/>
+          <w:sz w:val="20"/>
+        </w:rPr>
+        <w:t xml:space="preserve">name</w:t>
+      </w:r>
+      <w:r>
+        <w:rPr>
+          <w:rFonts w:ascii="Arial" w:hAnsi="Arial" w:eastAsia="Arial" w:cs="Arial"/>
+          <w:color w:val="6aab73"/>
+          <w:sz w:val="20"/>
+        </w:rPr>
+        <w:t xml:space="preserve">="admob_bloque_anuncios_id_test"</w:t>
+      </w:r>
+      <w:r>
+        <w:rPr>
+          <w:rFonts w:ascii="Arial" w:hAnsi="Arial" w:eastAsia="Arial" w:cs="Arial"/>
+          <w:color w:val="d5b778"/>
+          <w:sz w:val="20"/>
+        </w:rPr>
+        <w:t xml:space="preserve">&gt;</w:t>
+      </w:r>
+      <w:r>
+        <w:rPr>
+          <w:rFonts w:ascii="Arial" w:hAnsi="Arial" w:eastAsia="Arial" w:cs="Arial"/>
+          <w:color w:val="bcbec4"/>
+          <w:sz w:val="20"/>
+        </w:rPr>
+        <w:t xml:space="preserve">ca-app-pub-3940256099942544/6300978111</w:t>
+      </w:r>
+      <w:r>
+        <w:rPr>
+          <w:rFonts w:ascii="Arial" w:hAnsi="Arial" w:eastAsia="Arial" w:cs="Arial"/>
+          <w:color w:val="d5b778"/>
+          <w:sz w:val="20"/>
+        </w:rPr>
+        <w:t xml:space="preserve">&lt;/string&gt;</w:t>
+      </w:r>
+      <w:r/>
+      <w:r/>
     </w:p>
     <w:p>
       <w:pPr>
@@ -26928,43 +27120,33 @@
         <w:spacing w:after="0"/>
         <w:ind w:right="0" w:firstLine="0" w:left="0"/>
         <w:rPr>
-          <w:sz w:val="24"/>
-          <w:szCs w:val="24"/>
-        </w:rPr>
-      </w:pPr>
-      <w:r>
-        <w:rPr>
           <w:rFonts w:ascii="Arial" w:hAnsi="Arial" w:eastAsia="Arial" w:cs="Arial"/>
           <w:color w:val="d5b778"/>
           <w:sz w:val="20"/>
-        </w:rPr>
-        <w:t xml:space="preserve">&lt;/resources&gt;</w:t>
-      </w:r>
-      <w:r/>
-      <w:r/>
-    </w:p>
-    <w:p>
-      <w:pPr>
-        <w:pStyle w:val="828"/>
-        <w:pBdr/>
-        <w:spacing/>
-        <w:ind/>
-        <w:rPr/>
-      </w:pPr>
-      <w:r>
-        <w:rPr>
-          <w:rStyle w:val="838"/>
+          <w:szCs w:val="20"/>
           <w:highlight w:val="none"/>
         </w:rPr>
-      </w:r>
-      <w:r>
-        <w:rPr>
-          <w:rStyle w:val="838"/>
+      </w:pPr>
+      <w:r>
+        <w:rPr>
           <w:highlight w:val="none"/>
         </w:rPr>
-        <w:t xml:space="preserve">Agregar admob en el AndroidManifest.xml</w:t>
-      </w:r>
-      <w:r/>
+        <w:t xml:space="preserve">.......</w:t>
+      </w:r>
+      <w:r>
+        <w:rPr>
+          <w:highlight w:val="none"/>
+        </w:rPr>
+      </w:r>
+      <w:r>
+        <w:rPr>
+          <w:rFonts w:ascii="Arial" w:hAnsi="Arial" w:eastAsia="Arial" w:cs="Arial"/>
+          <w:color w:val="d5b778"/>
+          <w:sz w:val="20"/>
+          <w:szCs w:val="20"/>
+          <w:highlight w:val="none"/>
+        </w:rPr>
+      </w:r>
     </w:p>
     <w:p>
       <w:pPr>
@@ -26978,43 +27160,106 @@
         <w:spacing w:after="0"/>
         <w:ind w:right="0" w:firstLine="0" w:left="0"/>
         <w:rPr>
+          <w:sz w:val="24"/>
+          <w:szCs w:val="24"/>
+        </w:rPr>
+      </w:pPr>
+      <w:r>
+        <w:rPr>
           <w:rFonts w:ascii="Arial" w:hAnsi="Arial" w:eastAsia="Arial" w:cs="Arial"/>
           <w:color w:val="d5b778"/>
           <w:sz w:val="20"/>
-          <w:szCs w:val="20"/>
+        </w:rPr>
+        <w:t xml:space="preserve">&lt;/resources&gt;</w:t>
+      </w:r>
+      <w:r>
+        <w:rPr>
+          <w:sz w:val="24"/>
+          <w:szCs w:val="24"/>
+        </w:rPr>
+      </w:r>
+    </w:p>
+    <w:p>
+      <w:pPr>
+        <w:pBdr/>
+        <w:spacing/>
+        <w:ind/>
+        <w:rPr/>
+      </w:pPr>
+      <w:r>
+        <w:rPr>
+          <w:rStyle w:val="838"/>
           <w:highlight w:val="none"/>
-          <w:lang w:val="es-ES"/>
-          <w14:ligatures w14:val="none"/>
-        </w:rPr>
-      </w:pPr>
-      <w:r>
-        <w:rPr>
-          <w:rFonts w:ascii="Arial" w:hAnsi="Arial" w:eastAsia="Arial" w:cs="Arial"/>
-          <w:color w:val="d5b778"/>
-          <w:sz w:val="20"/>
-          <w:szCs w:val="20"/>
-          <w:lang w:val="undefined"/>
-        </w:rPr>
-        <w:t xml:space="preserve">&lt;application</w:t>
-      </w:r>
-      <w:r>
-        <w:rPr>
-          <w:rFonts w:ascii="Arial" w:hAnsi="Arial" w:eastAsia="Arial" w:cs="Arial"/>
-          <w:color w:val="d5b778"/>
-          <w:sz w:val="20"/>
-          <w:szCs w:val="20"/>
-          <w:lang w:val="es-ES"/>
-        </w:rPr>
-        <w:t xml:space="preserve">&gt;</w:t>
-      </w:r>
-      <w:r>
-        <w:rPr>
-          <w:rFonts w:ascii="Arial" w:hAnsi="Arial" w:eastAsia="Arial" w:cs="Arial"/>
-          <w:color w:val="d5b778"/>
-          <w:sz w:val="20"/>
-          <w:szCs w:val="20"/>
-        </w:rPr>
-      </w:r>
+        </w:rPr>
+        <w:t xml:space="preserve">Se tienen que considerar dos claves</w:t>
+      </w:r>
+      <w:r>
+        <w:rPr>
+          <w:rStyle w:val="838"/>
+          <w:highlight w:val="none"/>
+        </w:rPr>
+        <w:t xml:space="preserve"> “</w:t>
+      </w:r>
+      <w:r>
+        <w:rPr>
+          <w:rStyle w:val="838"/>
+          <w:highlight w:val="none"/>
+        </w:rPr>
+        <w:t xml:space="preserve">admob_app_id</w:t>
+      </w:r>
+      <w:r>
+        <w:rPr>
+          <w:rStyle w:val="838"/>
+          <w:highlight w:val="none"/>
+        </w:rPr>
+        <w:t xml:space="preserve">” y “</w:t>
+      </w:r>
+      <w:r>
+        <w:rPr>
+          <w:rStyle w:val="838"/>
+          <w:highlight w:val="none"/>
+        </w:rPr>
+        <w:t xml:space="preserve">admob_bloque_anuncios_id</w:t>
+      </w:r>
+      <w:r>
+        <w:rPr>
+          <w:rStyle w:val="838"/>
+          <w:highlight w:val="none"/>
+        </w:rPr>
+        <w:t xml:space="preserve">”, estas son claves distintas y se tienen que consultar de la consola de AdMob.</w:t>
+      </w:r>
+      <w:r>
+        <w:rPr>
+          <w:rStyle w:val="838"/>
+          <w:highlight w:val="none"/>
+        </w:rPr>
+      </w:r>
+    </w:p>
+    <w:p>
+      <w:pPr>
+        <w:pStyle w:val="828"/>
+        <w:pBdr/>
+        <w:spacing/>
+        <w:ind/>
+        <w:rPr>
+          <w:rStyle w:val="838"/>
+          <w:highlight w:val="none"/>
+        </w:rPr>
+      </w:pPr>
+      <w:r>
+        <w:rPr>
+          <w:rStyle w:val="838"/>
+          <w:highlight w:val="none"/>
+        </w:rPr>
+      </w:r>
+      <w:r>
+        <w:rPr>
+          <w:rStyle w:val="838"/>
+          <w:highlight w:val="none"/>
+        </w:rPr>
+        <w:t xml:space="preserve">Agregar admob en el AndroidManifest.xml</w:t>
+      </w:r>
+      <w:r/>
     </w:p>
     <w:p>
       <w:pPr>
@@ -27032,19 +27277,37 @@
           <w:color w:val="d5b778"/>
           <w:sz w:val="20"/>
           <w:szCs w:val="20"/>
-          <w14:ligatures w14:val="none"/>
-        </w:rPr>
-      </w:pPr>
-      <w:r>
-        <w:rPr>
-          <w:rFonts w:ascii="Arial" w:hAnsi="Arial" w:eastAsia="Arial" w:cs="Arial"/>
-          <w:color w:val="d5b778"/>
-          <w:sz w:val="20"/>
-          <w:szCs w:val="20"/>
           <w:highlight w:val="none"/>
           <w:lang w:val="es-ES"/>
-        </w:rPr>
-        <w:t xml:space="preserve">......</w:t>
+          <w14:ligatures w14:val="none"/>
+        </w:rPr>
+      </w:pPr>
+      <w:r>
+        <w:rPr>
+          <w:rFonts w:ascii="Arial" w:hAnsi="Arial" w:eastAsia="Arial" w:cs="Arial"/>
+          <w:color w:val="d5b778"/>
+          <w:sz w:val="20"/>
+          <w:szCs w:val="20"/>
+        </w:rPr>
+        <w:t xml:space="preserve">&lt;application</w:t>
+      </w:r>
+      <w:r>
+        <w:rPr>
+          <w:rFonts w:ascii="Arial" w:hAnsi="Arial" w:eastAsia="Arial" w:cs="Arial"/>
+          <w:color w:val="d5b778"/>
+          <w:sz w:val="20"/>
+          <w:szCs w:val="20"/>
+          <w:lang w:val="es-ES"/>
+        </w:rPr>
+        <w:t xml:space="preserve">&gt;</w:t>
+      </w:r>
+      <w:r>
+        <w:rPr>
+          <w:rFonts w:ascii="Arial" w:hAnsi="Arial" w:eastAsia="Arial" w:cs="Arial"/>
+          <w:color w:val="d5b778"/>
+          <w:sz w:val="20"/>
+          <w:szCs w:val="20"/>
+        </w:rPr>
       </w:r>
       <w:r>
         <w:rPr>
@@ -27054,16 +27317,7 @@
           <w:szCs w:val="20"/>
           <w:highlight w:val="none"/>
           <w:lang w:val="es-ES"/>
-        </w:rPr>
-      </w:r>
-      <w:r>
-        <w:rPr>
-          <w:rFonts w:ascii="Arial" w:hAnsi="Arial" w:eastAsia="Arial" w:cs="Arial"/>
-          <w:color w:val="d5b778"/>
-          <w:sz w:val="20"/>
-          <w:szCs w:val="20"/>
-          <w:highlight w:val="none"/>
-          <w:lang w:val="es-ES"/>
+          <w14:ligatures w14:val="none"/>
         </w:rPr>
       </w:r>
     </w:p>
@@ -27080,6 +27334,56 @@
         <w:ind w:right="0" w:firstLine="0" w:left="0"/>
         <w:rPr>
           <w:rFonts w:ascii="Arial" w:hAnsi="Arial" w:eastAsia="Arial" w:cs="Arial"/>
+          <w:color w:val="d5b778"/>
+          <w:sz w:val="20"/>
+          <w:szCs w:val="20"/>
+          <w14:ligatures w14:val="none"/>
+        </w:rPr>
+      </w:pPr>
+      <w:r>
+        <w:rPr>
+          <w:rFonts w:ascii="Arial" w:hAnsi="Arial" w:eastAsia="Arial" w:cs="Arial"/>
+          <w:color w:val="d5b778"/>
+          <w:sz w:val="20"/>
+          <w:szCs w:val="20"/>
+          <w:highlight w:val="none"/>
+          <w:lang w:val="es-ES"/>
+        </w:rPr>
+        <w:t xml:space="preserve">......</w:t>
+      </w:r>
+      <w:r>
+        <w:rPr>
+          <w:rFonts w:ascii="Arial" w:hAnsi="Arial" w:eastAsia="Arial" w:cs="Arial"/>
+          <w:color w:val="d5b778"/>
+          <w:sz w:val="20"/>
+          <w:szCs w:val="20"/>
+          <w:highlight w:val="none"/>
+          <w:lang w:val="es-ES"/>
+        </w:rPr>
+      </w:r>
+      <w:r>
+        <w:rPr>
+          <w:rFonts w:ascii="Arial" w:hAnsi="Arial" w:eastAsia="Arial" w:cs="Arial"/>
+          <w:color w:val="d5b778"/>
+          <w:sz w:val="20"/>
+          <w:szCs w:val="20"/>
+          <w14:ligatures w14:val="none"/>
+        </w:rPr>
+      </w:r>
+    </w:p>
+    <w:p>
+      <w:pPr>
+        <w:pBdr>
+          <w:top w:val="none" w:color="000000" w:sz="4" w:space="0"/>
+          <w:left w:val="none" w:color="000000" w:sz="4" w:space="0"/>
+          <w:bottom w:val="none" w:color="000000" w:sz="4" w:space="0"/>
+          <w:right w:val="none" w:color="000000" w:sz="4" w:space="0"/>
+        </w:pBdr>
+        <w:shd w:val="clear" w:color="191a1c" w:fill="191a1c"/>
+        <w:spacing w:after="0"/>
+        <w:ind w:right="0" w:firstLine="0" w:left="0"/>
+        <w:rPr>
+          <w:rFonts w:ascii="Arial" w:hAnsi="Arial" w:eastAsia="Arial" w:cs="Arial"/>
           <w:color w:val="7a7e85"/>
           <w:sz w:val="20"/>
           <w:szCs w:val="20"/>
@@ -27099,6 +27403,1890 @@
           <w:sz w:val="24"/>
         </w:rPr>
       </w:r>
+      <w:r>
+        <w:rPr>
+          <w:rFonts w:ascii="Arial" w:hAnsi="Arial" w:eastAsia="Arial" w:cs="Arial"/>
+          <w:color w:val="7a7e85"/>
+          <w:sz w:val="20"/>
+          <w:szCs w:val="20"/>
+          <w:highlight w:val="none"/>
+        </w:rPr>
+      </w:r>
+    </w:p>
+    <w:p>
+      <w:pPr>
+        <w:pBdr>
+          <w:top w:val="none" w:color="000000" w:sz="4" w:space="0"/>
+          <w:left w:val="none" w:color="000000" w:sz="4" w:space="0"/>
+          <w:bottom w:val="none" w:color="000000" w:sz="4" w:space="0"/>
+          <w:right w:val="none" w:color="000000" w:sz="4" w:space="0"/>
+        </w:pBdr>
+        <w:shd w:val="clear" w:color="191a1c" w:fill="191a1c"/>
+        <w:spacing/>
+        <w:ind w:right="0" w:firstLine="0" w:left="0"/>
+        <w:rPr/>
+      </w:pPr>
+      <w:r>
+        <w:rPr>
+          <w:rFonts w:ascii="Arial" w:hAnsi="Arial" w:eastAsia="Arial" w:cs="Arial"/>
+          <w:color w:val="d5b778"/>
+          <w:sz w:val="20"/>
+        </w:rPr>
+        <w:t xml:space="preserve">&lt;meta-data    </w:t>
+      </w:r>
+      <w:r>
+        <w:rPr>
+          <w:rFonts w:ascii="Arial" w:hAnsi="Arial" w:eastAsia="Arial" w:cs="Arial"/>
+          <w:color w:val="c77dbb"/>
+          <w:sz w:val="20"/>
+        </w:rPr>
+        <w:t xml:space="preserve">android</w:t>
+      </w:r>
+      <w:r>
+        <w:rPr>
+          <w:rFonts w:ascii="Arial" w:hAnsi="Arial" w:eastAsia="Arial" w:cs="Arial"/>
+          <w:color w:val="bcbec4"/>
+          <w:sz w:val="20"/>
+        </w:rPr>
+        <w:t xml:space="preserve">:name</w:t>
+      </w:r>
+      <w:r>
+        <w:rPr>
+          <w:rFonts w:ascii="Arial" w:hAnsi="Arial" w:eastAsia="Arial" w:cs="Arial"/>
+          <w:color w:val="6aab73"/>
+          <w:sz w:val="20"/>
+        </w:rPr>
+        <w:t xml:space="preserve">="com.google.android.gms.ads.APPLICATION_ID"    </w:t>
+      </w:r>
+      <w:r>
+        <w:rPr>
+          <w:rFonts w:ascii="Arial" w:hAnsi="Arial" w:eastAsia="Arial" w:cs="Arial"/>
+          <w:color w:val="c77dbb"/>
+          <w:sz w:val="20"/>
+        </w:rPr>
+        <w:t xml:space="preserve">android</w:t>
+      </w:r>
+      <w:r>
+        <w:rPr>
+          <w:rFonts w:ascii="Arial" w:hAnsi="Arial" w:eastAsia="Arial" w:cs="Arial"/>
+          <w:color w:val="bcbec4"/>
+          <w:sz w:val="20"/>
+        </w:rPr>
+        <w:t xml:space="preserve">:value</w:t>
+      </w:r>
+      <w:r>
+        <w:rPr>
+          <w:rFonts w:ascii="Arial" w:hAnsi="Arial" w:eastAsia="Arial" w:cs="Arial"/>
+          <w:color w:val="6aab73"/>
+          <w:sz w:val="20"/>
+        </w:rPr>
+        <w:t xml:space="preserve">="@string/admob_app_id"</w:t>
+      </w:r>
+      <w:r>
+        <w:rPr>
+          <w:rFonts w:ascii="Arial" w:hAnsi="Arial" w:eastAsia="Arial" w:cs="Arial"/>
+          <w:color w:val="d5b778"/>
+          <w:sz w:val="20"/>
+        </w:rPr>
+        <w:t xml:space="preserve">/&gt;</w:t>
+      </w:r>
+      <w:r/>
+      <w:r>
+        <w:rPr>
+          <w:rFonts w:ascii="Arial" w:hAnsi="Arial" w:eastAsia="Arial" w:cs="Arial"/>
+          <w:color w:val="7a7e85"/>
+          <w:sz w:val="20"/>
+        </w:rPr>
+      </w:r>
+      <w:r/>
+      <w:r>
+        <w:rPr>
+          <w:sz w:val="24"/>
+        </w:rPr>
+      </w:r>
+    </w:p>
+    <w:p>
+      <w:pPr>
+        <w:pBdr>
+          <w:top w:val="none" w:color="000000" w:sz="4" w:space="0"/>
+          <w:left w:val="none" w:color="000000" w:sz="4" w:space="0"/>
+          <w:bottom w:val="none" w:color="000000" w:sz="4" w:space="0"/>
+          <w:right w:val="none" w:color="000000" w:sz="4" w:space="0"/>
+        </w:pBdr>
+        <w:shd w:val="clear" w:color="191a1c" w:fill="191a1c"/>
+        <w:spacing w:after="0"/>
+        <w:ind w:right="0" w:firstLine="0" w:left="0"/>
+        <w:rPr>
+          <w:highlight w:val="none"/>
+        </w:rPr>
+      </w:pPr>
+      <w:r>
+        <w:rPr>
+          <w:rFonts w:ascii="Arial" w:hAnsi="Arial" w:eastAsia="Arial" w:cs="Arial"/>
+          <w:color w:val="d5b778"/>
+          <w:sz w:val="20"/>
+          <w:szCs w:val="20"/>
+          <w:highlight w:val="none"/>
+          <w:lang w:val="es-ES"/>
+        </w:rPr>
+        <w:t xml:space="preserve">.......</w:t>
+      </w:r>
+      <w:r>
+        <w:rPr>
+          <w:rFonts w:ascii="Arial" w:hAnsi="Arial" w:eastAsia="Arial" w:cs="Arial"/>
+          <w:color w:val="d5b778"/>
+          <w:sz w:val="20"/>
+          <w:szCs w:val="20"/>
+          <w:highlight w:val="none"/>
+        </w:rPr>
+      </w:r>
+      <w:r>
+        <w:rPr>
+          <w:highlight w:val="none"/>
+        </w:rPr>
+      </w:r>
+    </w:p>
+    <w:p>
+      <w:pPr>
+        <w:pBdr>
+          <w:top w:val="none" w:color="000000" w:sz="4" w:space="0"/>
+          <w:left w:val="none" w:color="000000" w:sz="4" w:space="0"/>
+          <w:bottom w:val="none" w:color="000000" w:sz="4" w:space="0"/>
+          <w:right w:val="none" w:color="000000" w:sz="4" w:space="0"/>
+        </w:pBdr>
+        <w:shd w:val="clear" w:color="191a1c" w:fill="191a1c"/>
+        <w:spacing w:after="0"/>
+        <w:ind w:right="0" w:firstLine="0" w:left="0"/>
+        <w:rPr>
+          <w:rFonts w:ascii="Arial" w:hAnsi="Arial" w:eastAsia="Arial" w:cs="Arial"/>
+          <w:color w:val="d5b778"/>
+          <w:sz w:val="20"/>
+          <w:szCs w:val="20"/>
+          <w:highlight w:val="none"/>
+        </w:rPr>
+      </w:pPr>
+      <w:r>
+        <w:rPr>
+          <w:rFonts w:ascii="Arial" w:hAnsi="Arial" w:eastAsia="Arial" w:cs="Arial"/>
+          <w:color w:val="d5b778"/>
+          <w:sz w:val="20"/>
+          <w:szCs w:val="20"/>
+        </w:rPr>
+        <w:t xml:space="preserve">&lt;/application&gt;</w:t>
+      </w:r>
+      <w:r>
+        <w:rPr>
+          <w:highlight w:val="none"/>
+        </w:rPr>
+      </w:r>
+      <w:r>
+        <w:rPr>
+          <w:rFonts w:ascii="Arial" w:hAnsi="Arial" w:eastAsia="Arial" w:cs="Arial"/>
+          <w:color w:val="d5b778"/>
+          <w:sz w:val="20"/>
+          <w:szCs w:val="20"/>
+          <w:highlight w:val="none"/>
+        </w:rPr>
+      </w:r>
+    </w:p>
+    <w:p>
+      <w:pPr>
+        <w:pStyle w:val="828"/>
+        <w:pBdr/>
+        <w:spacing/>
+        <w:ind/>
+        <w:rPr>
+          <w:rStyle w:val="838"/>
+          <w:highlight w:val="none"/>
+        </w:rPr>
+      </w:pPr>
+      <w:r>
+        <w:rPr>
+          <w:rStyle w:val="838"/>
+        </w:rPr>
+        <w:t xml:space="preserve">Inicializar Ads</w:t>
+      </w:r>
+      <w:r>
+        <w:rPr>
+          <w:rStyle w:val="838"/>
+          <w:highlight w:val="none"/>
+        </w:rPr>
+      </w:r>
+    </w:p>
+    <w:p>
+      <w:pPr>
+        <w:pBdr>
+          <w:top w:val="none" w:color="000000" w:sz="4" w:space="0"/>
+          <w:left w:val="none" w:color="000000" w:sz="4" w:space="0"/>
+          <w:bottom w:val="none" w:color="000000" w:sz="4" w:space="0"/>
+          <w:right w:val="none" w:color="000000" w:sz="4" w:space="0"/>
+        </w:pBdr>
+        <w:shd w:val="clear" w:color="191a1c" w:fill="191a1c"/>
+        <w:spacing w:after="0"/>
+        <w:ind w:right="0" w:firstLine="0" w:left="0"/>
+        <w:rPr>
+          <w:rFonts w:ascii="Arial" w:hAnsi="Arial" w:eastAsia="Arial" w:cs="Arial"/>
+          <w:b/>
+          <w:bCs/>
+          <w:color w:val="bcbec4"/>
+          <w:sz w:val="20"/>
+          <w:szCs w:val="20"/>
+        </w:rPr>
+      </w:pPr>
+      <w:r>
+        <w:rPr>
+          <w:rFonts w:ascii="Arial" w:hAnsi="Arial" w:eastAsia="Arial" w:cs="Arial"/>
+          <w:color w:val="cf8e6d"/>
+          <w:sz w:val="20"/>
+        </w:rPr>
+        <w:t xml:space="preserve">class </w:t>
+      </w:r>
+      <w:r>
+        <w:rPr>
+          <w:rFonts w:ascii="Arial" w:hAnsi="Arial" w:eastAsia="Arial" w:cs="Arial"/>
+          <w:color w:val="bcbec4"/>
+          <w:sz w:val="20"/>
+        </w:rPr>
+        <w:t xml:space="preserve">MainActivity : ComponentActivity() {</w:t>
+        <w:br/>
+        <w:t xml:space="preserve">    </w:t>
+      </w:r>
+      <w:r>
+        <w:rPr>
+          <w:rFonts w:ascii="Arial" w:hAnsi="Arial" w:eastAsia="Arial" w:cs="Arial"/>
+          <w:color w:val="cf8e6d"/>
+          <w:sz w:val="20"/>
+        </w:rPr>
+        <w:t xml:space="preserve">override fun </w:t>
+      </w:r>
+      <w:r>
+        <w:rPr>
+          <w:rFonts w:ascii="Arial" w:hAnsi="Arial" w:eastAsia="Arial" w:cs="Arial"/>
+          <w:color w:val="56a8f5"/>
+          <w:sz w:val="20"/>
+        </w:rPr>
+        <w:t xml:space="preserve">onCreate</w:t>
+      </w:r>
+      <w:r>
+        <w:rPr>
+          <w:rFonts w:ascii="Arial" w:hAnsi="Arial" w:eastAsia="Arial" w:cs="Arial"/>
+          <w:color w:val="bcbec4"/>
+          <w:sz w:val="20"/>
+        </w:rPr>
+        <w:t xml:space="preserve">(savedInstanceState: Bundle?) {</w:t>
+        <w:br/>
+        <w:t xml:space="preserve">        </w:t>
+      </w:r>
+      <w:r>
+        <w:rPr>
+          <w:rFonts w:ascii="Arial" w:hAnsi="Arial" w:eastAsia="Arial" w:cs="Arial"/>
+          <w:color w:val="cf8e6d"/>
+          <w:sz w:val="20"/>
+        </w:rPr>
+        <w:t xml:space="preserve">super</w:t>
+      </w:r>
+      <w:r>
+        <w:rPr>
+          <w:rFonts w:ascii="Arial" w:hAnsi="Arial" w:eastAsia="Arial" w:cs="Arial"/>
+          <w:color w:val="bcbec4"/>
+          <w:sz w:val="20"/>
+        </w:rPr>
+        <w:t xml:space="preserve">.onCreate(savedInstanceState)</w:t>
+        <w:br/>
+        <w:t xml:space="preserve">        </w:t>
+      </w:r>
+      <w:r>
+        <w:rPr>
+          <w:rFonts w:ascii="Arial" w:hAnsi="Arial" w:eastAsia="Arial" w:cs="Arial"/>
+          <w:i/>
+          <w:color w:val="bcbec4"/>
+          <w:sz w:val="20"/>
+        </w:rPr>
+        <w:t xml:space="preserve">CoroutineScope</w:t>
+      </w:r>
+      <w:r>
+        <w:rPr>
+          <w:rFonts w:ascii="Arial" w:hAnsi="Arial" w:eastAsia="Arial" w:cs="Arial"/>
+          <w:color w:val="bcbec4"/>
+          <w:sz w:val="20"/>
+        </w:rPr>
+        <w:t xml:space="preserve">(Dispatchers.</w:t>
+      </w:r>
+      <w:r>
+        <w:rPr>
+          <w:rFonts w:ascii="Arial" w:hAnsi="Arial" w:eastAsia="Arial" w:cs="Arial"/>
+          <w:color w:val="c77dbb"/>
+          <w:sz w:val="20"/>
+        </w:rPr>
+        <w:t xml:space="preserve">IO</w:t>
+      </w:r>
+      <w:r>
+        <w:rPr>
+          <w:rFonts w:ascii="Arial" w:hAnsi="Arial" w:eastAsia="Arial" w:cs="Arial"/>
+          <w:color w:val="bcbec4"/>
+          <w:sz w:val="20"/>
+        </w:rPr>
+        <w:t xml:space="preserve">).</w:t>
+      </w:r>
+      <w:r>
+        <w:rPr>
+          <w:rFonts w:ascii="Arial" w:hAnsi="Arial" w:eastAsia="Arial" w:cs="Arial"/>
+          <w:i/>
+          <w:color w:val="57aaf7"/>
+          <w:sz w:val="20"/>
+        </w:rPr>
+        <w:t xml:space="preserve">launch </w:t>
+      </w:r>
+      <w:r>
+        <w:rPr>
+          <w:rFonts w:ascii="Arial" w:hAnsi="Arial" w:eastAsia="Arial" w:cs="Arial"/>
+          <w:b/>
+          <w:color w:val="bcbec4"/>
+          <w:sz w:val="20"/>
+        </w:rPr>
+        <w:t xml:space="preserve">{            </w:t>
+      </w:r>
+      <w:r>
+        <w:rPr>
+          <w:rFonts w:ascii="Arial" w:hAnsi="Arial" w:eastAsia="Arial" w:cs="Arial"/>
+          <w:b/>
+          <w:bCs/>
+          <w:color w:val="bcbec4"/>
+          <w:sz w:val="20"/>
+          <w:szCs w:val="20"/>
+          <w:highlight w:val="none"/>
+        </w:rPr>
+      </w:r>
+      <w:r>
+        <w:rPr>
+          <w:rFonts w:ascii="Arial" w:hAnsi="Arial" w:eastAsia="Arial" w:cs="Arial"/>
+          <w:b/>
+          <w:bCs/>
+          <w:color w:val="bcbec4"/>
+          <w:sz w:val="20"/>
+          <w:szCs w:val="20"/>
+        </w:rPr>
+      </w:r>
+    </w:p>
+    <w:p>
+      <w:pPr>
+        <w:pBdr>
+          <w:top w:val="none" w:color="000000" w:sz="4" w:space="0"/>
+          <w:left w:val="none" w:color="000000" w:sz="4" w:space="0"/>
+          <w:bottom w:val="none" w:color="000000" w:sz="4" w:space="0"/>
+          <w:right w:val="none" w:color="000000" w:sz="4" w:space="0"/>
+        </w:pBdr>
+        <w:shd w:val="clear" w:color="191a1c" w:fill="191a1c"/>
+        <w:spacing w:after="0"/>
+        <w:ind w:right="0" w:firstLine="708" w:left="0"/>
+        <w:rPr>
+          <w:rFonts w:ascii="Arial" w:hAnsi="Arial" w:eastAsia="Arial" w:cs="Arial"/>
+          <w:b/>
+          <w:bCs/>
+          <w:color w:val="bcbec4"/>
+          <w:sz w:val="20"/>
+          <w:szCs w:val="20"/>
+          <w:highlight w:val="none"/>
+        </w:rPr>
+      </w:pPr>
+      <w:r>
+        <w:rPr>
+          <w:rFonts w:ascii="Arial" w:hAnsi="Arial" w:eastAsia="Arial" w:cs="Arial"/>
+          <w:b/>
+          <w:color w:val="bcbec4"/>
+          <w:sz w:val="20"/>
+        </w:rPr>
+      </w:r>
+      <w:r>
+        <w:rPr>
+          <w:rFonts w:ascii="Arial" w:hAnsi="Arial" w:eastAsia="Arial" w:cs="Arial"/>
+          <w:color w:val="bcbec4"/>
+          <w:sz w:val="20"/>
+        </w:rPr>
+        <w:t xml:space="preserve">MobileAds.initialize(</w:t>
+      </w:r>
+      <w:r>
+        <w:rPr>
+          <w:rFonts w:ascii="Arial" w:hAnsi="Arial" w:eastAsia="Arial" w:cs="Arial"/>
+          <w:color w:val="cf8e6d"/>
+          <w:sz w:val="20"/>
+        </w:rPr>
+        <w:t xml:space="preserve">this</w:t>
+      </w:r>
+      <w:r>
+        <w:rPr>
+          <w:rFonts w:ascii="Arial" w:hAnsi="Arial" w:eastAsia="Arial" w:cs="Arial"/>
+          <w:color w:val="32b8af"/>
+          <w:sz w:val="20"/>
+        </w:rPr>
+        <w:t xml:space="preserve">@MainActivity</w:t>
+      </w:r>
+      <w:r>
+        <w:rPr>
+          <w:rFonts w:ascii="Arial" w:hAnsi="Arial" w:eastAsia="Arial" w:cs="Arial"/>
+          <w:color w:val="bcbec4"/>
+          <w:sz w:val="20"/>
+        </w:rPr>
+        <w:t xml:space="preserve">)</w:t>
+        <w:br/>
+        <w:t xml:space="preserve">        </w:t>
+      </w:r>
+      <w:r>
+        <w:rPr>
+          <w:rFonts w:ascii="Arial" w:hAnsi="Arial" w:eastAsia="Arial" w:cs="Arial"/>
+          <w:b/>
+          <w:color w:val="bcbec4"/>
+          <w:sz w:val="20"/>
+        </w:rPr>
+        <w:t xml:space="preserve">}</w:t>
+      </w:r>
+      <w:r>
+        <w:rPr>
+          <w:rFonts w:ascii="Arial" w:hAnsi="Arial" w:eastAsia="Arial" w:cs="Arial"/>
+          <w:b/>
+          <w:bCs/>
+          <w:color w:val="bcbec4"/>
+          <w:sz w:val="20"/>
+          <w:szCs w:val="20"/>
+          <w:highlight w:val="none"/>
+        </w:rPr>
+      </w:r>
+      <w:r>
+        <w:rPr>
+          <w:rFonts w:ascii="Arial" w:hAnsi="Arial" w:eastAsia="Arial" w:cs="Arial"/>
+          <w:b/>
+          <w:bCs/>
+          <w:color w:val="bcbec4"/>
+          <w:sz w:val="20"/>
+          <w:szCs w:val="20"/>
+          <w:highlight w:val="none"/>
+        </w:rPr>
+      </w:r>
+    </w:p>
+    <w:p>
+      <w:pPr>
+        <w:pBdr>
+          <w:top w:val="none" w:color="000000" w:sz="4" w:space="0"/>
+          <w:left w:val="none" w:color="000000" w:sz="4" w:space="0"/>
+          <w:bottom w:val="none" w:color="000000" w:sz="4" w:space="0"/>
+          <w:right w:val="none" w:color="000000" w:sz="4" w:space="0"/>
+        </w:pBdr>
+        <w:shd w:val="clear" w:color="191a1c" w:fill="191a1c"/>
+        <w:spacing w:after="0"/>
+        <w:ind w:right="0" w:firstLine="708" w:left="0"/>
+        <w:rPr>
+          <w:rFonts w:ascii="Arial" w:hAnsi="Arial" w:eastAsia="Arial" w:cs="Arial"/>
+          <w:b/>
+          <w:bCs/>
+          <w:color w:val="bcbec4"/>
+          <w:sz w:val="20"/>
+          <w:szCs w:val="20"/>
+          <w:highlight w:val="none"/>
+        </w:rPr>
+      </w:pPr>
+      <w:r>
+        <w:rPr>
+          <w:rFonts w:ascii="Arial" w:hAnsi="Arial" w:eastAsia="Arial" w:cs="Arial"/>
+          <w:b/>
+          <w:color w:val="bcbec4"/>
+          <w:sz w:val="20"/>
+          <w:highlight w:val="none"/>
+        </w:rPr>
+        <w:t xml:space="preserve">......</w:t>
+      </w:r>
+      <w:r>
+        <w:rPr>
+          <w:rFonts w:ascii="Arial" w:hAnsi="Arial" w:eastAsia="Arial" w:cs="Arial"/>
+          <w:b/>
+          <w:bCs/>
+          <w:color w:val="bcbec4"/>
+          <w:sz w:val="20"/>
+          <w:szCs w:val="20"/>
+          <w:highlight w:val="none"/>
+        </w:rPr>
+      </w:r>
+      <w:r>
+        <w:rPr>
+          <w:rFonts w:ascii="Arial" w:hAnsi="Arial" w:eastAsia="Arial" w:cs="Arial"/>
+          <w:b/>
+          <w:bCs/>
+          <w:color w:val="bcbec4"/>
+          <w:sz w:val="20"/>
+          <w:szCs w:val="20"/>
+          <w:highlight w:val="none"/>
+        </w:rPr>
+      </w:r>
+    </w:p>
+    <w:p>
+      <w:pPr>
+        <w:pBdr>
+          <w:top w:val="none" w:color="000000" w:sz="4" w:space="0"/>
+          <w:left w:val="none" w:color="000000" w:sz="4" w:space="0"/>
+          <w:bottom w:val="none" w:color="000000" w:sz="4" w:space="0"/>
+          <w:right w:val="none" w:color="000000" w:sz="4" w:space="0"/>
+        </w:pBdr>
+        <w:shd w:val="clear" w:color="191a1c" w:fill="191a1c"/>
+        <w:spacing w:after="0"/>
+        <w:ind w:right="0" w:firstLine="0" w:left="0"/>
+        <w:rPr>
+          <w:rFonts w:ascii="Arial" w:hAnsi="Arial" w:eastAsia="Arial" w:cs="Arial"/>
+          <w:b/>
+          <w:bCs/>
+          <w:color w:val="bcbec4"/>
+          <w:sz w:val="20"/>
+          <w:szCs w:val="20"/>
+          <w:highlight w:val="none"/>
+        </w:rPr>
+      </w:pPr>
+      <w:r>
+        <w:rPr>
+          <w:rFonts w:ascii="Arial" w:hAnsi="Arial" w:eastAsia="Arial" w:cs="Arial"/>
+          <w:b/>
+          <w:color w:val="bcbec4"/>
+          <w:sz w:val="20"/>
+          <w:highlight w:val="none"/>
+        </w:rPr>
+        <w:t xml:space="preserve">    }</w:t>
+      </w:r>
+      <w:r>
+        <w:rPr>
+          <w:rFonts w:ascii="Arial" w:hAnsi="Arial" w:eastAsia="Arial" w:cs="Arial"/>
+          <w:b/>
+          <w:bCs/>
+          <w:color w:val="bcbec4"/>
+          <w:sz w:val="20"/>
+          <w:szCs w:val="20"/>
+          <w:highlight w:val="none"/>
+        </w:rPr>
+      </w:r>
+      <w:r>
+        <w:rPr>
+          <w:rFonts w:ascii="Arial" w:hAnsi="Arial" w:eastAsia="Arial" w:cs="Arial"/>
+          <w:b/>
+          <w:bCs/>
+          <w:color w:val="bcbec4"/>
+          <w:sz w:val="20"/>
+          <w:szCs w:val="20"/>
+          <w:highlight w:val="none"/>
+        </w:rPr>
+      </w:r>
+    </w:p>
+    <w:p>
+      <w:pPr>
+        <w:pBdr>
+          <w:top w:val="none" w:color="000000" w:sz="4" w:space="0"/>
+          <w:left w:val="none" w:color="000000" w:sz="4" w:space="0"/>
+          <w:bottom w:val="none" w:color="000000" w:sz="4" w:space="0"/>
+          <w:right w:val="none" w:color="000000" w:sz="4" w:space="0"/>
+        </w:pBdr>
+        <w:shd w:val="clear" w:color="191a1c" w:fill="191a1c"/>
+        <w:spacing/>
+        <w:ind w:right="0" w:firstLine="0" w:left="0"/>
+        <w:rPr>
+          <w:sz w:val="24"/>
+          <w:szCs w:val="24"/>
+        </w:rPr>
+      </w:pPr>
+      <w:r>
+        <w:rPr>
+          <w:rFonts w:ascii="Arial" w:hAnsi="Arial" w:eastAsia="Arial" w:cs="Arial"/>
+          <w:b/>
+          <w:color w:val="bcbec4"/>
+          <w:sz w:val="20"/>
+          <w:highlight w:val="none"/>
+        </w:rPr>
+        <w:t xml:space="preserve">}</w:t>
+      </w:r>
+      <w:r>
+        <w:rPr>
+          <w:sz w:val="24"/>
+          <w:szCs w:val="24"/>
+        </w:rPr>
+      </w:r>
+      <w:r>
+        <w:rPr>
+          <w:sz w:val="24"/>
+          <w:szCs w:val="24"/>
+        </w:rPr>
+      </w:r>
+    </w:p>
+    <w:p>
+      <w:pPr>
+        <w:pStyle w:val="828"/>
+        <w:pBdr/>
+        <w:spacing w:after="0"/>
+        <w:ind/>
+        <w:rPr>
+          <w:highlight w:val="none"/>
+        </w:rPr>
+      </w:pPr>
+      <w:r>
+        <w:rPr>
+          <w:rStyle w:val="838"/>
+        </w:rPr>
+      </w:r>
+      <w:r>
+        <w:t xml:space="preserve">Invocaci</w:t>
+      </w:r>
+      <w:r>
+        <w:t xml:space="preserve">ón y uso de la Interfaz gr</w:t>
+      </w:r>
+      <w:r>
+        <w:t xml:space="preserve">áfica del AdMob</w:t>
+      </w:r>
+      <w:r>
+        <w:rPr>
+          <w:highlight w:val="none"/>
+        </w:rPr>
+      </w:r>
+      <w:r>
+        <w:rPr>
+          <w:highlight w:val="none"/>
+        </w:rPr>
+      </w:r>
+    </w:p>
+    <w:p>
+      <w:pPr>
+        <w:pBdr>
+          <w:top w:val="none" w:color="000000" w:sz="4" w:space="0"/>
+          <w:left w:val="none" w:color="000000" w:sz="4" w:space="0"/>
+          <w:bottom w:val="none" w:color="000000" w:sz="4" w:space="0"/>
+          <w:right w:val="none" w:color="000000" w:sz="4" w:space="0"/>
+        </w:pBdr>
+        <w:shd w:val="clear" w:color="191a1c" w:fill="191a1c"/>
+        <w:spacing/>
+        <w:ind w:right="0" w:firstLine="0" w:left="0"/>
+        <w:rPr>
+          <w:rFonts w:ascii="Arial" w:hAnsi="Arial" w:eastAsia="Arial" w:cs="Arial"/>
+          <w:color w:val="b3ae60"/>
+          <w:sz w:val="20"/>
+          <w:szCs w:val="20"/>
+        </w:rPr>
+      </w:pPr>
+      <w:r>
+        <w:rPr>
+          <w:rFonts w:ascii="Arial" w:hAnsi="Arial" w:eastAsia="Arial" w:cs="Arial"/>
+          <w:color w:val="b3ae60"/>
+          <w:sz w:val="20"/>
+        </w:rPr>
+        <w:t xml:space="preserve">@Composable</w:t>
+      </w:r>
+      <w:r>
+        <w:rPr>
+          <w:sz w:val="24"/>
+        </w:rPr>
+      </w:r>
+    </w:p>
+    <w:p>
+      <w:pPr>
+        <w:pBdr>
+          <w:top w:val="none" w:color="000000" w:sz="4" w:space="0"/>
+          <w:left w:val="none" w:color="000000" w:sz="4" w:space="0"/>
+          <w:bottom w:val="none" w:color="000000" w:sz="4" w:space="0"/>
+          <w:right w:val="none" w:color="000000" w:sz="4" w:space="0"/>
+        </w:pBdr>
+        <w:shd w:val="clear" w:color="191a1c" w:fill="191a1c"/>
+        <w:spacing/>
+        <w:ind w:right="0" w:firstLine="0" w:left="0"/>
+        <w:rPr>
+          <w:sz w:val="24"/>
+          <w:szCs w:val="24"/>
+        </w:rPr>
+      </w:pPr>
+      <w:r>
+        <w:rPr>
+          <w:rFonts w:ascii="Arial" w:hAnsi="Arial" w:eastAsia="Arial" w:cs="Arial"/>
+          <w:color w:val="b3ae60"/>
+          <w:sz w:val="20"/>
+        </w:rPr>
+      </w:r>
+      <w:r>
+        <w:rPr>
+          <w:rFonts w:ascii="Arial" w:hAnsi="Arial" w:eastAsia="Arial" w:cs="Arial"/>
+          <w:color w:val="cf8e6d"/>
+          <w:sz w:val="20"/>
+        </w:rPr>
+        <w:t xml:space="preserve">fun </w:t>
+      </w:r>
+      <w:r>
+        <w:rPr>
+          <w:rFonts w:ascii="Arial" w:hAnsi="Arial" w:eastAsia="Arial" w:cs="Arial"/>
+          <w:color w:val="56a8f5"/>
+          <w:sz w:val="20"/>
+        </w:rPr>
+        <w:t xml:space="preserve">Fondo</w:t>
+      </w:r>
+      <w:r>
+        <w:rPr>
+          <w:rFonts w:ascii="Arial" w:hAnsi="Arial" w:eastAsia="Arial" w:cs="Arial"/>
+          <w:color w:val="bcbec4"/>
+          <w:sz w:val="20"/>
+        </w:rPr>
+        <w:t xml:space="preserve">(modifier: Modifier = Modifier) {</w:t>
+        <w:br/>
+        <w:t xml:space="preserve">    </w:t>
+      </w:r>
+      <w:r>
+        <w:rPr>
+          <w:rFonts w:ascii="Arial" w:hAnsi="Arial" w:eastAsia="Arial" w:cs="Arial"/>
+          <w:color w:val="7a7e85"/>
+          <w:sz w:val="20"/>
+        </w:rPr>
+        <w:t xml:space="preserve">// 3. El navController se recuerda dentro de la composición, no en la Activity    </w:t>
+      </w:r>
+      <w:r>
+        <w:rPr>
+          <w:rFonts w:ascii="Arial" w:hAnsi="Arial" w:eastAsia="Arial" w:cs="Arial"/>
+          <w:color w:val="cf8e6d"/>
+          <w:sz w:val="20"/>
+        </w:rPr>
+        <w:t xml:space="preserve">val </w:t>
+      </w:r>
+      <w:r>
+        <w:rPr>
+          <w:rFonts w:ascii="Arial" w:hAnsi="Arial" w:eastAsia="Arial" w:cs="Arial"/>
+          <w:color w:val="bcbec4"/>
+          <w:sz w:val="20"/>
+        </w:rPr>
+        <w:t xml:space="preserve">navController = </w:t>
+      </w:r>
+      <w:r>
+        <w:rPr>
+          <w:rFonts w:ascii="Arial" w:hAnsi="Arial" w:eastAsia="Arial" w:cs="Arial"/>
+          <w:color w:val="6bb38a"/>
+          <w:sz w:val="20"/>
+        </w:rPr>
+        <w:t xml:space="preserve">rememberNavController</w:t>
+      </w:r>
+      <w:r>
+        <w:rPr>
+          <w:rFonts w:ascii="Arial" w:hAnsi="Arial" w:eastAsia="Arial" w:cs="Arial"/>
+          <w:color w:val="bcbec4"/>
+          <w:sz w:val="20"/>
+        </w:rPr>
+        <w:t xml:space="preserve">()</w:t>
+        <w:br/>
+        <w:t xml:space="preserve">    </w:t>
+      </w:r>
+      <w:r>
+        <w:rPr>
+          <w:rFonts w:ascii="Arial" w:hAnsi="Arial" w:eastAsia="Arial" w:cs="Arial"/>
+          <w:color w:val="cf8e6d"/>
+          <w:sz w:val="20"/>
+        </w:rPr>
+        <w:t xml:space="preserve">val </w:t>
+      </w:r>
+      <w:r>
+        <w:rPr>
+          <w:rFonts w:ascii="Arial" w:hAnsi="Arial" w:eastAsia="Arial" w:cs="Arial"/>
+          <w:color w:val="bcbec4"/>
+          <w:sz w:val="20"/>
+        </w:rPr>
+        <w:t xml:space="preserve">configuration = </w:t>
+      </w:r>
+      <w:r>
+        <w:rPr>
+          <w:rFonts w:ascii="Arial" w:hAnsi="Arial" w:eastAsia="Arial" w:cs="Arial"/>
+          <w:i/>
+          <w:color w:val="c77dbb"/>
+          <w:sz w:val="20"/>
+        </w:rPr>
+        <w:t xml:space="preserve">LocalConfiguration</w:t>
+      </w:r>
+      <w:r>
+        <w:rPr>
+          <w:rFonts w:ascii="Arial" w:hAnsi="Arial" w:eastAsia="Arial" w:cs="Arial"/>
+          <w:color w:val="bcbec4"/>
+          <w:sz w:val="20"/>
+        </w:rPr>
+        <w:t xml:space="preserve">.</w:t>
+      </w:r>
+      <w:r>
+        <w:rPr>
+          <w:rFonts w:ascii="Arial" w:hAnsi="Arial" w:eastAsia="Arial" w:cs="Arial"/>
+          <w:color w:val="6bb38a"/>
+          <w:sz w:val="20"/>
+        </w:rPr>
+        <w:t xml:space="preserve">current    </w:t>
+      </w:r>
+      <w:r>
+        <w:rPr>
+          <w:rFonts w:ascii="Arial" w:hAnsi="Arial" w:eastAsia="Arial" w:cs="Arial"/>
+          <w:color w:val="cf8e6d"/>
+          <w:sz w:val="20"/>
+        </w:rPr>
+        <w:t xml:space="preserve">val </w:t>
+      </w:r>
+      <w:r>
+        <w:rPr>
+          <w:rFonts w:ascii="Arial" w:hAnsi="Arial" w:eastAsia="Arial" w:cs="Arial"/>
+          <w:color w:val="bcbec4"/>
+          <w:sz w:val="20"/>
+        </w:rPr>
+        <w:t xml:space="preserve">isLandscape = configuration.</w:t>
+      </w:r>
+      <w:r>
+        <w:rPr>
+          <w:rFonts w:ascii="Arial" w:hAnsi="Arial" w:eastAsia="Arial" w:cs="Arial"/>
+          <w:color w:val="c77dbb"/>
+          <w:sz w:val="20"/>
+        </w:rPr>
+        <w:t xml:space="preserve">orientation </w:t>
+      </w:r>
+      <w:r>
+        <w:rPr>
+          <w:rFonts w:ascii="Arial" w:hAnsi="Arial" w:eastAsia="Arial" w:cs="Arial"/>
+          <w:color w:val="bcbec4"/>
+          <w:sz w:val="20"/>
+        </w:rPr>
+        <w:t xml:space="preserve">== Configuration.</w:t>
+      </w:r>
+      <w:r>
+        <w:rPr>
+          <w:rFonts w:ascii="Arial" w:hAnsi="Arial" w:eastAsia="Arial" w:cs="Arial"/>
+          <w:i/>
+          <w:color w:val="c77dbb"/>
+          <w:sz w:val="20"/>
+        </w:rPr>
+        <w:t xml:space="preserve">ORIENTATION_LANDSCAPE    </w:t>
+      </w:r>
+      <w:r>
+        <w:rPr>
+          <w:rFonts w:ascii="Arial" w:hAnsi="Arial" w:eastAsia="Arial" w:cs="Arial"/>
+          <w:color w:val="0da19e"/>
+          <w:sz w:val="20"/>
+        </w:rPr>
+        <w:t xml:space="preserve">Column</w:t>
+      </w:r>
+      <w:r>
+        <w:rPr>
+          <w:rFonts w:ascii="Arial" w:hAnsi="Arial" w:eastAsia="Arial" w:cs="Arial"/>
+          <w:color w:val="bcbec4"/>
+          <w:sz w:val="20"/>
+        </w:rPr>
+        <w:t xml:space="preserve">(</w:t>
+      </w:r>
+      <w:r>
+        <w:rPr>
+          <w:rFonts w:ascii="Arial" w:hAnsi="Arial" w:eastAsia="Arial" w:cs="Arial"/>
+          <w:color w:val="56c1d6"/>
+          <w:sz w:val="20"/>
+        </w:rPr>
+        <w:t xml:space="preserve">modifier = </w:t>
+      </w:r>
+      <w:r>
+        <w:rPr>
+          <w:rFonts w:ascii="Arial" w:hAnsi="Arial" w:eastAsia="Arial" w:cs="Arial"/>
+          <w:color w:val="bcbec4"/>
+          <w:sz w:val="20"/>
+        </w:rPr>
+        <w:t xml:space="preserve">modifier) </w:t>
+      </w:r>
+      <w:r>
+        <w:rPr>
+          <w:rFonts w:ascii="Arial" w:hAnsi="Arial" w:eastAsia="Arial" w:cs="Arial"/>
+          <w:b/>
+          <w:color w:val="bcbec4"/>
+          <w:sz w:val="20"/>
+        </w:rPr>
+        <w:t xml:space="preserve">{        </w:t>
+      </w:r>
+      <w:r>
+        <w:rPr>
+          <w:rFonts w:ascii="Arial" w:hAnsi="Arial" w:eastAsia="Arial" w:cs="Arial"/>
+          <w:color w:val="cf8e6d"/>
+          <w:sz w:val="20"/>
+        </w:rPr>
+        <w:t xml:space="preserve">if</w:t>
+      </w:r>
+      <w:r>
+        <w:rPr>
+          <w:rFonts w:ascii="Arial" w:hAnsi="Arial" w:eastAsia="Arial" w:cs="Arial"/>
+          <w:color w:val="bcbec4"/>
+          <w:sz w:val="20"/>
+        </w:rPr>
+        <w:t xml:space="preserve">(isLandscape){</w:t>
+        <w:br/>
+        <w:t xml:space="preserve">            </w:t>
+      </w:r>
+      <w:r>
+        <w:rPr>
+          <w:rFonts w:ascii="Arial" w:hAnsi="Arial" w:eastAsia="Arial" w:cs="Arial"/>
+          <w:color w:val="0da19e"/>
+          <w:sz w:val="20"/>
+        </w:rPr>
+        <w:t xml:space="preserve">Row</w:t>
+      </w:r>
+      <w:r>
+        <w:rPr>
+          <w:rFonts w:ascii="Arial" w:hAnsi="Arial" w:eastAsia="Arial" w:cs="Arial"/>
+          <w:color w:val="6f737a"/>
+          <w:sz w:val="20"/>
+        </w:rPr>
+        <w:t xml:space="preserve">() </w:t>
+      </w:r>
+      <w:r>
+        <w:rPr>
+          <w:rFonts w:ascii="Arial" w:hAnsi="Arial" w:eastAsia="Arial" w:cs="Arial"/>
+          <w:b/>
+          <w:color w:val="bcbec4"/>
+          <w:sz w:val="20"/>
+        </w:rPr>
+        <w:t xml:space="preserve">{                </w:t>
+      </w:r>
+      <w:r>
+        <w:rPr>
+          <w:rFonts w:ascii="Arial" w:hAnsi="Arial" w:eastAsia="Arial" w:cs="Arial"/>
+          <w:color w:val="0da19e"/>
+          <w:sz w:val="20"/>
+        </w:rPr>
+        <w:t xml:space="preserve">Column</w:t>
+      </w:r>
+      <w:r>
+        <w:rPr>
+          <w:rFonts w:ascii="Arial" w:hAnsi="Arial" w:eastAsia="Arial" w:cs="Arial"/>
+          <w:color w:val="bcbec4"/>
+          <w:sz w:val="20"/>
+        </w:rPr>
+        <w:t xml:space="preserve">(</w:t>
+      </w:r>
+      <w:r>
+        <w:rPr>
+          <w:rFonts w:ascii="Arial" w:hAnsi="Arial" w:eastAsia="Arial" w:cs="Arial"/>
+          <w:color w:val="56c1d6"/>
+          <w:sz w:val="20"/>
+        </w:rPr>
+        <w:t xml:space="preserve">modifier = </w:t>
+      </w:r>
+      <w:r>
+        <w:rPr>
+          <w:rFonts w:ascii="Arial" w:hAnsi="Arial" w:eastAsia="Arial" w:cs="Arial"/>
+          <w:color w:val="bcbec4"/>
+          <w:sz w:val="20"/>
+        </w:rPr>
+        <w:t xml:space="preserve">Modifier.</w:t>
+      </w:r>
+      <w:r>
+        <w:rPr>
+          <w:rFonts w:ascii="Arial" w:hAnsi="Arial" w:eastAsia="Arial" w:cs="Arial"/>
+          <w:color w:val="0da19e"/>
+          <w:sz w:val="20"/>
+        </w:rPr>
+        <w:t xml:space="preserve">weight</w:t>
+      </w:r>
+      <w:r>
+        <w:rPr>
+          <w:rFonts w:ascii="Arial" w:hAnsi="Arial" w:eastAsia="Arial" w:cs="Arial"/>
+          <w:color w:val="bcbec4"/>
+          <w:sz w:val="20"/>
+        </w:rPr>
+        <w:t xml:space="preserve">(</w:t>
+      </w:r>
+      <w:r>
+        <w:rPr>
+          <w:rFonts w:ascii="Arial" w:hAnsi="Arial" w:eastAsia="Arial" w:cs="Arial"/>
+          <w:color w:val="2aacb8"/>
+          <w:sz w:val="20"/>
+        </w:rPr>
+        <w:t xml:space="preserve">1f</w:t>
+      </w:r>
+      <w:r>
+        <w:rPr>
+          <w:rFonts w:ascii="Arial" w:hAnsi="Arial" w:eastAsia="Arial" w:cs="Arial"/>
+          <w:color w:val="bcbec4"/>
+          <w:sz w:val="20"/>
+        </w:rPr>
+        <w:t xml:space="preserve">).</w:t>
+      </w:r>
+      <w:r>
+        <w:rPr>
+          <w:rFonts w:ascii="Arial" w:hAnsi="Arial" w:eastAsia="Arial" w:cs="Arial"/>
+          <w:i/>
+          <w:color w:val="57aaf7"/>
+          <w:sz w:val="20"/>
+        </w:rPr>
+        <w:t xml:space="preserve">fillMaxHeight</w:t>
+      </w:r>
+      <w:r>
+        <w:rPr>
+          <w:rFonts w:ascii="Arial" w:hAnsi="Arial" w:eastAsia="Arial" w:cs="Arial"/>
+          <w:color w:val="bcbec4"/>
+          <w:sz w:val="20"/>
+        </w:rPr>
+        <w:t xml:space="preserve">()) </w:t>
+      </w:r>
+      <w:r>
+        <w:rPr>
+          <w:rFonts w:ascii="Arial" w:hAnsi="Arial" w:eastAsia="Arial" w:cs="Arial"/>
+          <w:b/>
+          <w:color w:val="bcbec4"/>
+          <w:sz w:val="20"/>
+        </w:rPr>
+        <w:t xml:space="preserve">{                    </w:t>
+      </w:r>
+      <w:r>
+        <w:rPr>
+          <w:rFonts w:ascii="Arial" w:hAnsi="Arial" w:eastAsia="Arial" w:cs="Arial"/>
+          <w:color w:val="6bb38a"/>
+          <w:sz w:val="20"/>
+        </w:rPr>
+        <w:t xml:space="preserve">AdMobBanner</w:t>
+      </w:r>
+      <w:r>
+        <w:rPr>
+          <w:rFonts w:ascii="Arial" w:hAnsi="Arial" w:eastAsia="Arial" w:cs="Arial"/>
+          <w:color w:val="bcbec4"/>
+          <w:sz w:val="20"/>
+        </w:rPr>
+        <w:t xml:space="preserve">()</w:t>
+        <w:br/>
+        <w:t xml:space="preserve">                </w:t>
+      </w:r>
+      <w:r>
+        <w:rPr>
+          <w:rFonts w:ascii="Arial" w:hAnsi="Arial" w:eastAsia="Arial" w:cs="Arial"/>
+          <w:b/>
+          <w:color w:val="bcbec4"/>
+          <w:sz w:val="20"/>
+        </w:rPr>
+        <w:t xml:space="preserve">}                </w:t>
+      </w:r>
+      <w:r>
+        <w:rPr>
+          <w:rFonts w:ascii="Arial" w:hAnsi="Arial" w:eastAsia="Arial" w:cs="Arial"/>
+          <w:color w:val="0da19e"/>
+          <w:sz w:val="20"/>
+        </w:rPr>
+        <w:t xml:space="preserve">Column</w:t>
+      </w:r>
+      <w:r>
+        <w:rPr>
+          <w:rFonts w:ascii="Arial" w:hAnsi="Arial" w:eastAsia="Arial" w:cs="Arial"/>
+          <w:color w:val="bcbec4"/>
+          <w:sz w:val="20"/>
+        </w:rPr>
+        <w:t xml:space="preserve">(</w:t>
+      </w:r>
+      <w:r>
+        <w:rPr>
+          <w:rFonts w:ascii="Arial" w:hAnsi="Arial" w:eastAsia="Arial" w:cs="Arial"/>
+          <w:color w:val="56c1d6"/>
+          <w:sz w:val="20"/>
+        </w:rPr>
+        <w:t xml:space="preserve">modifier = </w:t>
+      </w:r>
+      <w:r>
+        <w:rPr>
+          <w:rFonts w:ascii="Arial" w:hAnsi="Arial" w:eastAsia="Arial" w:cs="Arial"/>
+          <w:color w:val="bcbec4"/>
+          <w:sz w:val="20"/>
+        </w:rPr>
+        <w:t xml:space="preserve">Modifier.</w:t>
+      </w:r>
+      <w:r>
+        <w:rPr>
+          <w:rFonts w:ascii="Arial" w:hAnsi="Arial" w:eastAsia="Arial" w:cs="Arial"/>
+          <w:color w:val="0da19e"/>
+          <w:sz w:val="20"/>
+        </w:rPr>
+        <w:t xml:space="preserve">weight</w:t>
+      </w:r>
+      <w:r>
+        <w:rPr>
+          <w:rFonts w:ascii="Arial" w:hAnsi="Arial" w:eastAsia="Arial" w:cs="Arial"/>
+          <w:color w:val="bcbec4"/>
+          <w:sz w:val="20"/>
+        </w:rPr>
+        <w:t xml:space="preserve">(</w:t>
+      </w:r>
+      <w:r>
+        <w:rPr>
+          <w:rFonts w:ascii="Arial" w:hAnsi="Arial" w:eastAsia="Arial" w:cs="Arial"/>
+          <w:color w:val="2aacb8"/>
+          <w:sz w:val="20"/>
+        </w:rPr>
+        <w:t xml:space="preserve">8f</w:t>
+      </w:r>
+      <w:r>
+        <w:rPr>
+          <w:rFonts w:ascii="Arial" w:hAnsi="Arial" w:eastAsia="Arial" w:cs="Arial"/>
+          <w:color w:val="bcbec4"/>
+          <w:sz w:val="20"/>
+        </w:rPr>
+        <w:t xml:space="preserve">).</w:t>
+      </w:r>
+      <w:r>
+        <w:rPr>
+          <w:rFonts w:ascii="Arial" w:hAnsi="Arial" w:eastAsia="Arial" w:cs="Arial"/>
+          <w:i/>
+          <w:color w:val="57aaf7"/>
+          <w:sz w:val="20"/>
+        </w:rPr>
+        <w:t xml:space="preserve">fillMaxHeight</w:t>
+      </w:r>
+      <w:r>
+        <w:rPr>
+          <w:rFonts w:ascii="Arial" w:hAnsi="Arial" w:eastAsia="Arial" w:cs="Arial"/>
+          <w:color w:val="bcbec4"/>
+          <w:sz w:val="20"/>
+        </w:rPr>
+        <w:t xml:space="preserve">()) </w:t>
+      </w:r>
+      <w:r>
+        <w:rPr>
+          <w:rFonts w:ascii="Arial" w:hAnsi="Arial" w:eastAsia="Arial" w:cs="Arial"/>
+          <w:b/>
+          <w:color w:val="bcbec4"/>
+          <w:sz w:val="20"/>
+        </w:rPr>
+        <w:t xml:space="preserve">{                    </w:t>
+      </w:r>
+      <w:r>
+        <w:rPr>
+          <w:rFonts w:ascii="Arial" w:hAnsi="Arial" w:eastAsia="Arial" w:cs="Arial"/>
+          <w:color w:val="6bb38a"/>
+          <w:sz w:val="20"/>
+        </w:rPr>
+        <w:t xml:space="preserve">Encabezado</w:t>
+      </w:r>
+      <w:r>
+        <w:rPr>
+          <w:rFonts w:ascii="Arial" w:hAnsi="Arial" w:eastAsia="Arial" w:cs="Arial"/>
+          <w:color w:val="bcbec4"/>
+          <w:sz w:val="20"/>
+        </w:rPr>
+        <w:t xml:space="preserve">(navController)</w:t>
+        <w:br/>
+        <w:t xml:space="preserve">                    </w:t>
+      </w:r>
+      <w:r>
+        <w:rPr>
+          <w:rFonts w:ascii="Arial" w:hAnsi="Arial" w:eastAsia="Arial" w:cs="Arial"/>
+          <w:color w:val="6bb38a"/>
+          <w:sz w:val="20"/>
+        </w:rPr>
+        <w:t xml:space="preserve">Navegacion</w:t>
+      </w:r>
+      <w:r>
+        <w:rPr>
+          <w:rFonts w:ascii="Arial" w:hAnsi="Arial" w:eastAsia="Arial" w:cs="Arial"/>
+          <w:color w:val="bcbec4"/>
+          <w:sz w:val="20"/>
+        </w:rPr>
+        <w:t xml:space="preserve">(</w:t>
+      </w:r>
+      <w:r>
+        <w:rPr>
+          <w:rFonts w:ascii="Arial" w:hAnsi="Arial" w:eastAsia="Arial" w:cs="Arial"/>
+          <w:color w:val="56c1d6"/>
+          <w:sz w:val="20"/>
+        </w:rPr>
+        <w:t xml:space="preserve">navController = </w:t>
+      </w:r>
+      <w:r>
+        <w:rPr>
+          <w:rFonts w:ascii="Arial" w:hAnsi="Arial" w:eastAsia="Arial" w:cs="Arial"/>
+          <w:color w:val="bcbec4"/>
+          <w:sz w:val="20"/>
+        </w:rPr>
+        <w:t xml:space="preserve">navController)</w:t>
+        <w:br/>
+        <w:t xml:space="preserve">                </w:t>
+      </w:r>
+      <w:r>
+        <w:rPr>
+          <w:rFonts w:ascii="Arial" w:hAnsi="Arial" w:eastAsia="Arial" w:cs="Arial"/>
+          <w:b/>
+          <w:color w:val="bcbec4"/>
+          <w:sz w:val="20"/>
+        </w:rPr>
+        <w:t xml:space="preserve">}                </w:t>
+      </w:r>
+      <w:r>
+        <w:rPr>
+          <w:rFonts w:ascii="Arial" w:hAnsi="Arial" w:eastAsia="Arial" w:cs="Arial"/>
+          <w:color w:val="0da19e"/>
+          <w:sz w:val="20"/>
+        </w:rPr>
+        <w:t xml:space="preserve">Column</w:t>
+      </w:r>
+      <w:r>
+        <w:rPr>
+          <w:rFonts w:ascii="Arial" w:hAnsi="Arial" w:eastAsia="Arial" w:cs="Arial"/>
+          <w:color w:val="bcbec4"/>
+          <w:sz w:val="20"/>
+        </w:rPr>
+        <w:t xml:space="preserve">(</w:t>
+      </w:r>
+      <w:r>
+        <w:rPr>
+          <w:rFonts w:ascii="Arial" w:hAnsi="Arial" w:eastAsia="Arial" w:cs="Arial"/>
+          <w:color w:val="56c1d6"/>
+          <w:sz w:val="20"/>
+        </w:rPr>
+        <w:t xml:space="preserve">modifier = </w:t>
+      </w:r>
+      <w:r>
+        <w:rPr>
+          <w:rFonts w:ascii="Arial" w:hAnsi="Arial" w:eastAsia="Arial" w:cs="Arial"/>
+          <w:color w:val="bcbec4"/>
+          <w:sz w:val="20"/>
+        </w:rPr>
+        <w:t xml:space="preserve">Modifier.</w:t>
+      </w:r>
+      <w:r>
+        <w:rPr>
+          <w:rFonts w:ascii="Arial" w:hAnsi="Arial" w:eastAsia="Arial" w:cs="Arial"/>
+          <w:color w:val="0da19e"/>
+          <w:sz w:val="20"/>
+        </w:rPr>
+        <w:t xml:space="preserve">weight</w:t>
+      </w:r>
+      <w:r>
+        <w:rPr>
+          <w:rFonts w:ascii="Arial" w:hAnsi="Arial" w:eastAsia="Arial" w:cs="Arial"/>
+          <w:color w:val="bcbec4"/>
+          <w:sz w:val="20"/>
+        </w:rPr>
+        <w:t xml:space="preserve">(</w:t>
+      </w:r>
+      <w:r>
+        <w:rPr>
+          <w:rFonts w:ascii="Arial" w:hAnsi="Arial" w:eastAsia="Arial" w:cs="Arial"/>
+          <w:color w:val="2aacb8"/>
+          <w:sz w:val="20"/>
+        </w:rPr>
+        <w:t xml:space="preserve">1f</w:t>
+      </w:r>
+      <w:r>
+        <w:rPr>
+          <w:rFonts w:ascii="Arial" w:hAnsi="Arial" w:eastAsia="Arial" w:cs="Arial"/>
+          <w:color w:val="bcbec4"/>
+          <w:sz w:val="20"/>
+        </w:rPr>
+        <w:t xml:space="preserve">).</w:t>
+      </w:r>
+      <w:r>
+        <w:rPr>
+          <w:rFonts w:ascii="Arial" w:hAnsi="Arial" w:eastAsia="Arial" w:cs="Arial"/>
+          <w:i/>
+          <w:color w:val="57aaf7"/>
+          <w:sz w:val="20"/>
+        </w:rPr>
+        <w:t xml:space="preserve">fillMaxHeight</w:t>
+      </w:r>
+      <w:r>
+        <w:rPr>
+          <w:rFonts w:ascii="Arial" w:hAnsi="Arial" w:eastAsia="Arial" w:cs="Arial"/>
+          <w:color w:val="bcbec4"/>
+          <w:sz w:val="20"/>
+        </w:rPr>
+        <w:t xml:space="preserve">()) </w:t>
+      </w:r>
+      <w:r>
+        <w:rPr>
+          <w:rFonts w:ascii="Arial" w:hAnsi="Arial" w:eastAsia="Arial" w:cs="Arial"/>
+          <w:b/>
+          <w:color w:val="bcbec4"/>
+          <w:sz w:val="20"/>
+        </w:rPr>
+        <w:t xml:space="preserve">{                    </w:t>
+      </w:r>
+      <w:r>
+        <w:rPr>
+          <w:rFonts w:ascii="Arial" w:hAnsi="Arial" w:eastAsia="Arial" w:cs="Arial"/>
+          <w:color w:val="6bb38a"/>
+          <w:sz w:val="20"/>
+        </w:rPr>
+        <w:t xml:space="preserve">AdMobBanner</w:t>
+      </w:r>
+      <w:r>
+        <w:rPr>
+          <w:rFonts w:ascii="Arial" w:hAnsi="Arial" w:eastAsia="Arial" w:cs="Arial"/>
+          <w:color w:val="bcbec4"/>
+          <w:sz w:val="20"/>
+        </w:rPr>
+        <w:t xml:space="preserve">()</w:t>
+        <w:br/>
+        <w:t xml:space="preserve">                </w:t>
+      </w:r>
+      <w:r>
+        <w:rPr>
+          <w:rFonts w:ascii="Arial" w:hAnsi="Arial" w:eastAsia="Arial" w:cs="Arial"/>
+          <w:b/>
+          <w:color w:val="bcbec4"/>
+          <w:sz w:val="20"/>
+        </w:rPr>
+        <w:t xml:space="preserve">}            }        </w:t>
+      </w:r>
+      <w:r>
+        <w:rPr>
+          <w:rFonts w:ascii="Arial" w:hAnsi="Arial" w:eastAsia="Arial" w:cs="Arial"/>
+          <w:color w:val="bcbec4"/>
+          <w:sz w:val="20"/>
+        </w:rPr>
+        <w:t xml:space="preserve">} </w:t>
+      </w:r>
+      <w:r>
+        <w:rPr>
+          <w:rFonts w:ascii="Arial" w:hAnsi="Arial" w:eastAsia="Arial" w:cs="Arial"/>
+          <w:color w:val="cf8e6d"/>
+          <w:sz w:val="20"/>
+        </w:rPr>
+        <w:t xml:space="preserve">else </w:t>
+      </w:r>
+      <w:r>
+        <w:rPr>
+          <w:rFonts w:ascii="Arial" w:hAnsi="Arial" w:eastAsia="Arial" w:cs="Arial"/>
+          <w:color w:val="bcbec4"/>
+          <w:sz w:val="20"/>
+        </w:rPr>
+        <w:t xml:space="preserve">{</w:t>
+        <w:br/>
+        <w:t xml:space="preserve">            </w:t>
+      </w:r>
+      <w:r>
+        <w:rPr>
+          <w:rFonts w:ascii="Arial" w:hAnsi="Arial" w:eastAsia="Arial" w:cs="Arial"/>
+          <w:color w:val="0da19e"/>
+          <w:sz w:val="20"/>
+        </w:rPr>
+        <w:t xml:space="preserve">Column</w:t>
+      </w:r>
+      <w:r>
+        <w:rPr>
+          <w:rFonts w:ascii="Arial" w:hAnsi="Arial" w:eastAsia="Arial" w:cs="Arial"/>
+          <w:color w:val="bcbec4"/>
+          <w:sz w:val="20"/>
+        </w:rPr>
+        <w:t xml:space="preserve">(</w:t>
+      </w:r>
+      <w:r>
+        <w:rPr>
+          <w:rFonts w:ascii="Arial" w:hAnsi="Arial" w:eastAsia="Arial" w:cs="Arial"/>
+          <w:color w:val="56c1d6"/>
+          <w:sz w:val="20"/>
+        </w:rPr>
+        <w:t xml:space="preserve">modifier = </w:t>
+      </w:r>
+      <w:r>
+        <w:rPr>
+          <w:rFonts w:ascii="Arial" w:hAnsi="Arial" w:eastAsia="Arial" w:cs="Arial"/>
+          <w:color w:val="bcbec4"/>
+          <w:sz w:val="20"/>
+        </w:rPr>
+        <w:t xml:space="preserve">Modifier.</w:t>
+      </w:r>
+      <w:r>
+        <w:rPr>
+          <w:rFonts w:ascii="Arial" w:hAnsi="Arial" w:eastAsia="Arial" w:cs="Arial"/>
+          <w:color w:val="0da19e"/>
+          <w:sz w:val="20"/>
+        </w:rPr>
+        <w:t xml:space="preserve">weight</w:t>
+      </w:r>
+      <w:r>
+        <w:rPr>
+          <w:rFonts w:ascii="Arial" w:hAnsi="Arial" w:eastAsia="Arial" w:cs="Arial"/>
+          <w:color w:val="bcbec4"/>
+          <w:sz w:val="20"/>
+        </w:rPr>
+        <w:t xml:space="preserve">(</w:t>
+      </w:r>
+      <w:r>
+        <w:rPr>
+          <w:rFonts w:ascii="Arial" w:hAnsi="Arial" w:eastAsia="Arial" w:cs="Arial"/>
+          <w:color w:val="2aacb8"/>
+          <w:sz w:val="20"/>
+        </w:rPr>
+        <w:t xml:space="preserve">1f</w:t>
+      </w:r>
+      <w:r>
+        <w:rPr>
+          <w:rFonts w:ascii="Arial" w:hAnsi="Arial" w:eastAsia="Arial" w:cs="Arial"/>
+          <w:color w:val="bcbec4"/>
+          <w:sz w:val="20"/>
+        </w:rPr>
+        <w:t xml:space="preserve">).</w:t>
+      </w:r>
+      <w:r>
+        <w:rPr>
+          <w:rFonts w:ascii="Arial" w:hAnsi="Arial" w:eastAsia="Arial" w:cs="Arial"/>
+          <w:i/>
+          <w:color w:val="57aaf7"/>
+          <w:sz w:val="20"/>
+        </w:rPr>
+        <w:t xml:space="preserve">fillMaxWidth</w:t>
+      </w:r>
+      <w:r>
+        <w:rPr>
+          <w:rFonts w:ascii="Arial" w:hAnsi="Arial" w:eastAsia="Arial" w:cs="Arial"/>
+          <w:color w:val="bcbec4"/>
+          <w:sz w:val="20"/>
+        </w:rPr>
+        <w:t xml:space="preserve">()) </w:t>
+      </w:r>
+      <w:r>
+        <w:rPr>
+          <w:rFonts w:ascii="Arial" w:hAnsi="Arial" w:eastAsia="Arial" w:cs="Arial"/>
+          <w:b/>
+          <w:color w:val="bcbec4"/>
+          <w:sz w:val="20"/>
+        </w:rPr>
+        <w:t xml:space="preserve">{                    </w:t>
+      </w:r>
+      <w:r>
+        <w:rPr>
+          <w:rFonts w:ascii="Arial" w:hAnsi="Arial" w:eastAsia="Arial" w:cs="Arial"/>
+          <w:color w:val="6bb38a"/>
+          <w:sz w:val="20"/>
+        </w:rPr>
+        <w:t xml:space="preserve">Encabezado</w:t>
+      </w:r>
+      <w:r>
+        <w:rPr>
+          <w:rFonts w:ascii="Arial" w:hAnsi="Arial" w:eastAsia="Arial" w:cs="Arial"/>
+          <w:color w:val="bcbec4"/>
+          <w:sz w:val="20"/>
+        </w:rPr>
+        <w:t xml:space="preserve">(navController)</w:t>
+        <w:br/>
+        <w:t xml:space="preserve">                    </w:t>
+      </w:r>
+      <w:r>
+        <w:rPr>
+          <w:rFonts w:ascii="Arial" w:hAnsi="Arial" w:eastAsia="Arial" w:cs="Arial"/>
+          <w:color w:val="6bb38a"/>
+          <w:sz w:val="20"/>
+        </w:rPr>
+        <w:t xml:space="preserve">Navegacion</w:t>
+      </w:r>
+      <w:r>
+        <w:rPr>
+          <w:rFonts w:ascii="Arial" w:hAnsi="Arial" w:eastAsia="Arial" w:cs="Arial"/>
+          <w:color w:val="bcbec4"/>
+          <w:sz w:val="20"/>
+        </w:rPr>
+        <w:t xml:space="preserve">(</w:t>
+      </w:r>
+      <w:r>
+        <w:rPr>
+          <w:rFonts w:ascii="Arial" w:hAnsi="Arial" w:eastAsia="Arial" w:cs="Arial"/>
+          <w:color w:val="56c1d6"/>
+          <w:sz w:val="20"/>
+        </w:rPr>
+        <w:t xml:space="preserve">navController = </w:t>
+      </w:r>
+      <w:r>
+        <w:rPr>
+          <w:rFonts w:ascii="Arial" w:hAnsi="Arial" w:eastAsia="Arial" w:cs="Arial"/>
+          <w:color w:val="bcbec4"/>
+          <w:sz w:val="20"/>
+        </w:rPr>
+        <w:t xml:space="preserve">navController)</w:t>
+        <w:br/>
+        <w:t xml:space="preserve">            </w:t>
+      </w:r>
+      <w:r>
+        <w:rPr>
+          <w:rFonts w:ascii="Arial" w:hAnsi="Arial" w:eastAsia="Arial" w:cs="Arial"/>
+          <w:b/>
+          <w:color w:val="bcbec4"/>
+          <w:sz w:val="20"/>
+        </w:rPr>
+        <w:t xml:space="preserve">}            </w:t>
+      </w:r>
+      <w:r>
+        <w:rPr>
+          <w:rFonts w:ascii="Arial" w:hAnsi="Arial" w:eastAsia="Arial" w:cs="Arial"/>
+          <w:color w:val="6bb38a"/>
+          <w:sz w:val="20"/>
+        </w:rPr>
+        <w:t xml:space="preserve">AdMobBanner</w:t>
+      </w:r>
+      <w:r>
+        <w:rPr>
+          <w:rFonts w:ascii="Arial" w:hAnsi="Arial" w:eastAsia="Arial" w:cs="Arial"/>
+          <w:color w:val="bcbec4"/>
+          <w:sz w:val="20"/>
+        </w:rPr>
+        <w:t xml:space="preserve">()</w:t>
+        <w:br/>
+        <w:t xml:space="preserve">        }</w:t>
+        <w:br/>
+        <w:t xml:space="preserve">    </w:t>
+      </w:r>
+      <w:r>
+        <w:rPr>
+          <w:rFonts w:ascii="Arial" w:hAnsi="Arial" w:eastAsia="Arial" w:cs="Arial"/>
+          <w:b/>
+          <w:color w:val="bcbec4"/>
+          <w:sz w:val="20"/>
+        </w:rPr>
+        <w:t xml:space="preserve">}</w:t>
+      </w:r>
+      <w:r>
+        <w:rPr>
+          <w:rFonts w:ascii="Arial" w:hAnsi="Arial" w:eastAsia="Arial" w:cs="Arial"/>
+          <w:color w:val="bcbec4"/>
+          <w:sz w:val="20"/>
+        </w:rPr>
+        <w:t xml:space="preserve">}</w:t>
+      </w:r>
+      <w:r/>
+      <w:r/>
+    </w:p>
+    <w:p>
+      <w:pPr>
+        <w:pBdr>
+          <w:top w:val="none" w:color="000000" w:sz="4" w:space="0"/>
+          <w:left w:val="none" w:color="000000" w:sz="4" w:space="0"/>
+          <w:bottom w:val="none" w:color="000000" w:sz="4" w:space="0"/>
+          <w:right w:val="none" w:color="000000" w:sz="4" w:space="0"/>
+        </w:pBdr>
+        <w:shd w:val="clear" w:color="191a1c" w:fill="191a1c"/>
+        <w:spacing/>
+        <w:ind w:right="0" w:firstLine="0" w:left="0"/>
+        <w:rPr/>
+      </w:pPr>
+      <w:r>
+        <w:rPr>
+          <w:rFonts w:ascii="Arial" w:hAnsi="Arial" w:eastAsia="Arial" w:cs="Arial"/>
+          <w:color w:val="b3ae60"/>
+          <w:sz w:val="20"/>
+        </w:rPr>
+      </w:r>
+      <w:r/>
+    </w:p>
+    <w:p>
+      <w:pPr>
+        <w:pStyle w:val="828"/>
+        <w:pBdr/>
+        <w:spacing w:after="0"/>
+        <w:ind/>
+        <w:rPr/>
+      </w:pPr>
+      <w:r>
+        <w:rPr>
+          <w:highlight w:val="none"/>
+        </w:rPr>
+      </w:r>
+      <w:r>
+        <w:rPr>
+          <w:rStyle w:val="838"/>
+        </w:rPr>
+        <w:t xml:space="preserve">Diseño de interfaz gr</w:t>
+      </w:r>
+      <w:r>
+        <w:rPr>
+          <w:rStyle w:val="838"/>
+        </w:rPr>
+        <w:t xml:space="preserve">áfica del AdMob</w:t>
+      </w:r>
+      <w:r/>
+    </w:p>
+    <w:p>
+      <w:pPr>
+        <w:pBdr>
+          <w:top w:val="none" w:color="000000" w:sz="4" w:space="0"/>
+          <w:left w:val="none" w:color="000000" w:sz="4" w:space="0"/>
+          <w:bottom w:val="none" w:color="000000" w:sz="4" w:space="0"/>
+          <w:right w:val="none" w:color="000000" w:sz="4" w:space="0"/>
+        </w:pBdr>
+        <w:shd w:val="clear" w:color="191a1c" w:fill="191a1c"/>
+        <w:spacing/>
+        <w:ind w:right="0" w:firstLine="0" w:left="0"/>
+        <w:rPr/>
+      </w:pPr>
+      <w:r>
+        <w:rPr>
+          <w:rFonts w:ascii="Arial" w:hAnsi="Arial" w:eastAsia="Arial" w:cs="Arial"/>
+          <w:color w:val="b3ae60"/>
+          <w:sz w:val="20"/>
+        </w:rPr>
+        <w:t xml:space="preserve">@Composable</w:t>
+      </w:r>
+      <w:r>
+        <w:rPr>
+          <w:rFonts w:ascii="Arial" w:hAnsi="Arial" w:eastAsia="Arial" w:cs="Arial"/>
+          <w:color w:val="cf8e6d"/>
+          <w:sz w:val="20"/>
+        </w:rPr>
+        <w:t xml:space="preserve">fun </w:t>
+      </w:r>
+      <w:r>
+        <w:rPr>
+          <w:rFonts w:ascii="Arial" w:hAnsi="Arial" w:eastAsia="Arial" w:cs="Arial"/>
+          <w:color w:val="56a8f5"/>
+          <w:sz w:val="20"/>
+        </w:rPr>
+        <w:t xml:space="preserve">AdMobBanner</w:t>
+      </w:r>
+      <w:r>
+        <w:rPr>
+          <w:rFonts w:ascii="Arial" w:hAnsi="Arial" w:eastAsia="Arial" w:cs="Arial"/>
+          <w:color w:val="bcbec4"/>
+          <w:sz w:val="20"/>
+        </w:rPr>
+        <w:t xml:space="preserve">(){</w:t>
+        <w:br/>
+        <w:t xml:space="preserve">    </w:t>
+      </w:r>
+      <w:r>
+        <w:rPr>
+          <w:rFonts w:ascii="Arial" w:hAnsi="Arial" w:eastAsia="Arial" w:cs="Arial"/>
+          <w:color w:val="cf8e6d"/>
+          <w:sz w:val="20"/>
+        </w:rPr>
+        <w:t xml:space="preserve">val </w:t>
+      </w:r>
+      <w:r>
+        <w:rPr>
+          <w:rFonts w:ascii="Arial" w:hAnsi="Arial" w:eastAsia="Arial" w:cs="Arial"/>
+          <w:color w:val="bcbec4"/>
+          <w:sz w:val="20"/>
+        </w:rPr>
+        <w:t xml:space="preserve">adUnitId = </w:t>
+      </w:r>
+      <w:r>
+        <w:rPr>
+          <w:rFonts w:ascii="Arial" w:hAnsi="Arial" w:eastAsia="Arial" w:cs="Arial"/>
+          <w:color w:val="6bb38a"/>
+          <w:sz w:val="20"/>
+        </w:rPr>
+        <w:t xml:space="preserve">stringResource</w:t>
+      </w:r>
+      <w:r>
+        <w:rPr>
+          <w:rFonts w:ascii="Arial" w:hAnsi="Arial" w:eastAsia="Arial" w:cs="Arial"/>
+          <w:color w:val="bcbec4"/>
+          <w:sz w:val="20"/>
+        </w:rPr>
+        <w:t xml:space="preserve">(R.string.</w:t>
+      </w:r>
+      <w:r>
+        <w:rPr>
+          <w:rFonts w:ascii="Arial" w:hAnsi="Arial" w:eastAsia="Arial" w:cs="Arial"/>
+          <w:i/>
+          <w:color w:val="c77dbb"/>
+          <w:sz w:val="20"/>
+        </w:rPr>
+        <w:t xml:space="preserve">admob_bloque_anuncios_id</w:t>
+      </w:r>
+      <w:r>
+        <w:rPr>
+          <w:rFonts w:ascii="Arial" w:hAnsi="Arial" w:eastAsia="Arial" w:cs="Arial"/>
+          <w:color w:val="bcbec4"/>
+          <w:sz w:val="20"/>
+        </w:rPr>
+        <w:t xml:space="preserve">)</w:t>
+        <w:br/>
+        <w:t xml:space="preserve">    </w:t>
+      </w:r>
+      <w:r>
+        <w:rPr>
+          <w:rFonts w:ascii="Arial" w:hAnsi="Arial" w:eastAsia="Arial" w:cs="Arial"/>
+          <w:color w:val="cf8e6d"/>
+          <w:sz w:val="20"/>
+        </w:rPr>
+        <w:t xml:space="preserve">val </w:t>
+      </w:r>
+      <w:r>
+        <w:rPr>
+          <w:rFonts w:ascii="Arial" w:hAnsi="Arial" w:eastAsia="Arial" w:cs="Arial"/>
+          <w:color w:val="bcbec4"/>
+          <w:sz w:val="20"/>
+        </w:rPr>
+        <w:t xml:space="preserve">width = </w:t>
+      </w:r>
+      <w:r>
+        <w:rPr>
+          <w:rFonts w:ascii="Arial" w:hAnsi="Arial" w:eastAsia="Arial" w:cs="Arial"/>
+          <w:i/>
+          <w:color w:val="c77dbb"/>
+          <w:sz w:val="20"/>
+        </w:rPr>
+        <w:t xml:space="preserve">LocalConfiguration</w:t>
+      </w:r>
+      <w:r>
+        <w:rPr>
+          <w:rFonts w:ascii="Arial" w:hAnsi="Arial" w:eastAsia="Arial" w:cs="Arial"/>
+          <w:color w:val="bcbec4"/>
+          <w:sz w:val="20"/>
+        </w:rPr>
+        <w:t xml:space="preserve">.</w:t>
+      </w:r>
+      <w:r>
+        <w:rPr>
+          <w:rFonts w:ascii="Arial" w:hAnsi="Arial" w:eastAsia="Arial" w:cs="Arial"/>
+          <w:color w:val="6bb38a"/>
+          <w:sz w:val="20"/>
+        </w:rPr>
+        <w:t xml:space="preserve">current</w:t>
+      </w:r>
+      <w:r>
+        <w:rPr>
+          <w:rFonts w:ascii="Arial" w:hAnsi="Arial" w:eastAsia="Arial" w:cs="Arial"/>
+          <w:color w:val="bcbec4"/>
+          <w:sz w:val="20"/>
+        </w:rPr>
+        <w:t xml:space="preserve">.</w:t>
+      </w:r>
+      <w:r>
+        <w:rPr>
+          <w:rFonts w:ascii="Arial" w:hAnsi="Arial" w:eastAsia="Arial" w:cs="Arial"/>
+          <w:color w:val="c77dbb"/>
+          <w:sz w:val="20"/>
+        </w:rPr>
+        <w:t xml:space="preserve">screenWidthDp        </w:t>
+      </w:r>
+      <w:r>
+        <w:rPr>
+          <w:rFonts w:ascii="Arial" w:hAnsi="Arial" w:eastAsia="Arial" w:cs="Arial"/>
+          <w:color w:val="6bb38a"/>
+          <w:sz w:val="20"/>
+        </w:rPr>
+        <w:t xml:space="preserve">AndroidView</w:t>
+      </w:r>
+      <w:r>
+        <w:rPr>
+          <w:rFonts w:ascii="Arial" w:hAnsi="Arial" w:eastAsia="Arial" w:cs="Arial"/>
+          <w:color w:val="bcbec4"/>
+          <w:sz w:val="20"/>
+        </w:rPr>
+        <w:t xml:space="preserve">(</w:t>
+        <w:br/>
+        <w:t xml:space="preserve">        </w:t>
+      </w:r>
+      <w:r>
+        <w:rPr>
+          <w:rFonts w:ascii="Arial" w:hAnsi="Arial" w:eastAsia="Arial" w:cs="Arial"/>
+          <w:color w:val="56c1d6"/>
+          <w:sz w:val="20"/>
+        </w:rPr>
+        <w:t xml:space="preserve">modifier = </w:t>
+      </w:r>
+      <w:r>
+        <w:rPr>
+          <w:rFonts w:ascii="Arial" w:hAnsi="Arial" w:eastAsia="Arial" w:cs="Arial"/>
+          <w:color w:val="bcbec4"/>
+          <w:sz w:val="20"/>
+        </w:rPr>
+        <w:t xml:space="preserve">Modifier.</w:t>
+      </w:r>
+      <w:r>
+        <w:rPr>
+          <w:rFonts w:ascii="Arial" w:hAnsi="Arial" w:eastAsia="Arial" w:cs="Arial"/>
+          <w:i/>
+          <w:color w:val="57aaf7"/>
+          <w:sz w:val="20"/>
+        </w:rPr>
+        <w:t xml:space="preserve">fillMaxWidth</w:t>
+      </w:r>
+      <w:r>
+        <w:rPr>
+          <w:rFonts w:ascii="Arial" w:hAnsi="Arial" w:eastAsia="Arial" w:cs="Arial"/>
+          <w:color w:val="bcbec4"/>
+          <w:sz w:val="20"/>
+        </w:rPr>
+        <w:t xml:space="preserve">(),</w:t>
+        <w:br/>
+        <w:t xml:space="preserve">        </w:t>
+      </w:r>
+      <w:r>
+        <w:rPr>
+          <w:rFonts w:ascii="Arial" w:hAnsi="Arial" w:eastAsia="Arial" w:cs="Arial"/>
+          <w:color w:val="56c1d6"/>
+          <w:sz w:val="20"/>
+        </w:rPr>
+        <w:t xml:space="preserve">factory = </w:t>
+      </w:r>
+      <w:r>
+        <w:rPr>
+          <w:rFonts w:ascii="Arial" w:hAnsi="Arial" w:eastAsia="Arial" w:cs="Arial"/>
+          <w:b/>
+          <w:color w:val="bcbec4"/>
+          <w:sz w:val="20"/>
+        </w:rPr>
+        <w:t xml:space="preserve">{ </w:t>
+      </w:r>
+      <w:r>
+        <w:rPr>
+          <w:rFonts w:ascii="Arial" w:hAnsi="Arial" w:eastAsia="Arial" w:cs="Arial"/>
+          <w:color w:val="bcbec4"/>
+          <w:sz w:val="20"/>
+        </w:rPr>
+        <w:t xml:space="preserve">context </w:t>
+      </w:r>
+      <w:r>
+        <w:rPr>
+          <w:rFonts w:ascii="Arial" w:hAnsi="Arial" w:eastAsia="Arial" w:cs="Arial"/>
+          <w:b/>
+          <w:color w:val="bcbec4"/>
+          <w:sz w:val="20"/>
+        </w:rPr>
+        <w:t xml:space="preserve">-&gt;            </w:t>
+      </w:r>
+      <w:r>
+        <w:rPr>
+          <w:rFonts w:ascii="Arial" w:hAnsi="Arial" w:eastAsia="Arial" w:cs="Arial"/>
+          <w:color w:val="bcbec4"/>
+          <w:sz w:val="20"/>
+        </w:rPr>
+        <w:t xml:space="preserve">AdView(context).</w:t>
+      </w:r>
+      <w:r>
+        <w:rPr>
+          <w:rFonts w:ascii="Arial" w:hAnsi="Arial" w:eastAsia="Arial" w:cs="Arial"/>
+          <w:i/>
+          <w:color w:val="57aaf7"/>
+          <w:sz w:val="20"/>
+        </w:rPr>
+        <w:t xml:space="preserve">apply </w:t>
+      </w:r>
+      <w:r>
+        <w:rPr>
+          <w:rFonts w:ascii="Arial" w:hAnsi="Arial" w:eastAsia="Arial" w:cs="Arial"/>
+          <w:b/>
+          <w:color w:val="bcbec4"/>
+          <w:sz w:val="20"/>
+        </w:rPr>
+        <w:t xml:space="preserve">{                </w:t>
+      </w:r>
+      <w:r>
+        <w:rPr>
+          <w:rFonts w:ascii="Arial" w:hAnsi="Arial" w:eastAsia="Arial" w:cs="Arial"/>
+          <w:color w:val="bcbec4"/>
+          <w:sz w:val="20"/>
+        </w:rPr>
+        <w:t xml:space="preserve">setAdSize(AdSize.getCurrentOrientationAnchoredAdaptiveBannerAdSize(context, width))</w:t>
+        <w:br/>
+        <w:t xml:space="preserve">                setAdUnitId(adUnitId)</w:t>
+        <w:br/>
+        <w:t xml:space="preserve">                loadAd(AdRequest.Builder().build())</w:t>
+        <w:br/>
+        <w:t xml:space="preserve">            </w:t>
+      </w:r>
+      <w:r>
+        <w:rPr>
+          <w:rFonts w:ascii="Arial" w:hAnsi="Arial" w:eastAsia="Arial" w:cs="Arial"/>
+          <w:b/>
+          <w:color w:val="bcbec4"/>
+          <w:sz w:val="20"/>
+        </w:rPr>
+        <w:t xml:space="preserve">}        }    </w:t>
+      </w:r>
+      <w:r>
+        <w:rPr>
+          <w:rFonts w:ascii="Arial" w:hAnsi="Arial" w:eastAsia="Arial" w:cs="Arial"/>
+          <w:color w:val="bcbec4"/>
+          <w:sz w:val="20"/>
+        </w:rPr>
+        <w:t xml:space="preserve">)</w:t>
+        <w:br/>
+        <w:t xml:space="preserve">}</w:t>
+      </w:r>
+      <w:r/>
     </w:p>
     <w:p>
       <w:pPr>
@@ -27116,2069 +29304,9 @@
       <w:r>
         <w:rPr>
           <w:rFonts w:ascii="Arial" w:hAnsi="Arial" w:eastAsia="Arial" w:cs="Arial"/>
-          <w:color w:val="7a7e85"/>
-          <w:sz w:val="20"/>
-        </w:rPr>
-      </w:r>
-      <w:r>
-        <w:rPr>
-          <w:rFonts w:ascii="Arial" w:hAnsi="Arial" w:eastAsia="Arial" w:cs="Arial"/>
-          <w:color w:val="d5b778"/>
-          <w:sz w:val="20"/>
-        </w:rPr>
-        <w:t xml:space="preserve">&lt;meta-data    </w:t>
-      </w:r>
-      <w:r>
-        <w:rPr>
-          <w:rFonts w:ascii="Arial" w:hAnsi="Arial" w:eastAsia="Arial" w:cs="Arial"/>
-          <w:color w:val="c77dbb"/>
-          <w:sz w:val="20"/>
-        </w:rPr>
-        <w:t xml:space="preserve">android</w:t>
-      </w:r>
-      <w:r>
-        <w:rPr>
-          <w:rFonts w:ascii="Arial" w:hAnsi="Arial" w:eastAsia="Arial" w:cs="Arial"/>
-          <w:color w:val="bcbec4"/>
-          <w:sz w:val="20"/>
-        </w:rPr>
-        <w:t xml:space="preserve">:name</w:t>
-      </w:r>
-      <w:r>
-        <w:rPr>
-          <w:rFonts w:ascii="Arial" w:hAnsi="Arial" w:eastAsia="Arial" w:cs="Arial"/>
-          <w:color w:val="6aab73"/>
-          <w:sz w:val="20"/>
-        </w:rPr>
-        <w:t xml:space="preserve">="com.google.android.gms.ads.APPLICATION_ID"    </w:t>
-      </w:r>
-      <w:r>
-        <w:rPr>
-          <w:rFonts w:ascii="Arial" w:hAnsi="Arial" w:eastAsia="Arial" w:cs="Arial"/>
-          <w:color w:val="c77dbb"/>
-          <w:sz w:val="20"/>
-        </w:rPr>
-        <w:t xml:space="preserve">android</w:t>
-      </w:r>
-      <w:r>
-        <w:rPr>
-          <w:rFonts w:ascii="Arial" w:hAnsi="Arial" w:eastAsia="Arial" w:cs="Arial"/>
-          <w:color w:val="bcbec4"/>
-          <w:sz w:val="20"/>
-        </w:rPr>
-        <w:t xml:space="preserve">:value</w:t>
-      </w:r>
-      <w:r>
-        <w:rPr>
-          <w:rFonts w:ascii="Arial" w:hAnsi="Arial" w:eastAsia="Arial" w:cs="Arial"/>
-          <w:color w:val="6aab73"/>
-          <w:sz w:val="20"/>
-        </w:rPr>
-        <w:t xml:space="preserve">="</w:t>
-      </w:r>
-      <w:r>
-        <w:rPr>
-          <w:rFonts w:ascii="Arial" w:hAnsi="Arial" w:eastAsia="Arial" w:cs="Arial"/>
-          <w:color w:val="d5b778"/>
-          <w:sz w:val="20"/>
-          <w:szCs w:val="20"/>
-          <w:lang w:val="undefined" w:bidi="undefined"/>
-        </w:rPr>
-      </w:r>
-      <w:r>
-        <w:rPr>
-          <w:rFonts w:ascii="Arial" w:hAnsi="Arial" w:eastAsia="Arial" w:cs="Arial"/>
-          <w:color w:val="6aab73"/>
-          <w:sz w:val="20"/>
-        </w:rPr>
-        <w:t xml:space="preserve">@string/banner_ad_unit_id_QA"</w:t>
-      </w:r>
-      <w:r>
-        <w:rPr>
-          <w:rFonts w:ascii="Arial" w:hAnsi="Arial" w:eastAsia="Arial" w:cs="Arial"/>
-          <w:color w:val="d5b778"/>
-          <w:sz w:val="20"/>
-        </w:rPr>
-        <w:t xml:space="preserve">/&gt;</w:t>
-      </w:r>
-      <w:r/>
-      <w:r>
-        <w:rPr>
-          <w:highlight w:val="none"/>
-        </w:rPr>
-      </w:r>
-    </w:p>
-    <w:p>
-      <w:pPr>
-        <w:pBdr>
-          <w:top w:val="none" w:color="000000" w:sz="4" w:space="0"/>
-          <w:left w:val="none" w:color="000000" w:sz="4" w:space="0"/>
-          <w:bottom w:val="none" w:color="000000" w:sz="4" w:space="0"/>
-          <w:right w:val="none" w:color="000000" w:sz="4" w:space="0"/>
-        </w:pBdr>
-        <w:shd w:val="clear" w:color="191a1c" w:fill="191a1c"/>
-        <w:spacing w:after="0"/>
-        <w:ind w:right="0" w:firstLine="0" w:left="0"/>
-        <w:rPr>
-          <w:highlight w:val="none"/>
-        </w:rPr>
-      </w:pPr>
-      <w:r>
-        <w:rPr>
-          <w:rFonts w:ascii="Arial" w:hAnsi="Arial" w:eastAsia="Arial" w:cs="Arial"/>
-          <w:color w:val="d5b778"/>
-          <w:sz w:val="20"/>
-          <w:szCs w:val="20"/>
-          <w:highlight w:val="none"/>
-          <w:lang w:val="es-ES"/>
-        </w:rPr>
-        <w:t xml:space="preserve">.......</w:t>
-      </w:r>
-      <w:r>
-        <w:rPr>
-          <w:rFonts w:ascii="Arial" w:hAnsi="Arial" w:eastAsia="Arial" w:cs="Arial"/>
-          <w:color w:val="d5b778"/>
-          <w:sz w:val="20"/>
-          <w:szCs w:val="20"/>
-          <w:highlight w:val="none"/>
-        </w:rPr>
-      </w:r>
-      <w:r>
-        <w:rPr>
-          <w:rFonts w:ascii="Arial" w:hAnsi="Arial" w:eastAsia="Arial" w:cs="Arial"/>
-          <w:color w:val="d5b778"/>
-          <w:sz w:val="20"/>
-          <w:szCs w:val="20"/>
-          <w:highlight w:val="none"/>
-        </w:rPr>
-      </w:r>
-    </w:p>
-    <w:p>
-      <w:pPr>
-        <w:pBdr>
-          <w:top w:val="none" w:color="000000" w:sz="4" w:space="0"/>
-          <w:left w:val="none" w:color="000000" w:sz="4" w:space="0"/>
-          <w:bottom w:val="none" w:color="000000" w:sz="4" w:space="0"/>
-          <w:right w:val="none" w:color="000000" w:sz="4" w:space="0"/>
-        </w:pBdr>
-        <w:shd w:val="clear" w:color="191a1c" w:fill="191a1c"/>
-        <w:spacing w:after="0"/>
-        <w:ind w:right="0" w:firstLine="0" w:left="0"/>
-        <w:rPr>
-          <w:rFonts w:ascii="Arial" w:hAnsi="Arial" w:eastAsia="Arial" w:cs="Arial"/>
-          <w:color w:val="d5b778"/>
-          <w:sz w:val="20"/>
-          <w:szCs w:val="20"/>
-          <w:highlight w:val="none"/>
-        </w:rPr>
-      </w:pPr>
-      <w:r/>
-      <w:r>
-        <w:rPr>
-          <w:rFonts w:ascii="Arial" w:hAnsi="Arial" w:eastAsia="Arial" w:cs="Arial"/>
-          <w:color w:val="d5b778"/>
-          <w:sz w:val="20"/>
-          <w:szCs w:val="20"/>
-        </w:rPr>
-        <w:t xml:space="preserve">&lt;/application&gt;</w:t>
-      </w:r>
-      <w:r>
-        <w:rPr>
-          <w:highlight w:val="none"/>
-        </w:rPr>
-      </w:r>
-      <w:r/>
-    </w:p>
-    <w:p>
-      <w:pPr>
-        <w:pStyle w:val="828"/>
-        <w:pBdr/>
-        <w:spacing/>
-        <w:ind/>
-        <w:rPr>
-          <w:rStyle w:val="838"/>
-          <w:highlight w:val="none"/>
-        </w:rPr>
-      </w:pPr>
-      <w:r>
-        <w:rPr>
-          <w:rStyle w:val="838"/>
-        </w:rPr>
-        <w:t xml:space="preserve">Inicializar Ads</w:t>
-      </w:r>
-      <w:r/>
-    </w:p>
-    <w:p>
-      <w:pPr>
-        <w:pBdr>
-          <w:top w:val="none" w:color="000000" w:sz="4" w:space="0"/>
-          <w:left w:val="none" w:color="000000" w:sz="4" w:space="0"/>
-          <w:bottom w:val="none" w:color="000000" w:sz="4" w:space="0"/>
-          <w:right w:val="none" w:color="000000" w:sz="4" w:space="0"/>
-        </w:pBdr>
-        <w:shd w:val="clear" w:color="191a1c" w:fill="191a1c"/>
-        <w:spacing w:after="0"/>
-        <w:ind w:right="0" w:firstLine="0" w:left="0"/>
-        <w:rPr>
-          <w:rFonts w:ascii="Arial" w:hAnsi="Arial" w:eastAsia="Arial" w:cs="Arial"/>
-          <w:b/>
-          <w:bCs/>
-          <w:color w:val="bcbec4"/>
-          <w:sz w:val="20"/>
-          <w:szCs w:val="20"/>
-        </w:rPr>
-      </w:pPr>
-      <w:r>
-        <w:rPr>
-          <w:rFonts w:ascii="Arial" w:hAnsi="Arial" w:eastAsia="Arial" w:cs="Arial"/>
-          <w:color w:val="cf8e6d"/>
-          <w:sz w:val="20"/>
-        </w:rPr>
-        <w:t xml:space="preserve">class </w:t>
-      </w:r>
-      <w:r>
-        <w:rPr>
-          <w:rFonts w:ascii="Arial" w:hAnsi="Arial" w:eastAsia="Arial" w:cs="Arial"/>
-          <w:color w:val="bcbec4"/>
-          <w:sz w:val="20"/>
-        </w:rPr>
-        <w:t xml:space="preserve">MainActivity : ComponentActivity() {</w:t>
-        <w:br/>
-        <w:t xml:space="preserve">    </w:t>
-      </w:r>
-      <w:r>
-        <w:rPr>
-          <w:rFonts w:ascii="Arial" w:hAnsi="Arial" w:eastAsia="Arial" w:cs="Arial"/>
-          <w:color w:val="cf8e6d"/>
-          <w:sz w:val="20"/>
-        </w:rPr>
-        <w:t xml:space="preserve">override fun </w:t>
-      </w:r>
-      <w:r>
-        <w:rPr>
-          <w:rFonts w:ascii="Arial" w:hAnsi="Arial" w:eastAsia="Arial" w:cs="Arial"/>
-          <w:color w:val="56a8f5"/>
-          <w:sz w:val="20"/>
-        </w:rPr>
-        <w:t xml:space="preserve">onCreate</w:t>
-      </w:r>
-      <w:r>
-        <w:rPr>
-          <w:rFonts w:ascii="Arial" w:hAnsi="Arial" w:eastAsia="Arial" w:cs="Arial"/>
-          <w:color w:val="bcbec4"/>
-          <w:sz w:val="20"/>
-        </w:rPr>
-        <w:t xml:space="preserve">(savedInstanceState: Bundle?) {</w:t>
-        <w:br/>
-        <w:t xml:space="preserve">        </w:t>
-      </w:r>
-      <w:r>
-        <w:rPr>
-          <w:rFonts w:ascii="Arial" w:hAnsi="Arial" w:eastAsia="Arial" w:cs="Arial"/>
-          <w:color w:val="cf8e6d"/>
-          <w:sz w:val="20"/>
-        </w:rPr>
-        <w:t xml:space="preserve">super</w:t>
-      </w:r>
-      <w:r>
-        <w:rPr>
-          <w:rFonts w:ascii="Arial" w:hAnsi="Arial" w:eastAsia="Arial" w:cs="Arial"/>
-          <w:color w:val="bcbec4"/>
-          <w:sz w:val="20"/>
-        </w:rPr>
-        <w:t xml:space="preserve">.onCreate(savedInstanceState)</w:t>
-        <w:br/>
-        <w:t xml:space="preserve">        </w:t>
-      </w:r>
-      <w:r>
-        <w:rPr>
-          <w:rFonts w:ascii="Arial" w:hAnsi="Arial" w:eastAsia="Arial" w:cs="Arial"/>
-          <w:i/>
-          <w:color w:val="bcbec4"/>
-          <w:sz w:val="20"/>
-        </w:rPr>
-        <w:t xml:space="preserve">CoroutineScope</w:t>
-      </w:r>
-      <w:r>
-        <w:rPr>
-          <w:rFonts w:ascii="Arial" w:hAnsi="Arial" w:eastAsia="Arial" w:cs="Arial"/>
-          <w:color w:val="bcbec4"/>
-          <w:sz w:val="20"/>
-        </w:rPr>
-        <w:t xml:space="preserve">(Dispatchers.</w:t>
-      </w:r>
-      <w:r>
-        <w:rPr>
-          <w:rFonts w:ascii="Arial" w:hAnsi="Arial" w:eastAsia="Arial" w:cs="Arial"/>
-          <w:color w:val="c77dbb"/>
-          <w:sz w:val="20"/>
-        </w:rPr>
-        <w:t xml:space="preserve">IO</w:t>
-      </w:r>
-      <w:r>
-        <w:rPr>
-          <w:rFonts w:ascii="Arial" w:hAnsi="Arial" w:eastAsia="Arial" w:cs="Arial"/>
-          <w:color w:val="bcbec4"/>
-          <w:sz w:val="20"/>
-        </w:rPr>
-        <w:t xml:space="preserve">).</w:t>
-      </w:r>
-      <w:r>
-        <w:rPr>
-          <w:rFonts w:ascii="Arial" w:hAnsi="Arial" w:eastAsia="Arial" w:cs="Arial"/>
-          <w:i/>
-          <w:color w:val="57aaf7"/>
-          <w:sz w:val="20"/>
-        </w:rPr>
-        <w:t xml:space="preserve">launch </w:t>
-      </w:r>
-      <w:r>
-        <w:rPr>
-          <w:rFonts w:ascii="Arial" w:hAnsi="Arial" w:eastAsia="Arial" w:cs="Arial"/>
-          <w:b/>
-          <w:color w:val="bcbec4"/>
-          <w:sz w:val="20"/>
-        </w:rPr>
-        <w:t xml:space="preserve">{            </w:t>
-      </w:r>
-      <w:r>
-        <w:rPr>
-          <w:rFonts w:ascii="Arial" w:hAnsi="Arial" w:eastAsia="Arial" w:cs="Arial"/>
-          <w:b/>
-          <w:bCs/>
-          <w:color w:val="bcbec4"/>
-          <w:sz w:val="20"/>
-          <w:szCs w:val="20"/>
-          <w:highlight w:val="none"/>
-        </w:rPr>
-      </w:r>
-    </w:p>
-    <w:p>
-      <w:pPr>
-        <w:pBdr>
-          <w:top w:val="none" w:color="000000" w:sz="4" w:space="0"/>
-          <w:left w:val="none" w:color="000000" w:sz="4" w:space="0"/>
-          <w:bottom w:val="none" w:color="000000" w:sz="4" w:space="0"/>
-          <w:right w:val="none" w:color="000000" w:sz="4" w:space="0"/>
-        </w:pBdr>
-        <w:shd w:val="clear" w:color="191a1c" w:fill="191a1c"/>
-        <w:spacing w:after="0"/>
-        <w:ind w:right="0" w:firstLine="708" w:left="0"/>
-        <w:rPr>
-          <w:rFonts w:ascii="Arial" w:hAnsi="Arial" w:eastAsia="Arial" w:cs="Arial"/>
-          <w:b/>
-          <w:bCs/>
-          <w:color w:val="bcbec4"/>
-          <w:sz w:val="20"/>
-          <w:szCs w:val="20"/>
-          <w:highlight w:val="none"/>
-        </w:rPr>
-      </w:pPr>
-      <w:r>
-        <w:rPr>
-          <w:rFonts w:ascii="Arial" w:hAnsi="Arial" w:eastAsia="Arial" w:cs="Arial"/>
-          <w:b/>
-          <w:color w:val="bcbec4"/>
-          <w:sz w:val="20"/>
-        </w:rPr>
-      </w:r>
-      <w:r>
-        <w:rPr>
-          <w:rFonts w:ascii="Arial" w:hAnsi="Arial" w:eastAsia="Arial" w:cs="Arial"/>
-          <w:color w:val="bcbec4"/>
-          <w:sz w:val="20"/>
-        </w:rPr>
-        <w:t xml:space="preserve">MobileAds.initialize(</w:t>
-      </w:r>
-      <w:r>
-        <w:rPr>
-          <w:rFonts w:ascii="Arial" w:hAnsi="Arial" w:eastAsia="Arial" w:cs="Arial"/>
-          <w:color w:val="cf8e6d"/>
-          <w:sz w:val="20"/>
-        </w:rPr>
-        <w:t xml:space="preserve">this</w:t>
-      </w:r>
-      <w:r>
-        <w:rPr>
-          <w:rFonts w:ascii="Arial" w:hAnsi="Arial" w:eastAsia="Arial" w:cs="Arial"/>
-          <w:color w:val="32b8af"/>
-          <w:sz w:val="20"/>
-        </w:rPr>
-        <w:t xml:space="preserve">@MainActivity</w:t>
-      </w:r>
-      <w:r>
-        <w:rPr>
-          <w:rFonts w:ascii="Arial" w:hAnsi="Arial" w:eastAsia="Arial" w:cs="Arial"/>
-          <w:color w:val="bcbec4"/>
-          <w:sz w:val="20"/>
-        </w:rPr>
-        <w:t xml:space="preserve">)</w:t>
-        <w:br/>
-        <w:t xml:space="preserve">        </w:t>
-      </w:r>
-      <w:r>
-        <w:rPr>
-          <w:rFonts w:ascii="Arial" w:hAnsi="Arial" w:eastAsia="Arial" w:cs="Arial"/>
-          <w:b/>
-          <w:color w:val="bcbec4"/>
-          <w:sz w:val="20"/>
-        </w:rPr>
-        <w:t xml:space="preserve">}</w:t>
-      </w:r>
-      <w:r>
-        <w:rPr>
-          <w:rFonts w:ascii="Arial" w:hAnsi="Arial" w:eastAsia="Arial" w:cs="Arial"/>
-          <w:b/>
-          <w:bCs/>
-          <w:color w:val="bcbec4"/>
-          <w:sz w:val="20"/>
-          <w:szCs w:val="20"/>
-          <w:highlight w:val="none"/>
-        </w:rPr>
-      </w:r>
-      <w:r/>
-    </w:p>
-    <w:p>
-      <w:pPr>
-        <w:pBdr>
-          <w:top w:val="none" w:color="000000" w:sz="4" w:space="0"/>
-          <w:left w:val="none" w:color="000000" w:sz="4" w:space="0"/>
-          <w:bottom w:val="none" w:color="000000" w:sz="4" w:space="0"/>
-          <w:right w:val="none" w:color="000000" w:sz="4" w:space="0"/>
-        </w:pBdr>
-        <w:shd w:val="clear" w:color="191a1c" w:fill="191a1c"/>
-        <w:spacing w:after="0"/>
-        <w:ind w:right="0" w:firstLine="708" w:left="0"/>
-        <w:rPr>
-          <w:rFonts w:ascii="Arial" w:hAnsi="Arial" w:eastAsia="Arial" w:cs="Arial"/>
-          <w:b/>
-          <w:bCs/>
-          <w:color w:val="bcbec4"/>
-          <w:sz w:val="20"/>
-          <w:szCs w:val="20"/>
-          <w:highlight w:val="none"/>
-        </w:rPr>
-      </w:pPr>
-      <w:r>
-        <w:rPr>
-          <w:rFonts w:ascii="Arial" w:hAnsi="Arial" w:eastAsia="Arial" w:cs="Arial"/>
-          <w:b/>
-          <w:color w:val="bcbec4"/>
-          <w:sz w:val="20"/>
-          <w:highlight w:val="none"/>
-        </w:rPr>
-        <w:t xml:space="preserve">......</w:t>
-      </w:r>
-      <w:r>
-        <w:rPr>
-          <w:rFonts w:ascii="Arial" w:hAnsi="Arial" w:eastAsia="Arial" w:cs="Arial"/>
-          <w:b/>
-          <w:color w:val="bcbec4"/>
-          <w:sz w:val="20"/>
-          <w:highlight w:val="none"/>
-        </w:rPr>
-      </w:r>
-      <w:r>
-        <w:rPr>
-          <w:rFonts w:ascii="Arial" w:hAnsi="Arial" w:eastAsia="Arial" w:cs="Arial"/>
-          <w:b/>
-          <w:bCs/>
-          <w:color w:val="bcbec4"/>
-          <w:sz w:val="20"/>
-          <w:szCs w:val="20"/>
-          <w:highlight w:val="none"/>
-        </w:rPr>
-      </w:r>
-    </w:p>
-    <w:p>
-      <w:pPr>
-        <w:pBdr>
-          <w:top w:val="none" w:color="000000" w:sz="4" w:space="0"/>
-          <w:left w:val="none" w:color="000000" w:sz="4" w:space="0"/>
-          <w:bottom w:val="none" w:color="000000" w:sz="4" w:space="0"/>
-          <w:right w:val="none" w:color="000000" w:sz="4" w:space="0"/>
-        </w:pBdr>
-        <w:shd w:val="clear" w:color="191a1c" w:fill="191a1c"/>
-        <w:spacing w:after="0"/>
-        <w:ind w:right="0" w:firstLine="0" w:left="0"/>
-        <w:rPr>
-          <w:rFonts w:ascii="Arial" w:hAnsi="Arial" w:eastAsia="Arial" w:cs="Arial"/>
-          <w:b/>
-          <w:bCs/>
-          <w:color w:val="bcbec4"/>
-          <w:sz w:val="20"/>
-          <w:szCs w:val="20"/>
-          <w:highlight w:val="none"/>
-        </w:rPr>
-      </w:pPr>
-      <w:r>
-        <w:rPr>
-          <w:rFonts w:ascii="Arial" w:hAnsi="Arial" w:eastAsia="Arial" w:cs="Arial"/>
-          <w:b/>
-          <w:color w:val="bcbec4"/>
-          <w:sz w:val="20"/>
-          <w:highlight w:val="none"/>
-        </w:rPr>
-        <w:t xml:space="preserve">    }</w:t>
-      </w:r>
-      <w:r>
-        <w:rPr>
-          <w:sz w:val="24"/>
-          <w:szCs w:val="24"/>
-        </w:rPr>
-      </w:r>
-      <w:r>
-        <w:rPr>
-          <w:rFonts w:ascii="Arial" w:hAnsi="Arial" w:eastAsia="Arial" w:cs="Arial"/>
-          <w:b/>
-          <w:bCs/>
-          <w:color w:val="bcbec4"/>
-          <w:sz w:val="20"/>
-          <w:szCs w:val="20"/>
-          <w:highlight w:val="none"/>
-        </w:rPr>
-      </w:r>
-    </w:p>
-    <w:p>
-      <w:pPr>
-        <w:pBdr>
-          <w:top w:val="none" w:color="000000" w:sz="4" w:space="0"/>
-          <w:left w:val="none" w:color="000000" w:sz="4" w:space="0"/>
-          <w:bottom w:val="none" w:color="000000" w:sz="4" w:space="0"/>
-          <w:right w:val="none" w:color="000000" w:sz="4" w:space="0"/>
-        </w:pBdr>
-        <w:shd w:val="clear" w:color="191a1c" w:fill="191a1c"/>
-        <w:spacing/>
-        <w:ind w:right="0" w:firstLine="0" w:left="0"/>
-        <w:rPr>
-          <w:sz w:val="24"/>
-          <w:szCs w:val="24"/>
-        </w:rPr>
-      </w:pPr>
-      <w:r>
-        <w:rPr>
-          <w:rFonts w:ascii="Arial" w:hAnsi="Arial" w:eastAsia="Arial" w:cs="Arial"/>
-          <w:b/>
-          <w:color w:val="bcbec4"/>
-          <w:sz w:val="20"/>
-          <w:highlight w:val="none"/>
-        </w:rPr>
-        <w:t xml:space="preserve">}</w:t>
-      </w:r>
-      <w:r>
-        <w:rPr>
-          <w:rFonts w:ascii="Arial" w:hAnsi="Arial" w:eastAsia="Arial" w:cs="Arial"/>
-          <w:b/>
-          <w:color w:val="bcbec4"/>
-          <w:sz w:val="20"/>
-          <w:highlight w:val="none"/>
-        </w:rPr>
-      </w:r>
-      <w:r>
-        <w:rPr>
-          <w:sz w:val="24"/>
-          <w:szCs w:val="24"/>
-        </w:rPr>
-      </w:r>
-    </w:p>
-    <w:p>
-      <w:pPr>
-        <w:pStyle w:val="828"/>
-        <w:pBdr/>
-        <w:spacing w:after="0"/>
-        <w:ind/>
-        <w:rPr>
-          <w:highlight w:val="none"/>
-        </w:rPr>
-      </w:pPr>
-      <w:r>
-        <w:rPr>
-          <w:rStyle w:val="838"/>
-        </w:rPr>
-      </w:r>
-      <w:r>
-        <w:t xml:space="preserve">Invocaci</w:t>
-      </w:r>
-      <w:r>
-        <w:t xml:space="preserve">ón y uso de la Interfaz gr</w:t>
-      </w:r>
-      <w:r>
-        <w:t xml:space="preserve">áfica del AdMob</w:t>
-      </w:r>
-      <w:r>
-        <w:rPr>
-          <w:highlight w:val="none"/>
-        </w:rPr>
-      </w:r>
-    </w:p>
-    <w:p>
-      <w:pPr>
-        <w:pBdr>
-          <w:top w:val="none" w:color="000000" w:sz="4" w:space="0"/>
-          <w:left w:val="none" w:color="000000" w:sz="4" w:space="0"/>
-          <w:bottom w:val="none" w:color="000000" w:sz="4" w:space="0"/>
-          <w:right w:val="none" w:color="000000" w:sz="4" w:space="0"/>
-        </w:pBdr>
-        <w:shd w:val="clear" w:color="191a1c" w:fill="191a1c"/>
-        <w:spacing/>
-        <w:ind w:right="0" w:firstLine="0" w:left="0"/>
-        <w:rPr/>
-      </w:pPr>
-      <w:r>
-        <w:rPr>
-          <w:rFonts w:ascii="Arial" w:hAnsi="Arial" w:eastAsia="Arial" w:cs="Arial"/>
           <w:color w:val="b3ae60"/>
           <w:sz w:val="20"/>
         </w:rPr>
-        <w:t xml:space="preserve">@Composable</w:t>
-      </w:r>
-      <w:r>
-        <w:rPr>
-          <w:rFonts w:ascii="Arial" w:hAnsi="Arial" w:eastAsia="Arial" w:cs="Arial"/>
-          <w:color w:val="cf8e6d"/>
-          <w:sz w:val="20"/>
-        </w:rPr>
-        <w:t xml:space="preserve">fun </w:t>
-      </w:r>
-      <w:r>
-        <w:rPr>
-          <w:rFonts w:ascii="Arial" w:hAnsi="Arial" w:eastAsia="Arial" w:cs="Arial"/>
-          <w:color w:val="56a8f5"/>
-          <w:sz w:val="20"/>
-        </w:rPr>
-        <w:t xml:space="preserve">Fondo</w:t>
-      </w:r>
-      <w:r>
-        <w:rPr>
-          <w:rFonts w:ascii="Arial" w:hAnsi="Arial" w:eastAsia="Arial" w:cs="Arial"/>
-          <w:color w:val="bcbec4"/>
-          <w:sz w:val="20"/>
-        </w:rPr>
-        <w:t xml:space="preserve">(modifier: Modifier = Modifier) {</w:t>
-        <w:br/>
-        <w:t xml:space="preserve">    </w:t>
-      </w:r>
-      <w:r>
-        <w:rPr>
-          <w:rFonts w:ascii="Arial" w:hAnsi="Arial" w:eastAsia="Arial" w:cs="Arial"/>
-          <w:color w:val="7a7e85"/>
-          <w:sz w:val="20"/>
-        </w:rPr>
-        <w:t xml:space="preserve">// 3. El navController se recuerda dentro de la composición, no en la Activity    </w:t>
-      </w:r>
-      <w:r>
-        <w:rPr>
-          <w:rFonts w:ascii="Arial" w:hAnsi="Arial" w:eastAsia="Arial" w:cs="Arial"/>
-          <w:color w:val="cf8e6d"/>
-          <w:sz w:val="20"/>
-        </w:rPr>
-        <w:t xml:space="preserve">val </w:t>
-      </w:r>
-      <w:r>
-        <w:rPr>
-          <w:rFonts w:ascii="Arial" w:hAnsi="Arial" w:eastAsia="Arial" w:cs="Arial"/>
-          <w:color w:val="bcbec4"/>
-          <w:sz w:val="20"/>
-        </w:rPr>
-        <w:t xml:space="preserve">navController = </w:t>
-      </w:r>
-      <w:r>
-        <w:rPr>
-          <w:rFonts w:ascii="Arial" w:hAnsi="Arial" w:eastAsia="Arial" w:cs="Arial"/>
-          <w:color w:val="6bb38a"/>
-          <w:sz w:val="20"/>
-        </w:rPr>
-        <w:t xml:space="preserve">rememberNavController</w:t>
-      </w:r>
-      <w:r>
-        <w:rPr>
-          <w:rFonts w:ascii="Arial" w:hAnsi="Arial" w:eastAsia="Arial" w:cs="Arial"/>
-          <w:color w:val="bcbec4"/>
-          <w:sz w:val="20"/>
-        </w:rPr>
-        <w:t xml:space="preserve">()</w:t>
-        <w:br/>
-        <w:t xml:space="preserve">    </w:t>
-      </w:r>
-      <w:r>
-        <w:rPr>
-          <w:rFonts w:ascii="Arial" w:hAnsi="Arial" w:eastAsia="Arial" w:cs="Arial"/>
-          <w:color w:val="cf8e6d"/>
-          <w:sz w:val="20"/>
-        </w:rPr>
-        <w:t xml:space="preserve">val </w:t>
-      </w:r>
-      <w:r>
-        <w:rPr>
-          <w:rFonts w:ascii="Arial" w:hAnsi="Arial" w:eastAsia="Arial" w:cs="Arial"/>
-          <w:color w:val="bcbec4"/>
-          <w:sz w:val="20"/>
-        </w:rPr>
-        <w:t xml:space="preserve">configuration = </w:t>
-      </w:r>
-      <w:r>
-        <w:rPr>
-          <w:rFonts w:ascii="Arial" w:hAnsi="Arial" w:eastAsia="Arial" w:cs="Arial"/>
-          <w:i/>
-          <w:color w:val="c77dbb"/>
-          <w:sz w:val="20"/>
-        </w:rPr>
-        <w:t xml:space="preserve">LocalConfiguration</w:t>
-      </w:r>
-      <w:r>
-        <w:rPr>
-          <w:rFonts w:ascii="Arial" w:hAnsi="Arial" w:eastAsia="Arial" w:cs="Arial"/>
-          <w:color w:val="bcbec4"/>
-          <w:sz w:val="20"/>
-        </w:rPr>
-        <w:t xml:space="preserve">.</w:t>
-      </w:r>
-      <w:r>
-        <w:rPr>
-          <w:rFonts w:ascii="Arial" w:hAnsi="Arial" w:eastAsia="Arial" w:cs="Arial"/>
-          <w:color w:val="6bb38a"/>
-          <w:sz w:val="20"/>
-        </w:rPr>
-        <w:t xml:space="preserve">current    </w:t>
-      </w:r>
-      <w:r>
-        <w:rPr>
-          <w:rFonts w:ascii="Arial" w:hAnsi="Arial" w:eastAsia="Arial" w:cs="Arial"/>
-          <w:color w:val="cf8e6d"/>
-          <w:sz w:val="20"/>
-        </w:rPr>
-        <w:t xml:space="preserve">val </w:t>
-      </w:r>
-      <w:r>
-        <w:rPr>
-          <w:rFonts w:ascii="Arial" w:hAnsi="Arial" w:eastAsia="Arial" w:cs="Arial"/>
-          <w:color w:val="bcbec4"/>
-          <w:sz w:val="20"/>
-        </w:rPr>
-        <w:t xml:space="preserve">isLandscape = configuration.</w:t>
-      </w:r>
-      <w:r>
-        <w:rPr>
-          <w:rFonts w:ascii="Arial" w:hAnsi="Arial" w:eastAsia="Arial" w:cs="Arial"/>
-          <w:color w:val="c77dbb"/>
-          <w:sz w:val="20"/>
-        </w:rPr>
-        <w:t xml:space="preserve">orientation </w:t>
-      </w:r>
-      <w:r>
-        <w:rPr>
-          <w:rFonts w:ascii="Arial" w:hAnsi="Arial" w:eastAsia="Arial" w:cs="Arial"/>
-          <w:color w:val="bcbec4"/>
-          <w:sz w:val="20"/>
-        </w:rPr>
-        <w:t xml:space="preserve">== Configuration.</w:t>
-      </w:r>
-      <w:r>
-        <w:rPr>
-          <w:rFonts w:ascii="Arial" w:hAnsi="Arial" w:eastAsia="Arial" w:cs="Arial"/>
-          <w:i/>
-          <w:color w:val="c77dbb"/>
-          <w:sz w:val="20"/>
-        </w:rPr>
-        <w:t xml:space="preserve">ORIENTATION_LANDSCAPE    </w:t>
-      </w:r>
-      <w:r>
-        <w:rPr>
-          <w:rFonts w:ascii="Arial" w:hAnsi="Arial" w:eastAsia="Arial" w:cs="Arial"/>
-          <w:color w:val="0da19e"/>
-          <w:sz w:val="20"/>
-        </w:rPr>
-        <w:t xml:space="preserve">Column</w:t>
-      </w:r>
-      <w:r>
-        <w:rPr>
-          <w:rFonts w:ascii="Arial" w:hAnsi="Arial" w:eastAsia="Arial" w:cs="Arial"/>
-          <w:color w:val="bcbec4"/>
-          <w:sz w:val="20"/>
-        </w:rPr>
-        <w:t xml:space="preserve">(</w:t>
-      </w:r>
-      <w:r>
-        <w:rPr>
-          <w:rFonts w:ascii="Arial" w:hAnsi="Arial" w:eastAsia="Arial" w:cs="Arial"/>
-          <w:color w:val="56c1d6"/>
-          <w:sz w:val="20"/>
-        </w:rPr>
-        <w:t xml:space="preserve">modifier = </w:t>
-      </w:r>
-      <w:r>
-        <w:rPr>
-          <w:rFonts w:ascii="Arial" w:hAnsi="Arial" w:eastAsia="Arial" w:cs="Arial"/>
-          <w:color w:val="bcbec4"/>
-          <w:sz w:val="20"/>
-        </w:rPr>
-        <w:t xml:space="preserve">modifier) </w:t>
-      </w:r>
-      <w:r>
-        <w:rPr>
-          <w:rFonts w:ascii="Arial" w:hAnsi="Arial" w:eastAsia="Arial" w:cs="Arial"/>
-          <w:b/>
-          <w:color w:val="bcbec4"/>
-          <w:sz w:val="20"/>
-        </w:rPr>
-        <w:t xml:space="preserve">{        </w:t>
-      </w:r>
-      <w:r>
-        <w:rPr>
-          <w:rFonts w:ascii="Arial" w:hAnsi="Arial" w:eastAsia="Arial" w:cs="Arial"/>
-          <w:color w:val="cf8e6d"/>
-          <w:sz w:val="20"/>
-        </w:rPr>
-        <w:t xml:space="preserve">if</w:t>
-      </w:r>
-      <w:r>
-        <w:rPr>
-          <w:rFonts w:ascii="Arial" w:hAnsi="Arial" w:eastAsia="Arial" w:cs="Arial"/>
-          <w:color w:val="bcbec4"/>
-          <w:sz w:val="20"/>
-        </w:rPr>
-        <w:t xml:space="preserve">(isLandscape){</w:t>
-        <w:br/>
-        <w:t xml:space="preserve">            </w:t>
-      </w:r>
-      <w:r>
-        <w:rPr>
-          <w:rFonts w:ascii="Arial" w:hAnsi="Arial" w:eastAsia="Arial" w:cs="Arial"/>
-          <w:color w:val="0da19e"/>
-          <w:sz w:val="20"/>
-        </w:rPr>
-        <w:t xml:space="preserve">Row</w:t>
-      </w:r>
-      <w:r>
-        <w:rPr>
-          <w:rFonts w:ascii="Arial" w:hAnsi="Arial" w:eastAsia="Arial" w:cs="Arial"/>
-          <w:color w:val="6f737a"/>
-          <w:sz w:val="20"/>
-        </w:rPr>
-        <w:t xml:space="preserve">() </w:t>
-      </w:r>
-      <w:r>
-        <w:rPr>
-          <w:rFonts w:ascii="Arial" w:hAnsi="Arial" w:eastAsia="Arial" w:cs="Arial"/>
-          <w:b/>
-          <w:color w:val="bcbec4"/>
-          <w:sz w:val="20"/>
-        </w:rPr>
-        <w:t xml:space="preserve">{                </w:t>
-      </w:r>
-      <w:r>
-        <w:rPr>
-          <w:rFonts w:ascii="Arial" w:hAnsi="Arial" w:eastAsia="Arial" w:cs="Arial"/>
-          <w:color w:val="0da19e"/>
-          <w:sz w:val="20"/>
-        </w:rPr>
-        <w:t xml:space="preserve">Column</w:t>
-      </w:r>
-      <w:r>
-        <w:rPr>
-          <w:rFonts w:ascii="Arial" w:hAnsi="Arial" w:eastAsia="Arial" w:cs="Arial"/>
-          <w:color w:val="bcbec4"/>
-          <w:sz w:val="20"/>
-        </w:rPr>
-        <w:t xml:space="preserve">(</w:t>
-      </w:r>
-      <w:r>
-        <w:rPr>
-          <w:rFonts w:ascii="Arial" w:hAnsi="Arial" w:eastAsia="Arial" w:cs="Arial"/>
-          <w:color w:val="56c1d6"/>
-          <w:sz w:val="20"/>
-        </w:rPr>
-        <w:t xml:space="preserve">modifier = </w:t>
-      </w:r>
-      <w:r>
-        <w:rPr>
-          <w:rFonts w:ascii="Arial" w:hAnsi="Arial" w:eastAsia="Arial" w:cs="Arial"/>
-          <w:color w:val="bcbec4"/>
-          <w:sz w:val="20"/>
-        </w:rPr>
-        <w:t xml:space="preserve">Modifier.</w:t>
-      </w:r>
-      <w:r>
-        <w:rPr>
-          <w:rFonts w:ascii="Arial" w:hAnsi="Arial" w:eastAsia="Arial" w:cs="Arial"/>
-          <w:color w:val="0da19e"/>
-          <w:sz w:val="20"/>
-        </w:rPr>
-        <w:t xml:space="preserve">weight</w:t>
-      </w:r>
-      <w:r>
-        <w:rPr>
-          <w:rFonts w:ascii="Arial" w:hAnsi="Arial" w:eastAsia="Arial" w:cs="Arial"/>
-          <w:color w:val="bcbec4"/>
-          <w:sz w:val="20"/>
-        </w:rPr>
-        <w:t xml:space="preserve">(</w:t>
-      </w:r>
-      <w:r>
-        <w:rPr>
-          <w:rFonts w:ascii="Arial" w:hAnsi="Arial" w:eastAsia="Arial" w:cs="Arial"/>
-          <w:color w:val="2aacb8"/>
-          <w:sz w:val="20"/>
-        </w:rPr>
-        <w:t xml:space="preserve">1F</w:t>
-      </w:r>
-      <w:r>
-        <w:rPr>
-          <w:rFonts w:ascii="Arial" w:hAnsi="Arial" w:eastAsia="Arial" w:cs="Arial"/>
-          <w:color w:val="bcbec4"/>
-          <w:sz w:val="20"/>
-        </w:rPr>
-        <w:t xml:space="preserve">).</w:t>
-      </w:r>
-      <w:r>
-        <w:rPr>
-          <w:rFonts w:ascii="Arial" w:hAnsi="Arial" w:eastAsia="Arial" w:cs="Arial"/>
-          <w:i/>
-          <w:color w:val="57aaf7"/>
-          <w:sz w:val="20"/>
-        </w:rPr>
-        <w:t xml:space="preserve">fillMaxHeight</w:t>
-      </w:r>
-      <w:r>
-        <w:rPr>
-          <w:rFonts w:ascii="Arial" w:hAnsi="Arial" w:eastAsia="Arial" w:cs="Arial"/>
-          <w:color w:val="bcbec4"/>
-          <w:sz w:val="20"/>
-        </w:rPr>
-        <w:t xml:space="preserve">()</w:t>
-      </w:r>
-      <w:r>
-        <w:rPr>
-          <w:rFonts w:ascii="Arial" w:hAnsi="Arial" w:eastAsia="Arial" w:cs="Arial"/>
-          <w:color w:val="7a7e85"/>
-          <w:sz w:val="20"/>
-        </w:rPr>
-        <w:t xml:space="preserve">/*.border(width = 1.dp, color = Color.Red)*/</w:t>
-      </w:r>
-      <w:r>
-        <w:rPr>
-          <w:rFonts w:ascii="Arial" w:hAnsi="Arial" w:eastAsia="Arial" w:cs="Arial"/>
-          <w:color w:val="bcbec4"/>
-          <w:sz w:val="20"/>
-        </w:rPr>
-        <w:t xml:space="preserve">) </w:t>
-      </w:r>
-      <w:r>
-        <w:rPr>
-          <w:rFonts w:ascii="Arial" w:hAnsi="Arial" w:eastAsia="Arial" w:cs="Arial"/>
-          <w:b/>
-          <w:color w:val="bcbec4"/>
-          <w:sz w:val="20"/>
-        </w:rPr>
-        <w:t xml:space="preserve">{                    </w:t>
-      </w:r>
-      <w:r>
-        <w:rPr>
-          <w:rFonts w:ascii="Arial" w:hAnsi="Arial" w:eastAsia="Arial" w:cs="Arial"/>
-          <w:color w:val="6bb38a"/>
-          <w:sz w:val="20"/>
-        </w:rPr>
-        <w:t xml:space="preserve">AdMobBanner</w:t>
-      </w:r>
-      <w:r>
-        <w:rPr>
-          <w:rFonts w:ascii="Arial" w:hAnsi="Arial" w:eastAsia="Arial" w:cs="Arial"/>
-          <w:color w:val="bcbec4"/>
-          <w:sz w:val="20"/>
-        </w:rPr>
-        <w:t xml:space="preserve">()</w:t>
-        <w:br/>
-        <w:t xml:space="preserve">                </w:t>
-      </w:r>
-      <w:r>
-        <w:rPr>
-          <w:rFonts w:ascii="Arial" w:hAnsi="Arial" w:eastAsia="Arial" w:cs="Arial"/>
-          <w:b/>
-          <w:color w:val="bcbec4"/>
-          <w:sz w:val="20"/>
-        </w:rPr>
-        <w:t xml:space="preserve">}                </w:t>
-      </w:r>
-      <w:r>
-        <w:rPr>
-          <w:rFonts w:ascii="Arial" w:hAnsi="Arial" w:eastAsia="Arial" w:cs="Arial"/>
-          <w:color w:val="0da19e"/>
-          <w:sz w:val="20"/>
-        </w:rPr>
-        <w:t xml:space="preserve">Column</w:t>
-      </w:r>
-      <w:r>
-        <w:rPr>
-          <w:rFonts w:ascii="Arial" w:hAnsi="Arial" w:eastAsia="Arial" w:cs="Arial"/>
-          <w:color w:val="bcbec4"/>
-          <w:sz w:val="20"/>
-        </w:rPr>
-        <w:t xml:space="preserve">(</w:t>
-      </w:r>
-      <w:r>
-        <w:rPr>
-          <w:rFonts w:ascii="Arial" w:hAnsi="Arial" w:eastAsia="Arial" w:cs="Arial"/>
-          <w:color w:val="56c1d6"/>
-          <w:sz w:val="20"/>
-        </w:rPr>
-        <w:t xml:space="preserve">modifier = </w:t>
-      </w:r>
-      <w:r>
-        <w:rPr>
-          <w:rFonts w:ascii="Arial" w:hAnsi="Arial" w:eastAsia="Arial" w:cs="Arial"/>
-          <w:color w:val="bcbec4"/>
-          <w:sz w:val="20"/>
-        </w:rPr>
-        <w:t xml:space="preserve">Modifier.</w:t>
-      </w:r>
-      <w:r>
-        <w:rPr>
-          <w:rFonts w:ascii="Arial" w:hAnsi="Arial" w:eastAsia="Arial" w:cs="Arial"/>
-          <w:color w:val="0da19e"/>
-          <w:sz w:val="20"/>
-        </w:rPr>
-        <w:t xml:space="preserve">weight</w:t>
-      </w:r>
-      <w:r>
-        <w:rPr>
-          <w:rFonts w:ascii="Arial" w:hAnsi="Arial" w:eastAsia="Arial" w:cs="Arial"/>
-          <w:color w:val="bcbec4"/>
-          <w:sz w:val="20"/>
-        </w:rPr>
-        <w:t xml:space="preserve">(</w:t>
-      </w:r>
-      <w:r>
-        <w:rPr>
-          <w:rFonts w:ascii="Arial" w:hAnsi="Arial" w:eastAsia="Arial" w:cs="Arial"/>
-          <w:color w:val="2aacb8"/>
-          <w:sz w:val="20"/>
-        </w:rPr>
-        <w:t xml:space="preserve">8F</w:t>
-      </w:r>
-      <w:r>
-        <w:rPr>
-          <w:rFonts w:ascii="Arial" w:hAnsi="Arial" w:eastAsia="Arial" w:cs="Arial"/>
-          <w:color w:val="bcbec4"/>
-          <w:sz w:val="20"/>
-        </w:rPr>
-        <w:t xml:space="preserve">).</w:t>
-      </w:r>
-      <w:r>
-        <w:rPr>
-          <w:rFonts w:ascii="Arial" w:hAnsi="Arial" w:eastAsia="Arial" w:cs="Arial"/>
-          <w:i/>
-          <w:color w:val="57aaf7"/>
-          <w:sz w:val="20"/>
-        </w:rPr>
-        <w:t xml:space="preserve">fillMaxHeight</w:t>
-      </w:r>
-      <w:r>
-        <w:rPr>
-          <w:rFonts w:ascii="Arial" w:hAnsi="Arial" w:eastAsia="Arial" w:cs="Arial"/>
-          <w:color w:val="bcbec4"/>
-          <w:sz w:val="20"/>
-        </w:rPr>
-        <w:t xml:space="preserve">()</w:t>
-      </w:r>
-      <w:r>
-        <w:rPr>
-          <w:rFonts w:ascii="Arial" w:hAnsi="Arial" w:eastAsia="Arial" w:cs="Arial"/>
-          <w:color w:val="7a7e85"/>
-          <w:sz w:val="20"/>
-        </w:rPr>
-        <w:t xml:space="preserve">/*.border(width = 1.dp, color = Color.Blue)*/</w:t>
-      </w:r>
-      <w:r>
-        <w:rPr>
-          <w:rFonts w:ascii="Arial" w:hAnsi="Arial" w:eastAsia="Arial" w:cs="Arial"/>
-          <w:color w:val="bcbec4"/>
-          <w:sz w:val="20"/>
-        </w:rPr>
-        <w:t xml:space="preserve">) </w:t>
-      </w:r>
-      <w:r>
-        <w:rPr>
-          <w:rFonts w:ascii="Arial" w:hAnsi="Arial" w:eastAsia="Arial" w:cs="Arial"/>
-          <w:b/>
-          <w:color w:val="bcbec4"/>
-          <w:sz w:val="20"/>
-        </w:rPr>
-        <w:t xml:space="preserve">{                    </w:t>
-      </w:r>
-      <w:r>
-        <w:rPr>
-          <w:rFonts w:ascii="Arial" w:hAnsi="Arial" w:eastAsia="Arial" w:cs="Arial"/>
-          <w:color w:val="6bb38a"/>
-          <w:sz w:val="20"/>
-        </w:rPr>
-        <w:t xml:space="preserve">Encabezado</w:t>
-      </w:r>
-      <w:r>
-        <w:rPr>
-          <w:rFonts w:ascii="Arial" w:hAnsi="Arial" w:eastAsia="Arial" w:cs="Arial"/>
-          <w:color w:val="bcbec4"/>
-          <w:sz w:val="20"/>
-        </w:rPr>
-        <w:t xml:space="preserve">(navController)</w:t>
-        <w:br/>
-        <w:t xml:space="preserve">                    </w:t>
-      </w:r>
-      <w:r>
-        <w:rPr>
-          <w:rFonts w:ascii="Arial" w:hAnsi="Arial" w:eastAsia="Arial" w:cs="Arial"/>
-          <w:color w:val="6bb38a"/>
-          <w:sz w:val="20"/>
-        </w:rPr>
-        <w:t xml:space="preserve">Navegacion</w:t>
-      </w:r>
-      <w:r>
-        <w:rPr>
-          <w:rFonts w:ascii="Arial" w:hAnsi="Arial" w:eastAsia="Arial" w:cs="Arial"/>
-          <w:color w:val="bcbec4"/>
-          <w:sz w:val="20"/>
-        </w:rPr>
-        <w:t xml:space="preserve">(</w:t>
-      </w:r>
-      <w:r>
-        <w:rPr>
-          <w:rFonts w:ascii="Arial" w:hAnsi="Arial" w:eastAsia="Arial" w:cs="Arial"/>
-          <w:color w:val="56c1d6"/>
-          <w:sz w:val="20"/>
-        </w:rPr>
-        <w:t xml:space="preserve">navController = </w:t>
-      </w:r>
-      <w:r>
-        <w:rPr>
-          <w:rFonts w:ascii="Arial" w:hAnsi="Arial" w:eastAsia="Arial" w:cs="Arial"/>
-          <w:color w:val="bcbec4"/>
-          <w:sz w:val="20"/>
-        </w:rPr>
-        <w:t xml:space="preserve">navController)</w:t>
-        <w:br/>
-        <w:t xml:space="preserve">                </w:t>
-      </w:r>
-      <w:r>
-        <w:rPr>
-          <w:rFonts w:ascii="Arial" w:hAnsi="Arial" w:eastAsia="Arial" w:cs="Arial"/>
-          <w:b/>
-          <w:color w:val="bcbec4"/>
-          <w:sz w:val="20"/>
-        </w:rPr>
-        <w:t xml:space="preserve">}                </w:t>
-      </w:r>
-      <w:r>
-        <w:rPr>
-          <w:rFonts w:ascii="Arial" w:hAnsi="Arial" w:eastAsia="Arial" w:cs="Arial"/>
-          <w:color w:val="0da19e"/>
-          <w:sz w:val="20"/>
-        </w:rPr>
-        <w:t xml:space="preserve">Column</w:t>
-      </w:r>
-      <w:r>
-        <w:rPr>
-          <w:rFonts w:ascii="Arial" w:hAnsi="Arial" w:eastAsia="Arial" w:cs="Arial"/>
-          <w:color w:val="bcbec4"/>
-          <w:sz w:val="20"/>
-        </w:rPr>
-        <w:t xml:space="preserve">(</w:t>
-      </w:r>
-      <w:r>
-        <w:rPr>
-          <w:rFonts w:ascii="Arial" w:hAnsi="Arial" w:eastAsia="Arial" w:cs="Arial"/>
-          <w:color w:val="56c1d6"/>
-          <w:sz w:val="20"/>
-        </w:rPr>
-        <w:t xml:space="preserve">modifier = </w:t>
-      </w:r>
-      <w:r>
-        <w:rPr>
-          <w:rFonts w:ascii="Arial" w:hAnsi="Arial" w:eastAsia="Arial" w:cs="Arial"/>
-          <w:color w:val="bcbec4"/>
-          <w:sz w:val="20"/>
-        </w:rPr>
-        <w:t xml:space="preserve">Modifier.</w:t>
-      </w:r>
-      <w:r>
-        <w:rPr>
-          <w:rFonts w:ascii="Arial" w:hAnsi="Arial" w:eastAsia="Arial" w:cs="Arial"/>
-          <w:color w:val="0da19e"/>
-          <w:sz w:val="20"/>
-        </w:rPr>
-        <w:t xml:space="preserve">weight</w:t>
-      </w:r>
-      <w:r>
-        <w:rPr>
-          <w:rFonts w:ascii="Arial" w:hAnsi="Arial" w:eastAsia="Arial" w:cs="Arial"/>
-          <w:color w:val="bcbec4"/>
-          <w:sz w:val="20"/>
-        </w:rPr>
-        <w:t xml:space="preserve">(</w:t>
-      </w:r>
-      <w:r>
-        <w:rPr>
-          <w:rFonts w:ascii="Arial" w:hAnsi="Arial" w:eastAsia="Arial" w:cs="Arial"/>
-          <w:color w:val="2aacb8"/>
-          <w:sz w:val="20"/>
-        </w:rPr>
-        <w:t xml:space="preserve">1F</w:t>
-      </w:r>
-      <w:r>
-        <w:rPr>
-          <w:rFonts w:ascii="Arial" w:hAnsi="Arial" w:eastAsia="Arial" w:cs="Arial"/>
-          <w:color w:val="bcbec4"/>
-          <w:sz w:val="20"/>
-        </w:rPr>
-        <w:t xml:space="preserve">).</w:t>
-      </w:r>
-      <w:r>
-        <w:rPr>
-          <w:rFonts w:ascii="Arial" w:hAnsi="Arial" w:eastAsia="Arial" w:cs="Arial"/>
-          <w:i/>
-          <w:color w:val="57aaf7"/>
-          <w:sz w:val="20"/>
-        </w:rPr>
-        <w:t xml:space="preserve">fillMaxHeight</w:t>
-      </w:r>
-      <w:r>
-        <w:rPr>
-          <w:rFonts w:ascii="Arial" w:hAnsi="Arial" w:eastAsia="Arial" w:cs="Arial"/>
-          <w:color w:val="bcbec4"/>
-          <w:sz w:val="20"/>
-        </w:rPr>
-        <w:t xml:space="preserve">()</w:t>
-      </w:r>
-      <w:r>
-        <w:rPr>
-          <w:rFonts w:ascii="Arial" w:hAnsi="Arial" w:eastAsia="Arial" w:cs="Arial"/>
-          <w:color w:val="7a7e85"/>
-          <w:sz w:val="20"/>
-        </w:rPr>
-        <w:t xml:space="preserve">/*.border(width = 1.dp, color = Color.Red)*/</w:t>
-      </w:r>
-      <w:r>
-        <w:rPr>
-          <w:rFonts w:ascii="Arial" w:hAnsi="Arial" w:eastAsia="Arial" w:cs="Arial"/>
-          <w:color w:val="bcbec4"/>
-          <w:sz w:val="20"/>
-        </w:rPr>
-        <w:t xml:space="preserve">) </w:t>
-      </w:r>
-      <w:r>
-        <w:rPr>
-          <w:rFonts w:ascii="Arial" w:hAnsi="Arial" w:eastAsia="Arial" w:cs="Arial"/>
-          <w:b/>
-          <w:color w:val="bcbec4"/>
-          <w:sz w:val="20"/>
-        </w:rPr>
-        <w:t xml:space="preserve">{                    </w:t>
-      </w:r>
-      <w:r>
-        <w:rPr>
-          <w:rFonts w:ascii="Arial" w:hAnsi="Arial" w:eastAsia="Arial" w:cs="Arial"/>
-          <w:color w:val="6bb38a"/>
-          <w:sz w:val="20"/>
-        </w:rPr>
-        <w:t xml:space="preserve">AdMobBanner</w:t>
-      </w:r>
-      <w:r>
-        <w:rPr>
-          <w:rFonts w:ascii="Arial" w:hAnsi="Arial" w:eastAsia="Arial" w:cs="Arial"/>
-          <w:color w:val="bcbec4"/>
-          <w:sz w:val="20"/>
-        </w:rPr>
-        <w:t xml:space="preserve">()</w:t>
-        <w:br/>
-        <w:t xml:space="preserve">                </w:t>
-      </w:r>
-      <w:r>
-        <w:rPr>
-          <w:rFonts w:ascii="Arial" w:hAnsi="Arial" w:eastAsia="Arial" w:cs="Arial"/>
-          <w:b/>
-          <w:color w:val="bcbec4"/>
-          <w:sz w:val="20"/>
-        </w:rPr>
-        <w:t xml:space="preserve">}            }        </w:t>
-      </w:r>
-      <w:r>
-        <w:rPr>
-          <w:rFonts w:ascii="Arial" w:hAnsi="Arial" w:eastAsia="Arial" w:cs="Arial"/>
-          <w:color w:val="bcbec4"/>
-          <w:sz w:val="20"/>
-        </w:rPr>
-        <w:t xml:space="preserve">} </w:t>
-      </w:r>
-      <w:r>
-        <w:rPr>
-          <w:rFonts w:ascii="Arial" w:hAnsi="Arial" w:eastAsia="Arial" w:cs="Arial"/>
-          <w:color w:val="cf8e6d"/>
-          <w:sz w:val="20"/>
-        </w:rPr>
-        <w:t xml:space="preserve">else </w:t>
-      </w:r>
-      <w:r>
-        <w:rPr>
-          <w:rFonts w:ascii="Arial" w:hAnsi="Arial" w:eastAsia="Arial" w:cs="Arial"/>
-          <w:color w:val="bcbec4"/>
-          <w:sz w:val="20"/>
-        </w:rPr>
-        <w:t xml:space="preserve">{</w:t>
-        <w:br/>
-        <w:t xml:space="preserve">            </w:t>
-      </w:r>
-      <w:r>
-        <w:rPr>
-          <w:rFonts w:ascii="Arial" w:hAnsi="Arial" w:eastAsia="Arial" w:cs="Arial"/>
-          <w:color w:val="0da19e"/>
-          <w:sz w:val="20"/>
-        </w:rPr>
-        <w:t xml:space="preserve">Column</w:t>
-      </w:r>
-      <w:r>
-        <w:rPr>
-          <w:rFonts w:ascii="Arial" w:hAnsi="Arial" w:eastAsia="Arial" w:cs="Arial"/>
-          <w:color w:val="bcbec4"/>
-          <w:sz w:val="20"/>
-        </w:rPr>
-        <w:t xml:space="preserve">(</w:t>
-      </w:r>
-      <w:r>
-        <w:rPr>
-          <w:rFonts w:ascii="Arial" w:hAnsi="Arial" w:eastAsia="Arial" w:cs="Arial"/>
-          <w:color w:val="56c1d6"/>
-          <w:sz w:val="20"/>
-        </w:rPr>
-        <w:t xml:space="preserve">modifier = </w:t>
-      </w:r>
-      <w:r>
-        <w:rPr>
-          <w:rFonts w:ascii="Arial" w:hAnsi="Arial" w:eastAsia="Arial" w:cs="Arial"/>
-          <w:color w:val="bcbec4"/>
-          <w:sz w:val="20"/>
-        </w:rPr>
-        <w:t xml:space="preserve">Modifier.</w:t>
-      </w:r>
-      <w:r>
-        <w:rPr>
-          <w:rFonts w:ascii="Arial" w:hAnsi="Arial" w:eastAsia="Arial" w:cs="Arial"/>
-          <w:color w:val="0da19e"/>
-          <w:sz w:val="20"/>
-        </w:rPr>
-        <w:t xml:space="preserve">weight</w:t>
-      </w:r>
-      <w:r>
-        <w:rPr>
-          <w:rFonts w:ascii="Arial" w:hAnsi="Arial" w:eastAsia="Arial" w:cs="Arial"/>
-          <w:color w:val="bcbec4"/>
-          <w:sz w:val="20"/>
-        </w:rPr>
-        <w:t xml:space="preserve">(</w:t>
-      </w:r>
-      <w:r>
-        <w:rPr>
-          <w:rFonts w:ascii="Arial" w:hAnsi="Arial" w:eastAsia="Arial" w:cs="Arial"/>
-          <w:color w:val="2aacb8"/>
-          <w:sz w:val="20"/>
-        </w:rPr>
-        <w:t xml:space="preserve">1F</w:t>
-      </w:r>
-      <w:r>
-        <w:rPr>
-          <w:rFonts w:ascii="Arial" w:hAnsi="Arial" w:eastAsia="Arial" w:cs="Arial"/>
-          <w:color w:val="bcbec4"/>
-          <w:sz w:val="20"/>
-        </w:rPr>
-        <w:t xml:space="preserve">).</w:t>
-      </w:r>
-      <w:r>
-        <w:rPr>
-          <w:rFonts w:ascii="Arial" w:hAnsi="Arial" w:eastAsia="Arial" w:cs="Arial"/>
-          <w:i/>
-          <w:color w:val="57aaf7"/>
-          <w:sz w:val="20"/>
-        </w:rPr>
-        <w:t xml:space="preserve">fillMaxWidth</w:t>
-      </w:r>
-      <w:r>
-        <w:rPr>
-          <w:rFonts w:ascii="Arial" w:hAnsi="Arial" w:eastAsia="Arial" w:cs="Arial"/>
-          <w:color w:val="bcbec4"/>
-          <w:sz w:val="20"/>
-        </w:rPr>
-        <w:t xml:space="preserve">()</w:t>
-      </w:r>
-      <w:r>
-        <w:rPr>
-          <w:rFonts w:ascii="Arial" w:hAnsi="Arial" w:eastAsia="Arial" w:cs="Arial"/>
-          <w:color w:val="7a7e85"/>
-          <w:sz w:val="20"/>
-        </w:rPr>
-        <w:t xml:space="preserve">/*.border(width = 1.dp, color = Color.Red)*/</w:t>
-      </w:r>
-      <w:r>
-        <w:rPr>
-          <w:rFonts w:ascii="Arial" w:hAnsi="Arial" w:eastAsia="Arial" w:cs="Arial"/>
-          <w:color w:val="bcbec4"/>
-          <w:sz w:val="20"/>
-        </w:rPr>
-        <w:t xml:space="preserve">) </w:t>
-      </w:r>
-      <w:r>
-        <w:rPr>
-          <w:rFonts w:ascii="Arial" w:hAnsi="Arial" w:eastAsia="Arial" w:cs="Arial"/>
-          <w:b/>
-          <w:color w:val="bcbec4"/>
-          <w:sz w:val="20"/>
-        </w:rPr>
-        <w:t xml:space="preserve">{                </w:t>
-      </w:r>
-      <w:r>
-        <w:rPr>
-          <w:rFonts w:ascii="Arial" w:hAnsi="Arial" w:eastAsia="Arial" w:cs="Arial"/>
-          <w:color w:val="6bb38a"/>
-          <w:sz w:val="20"/>
-        </w:rPr>
-        <w:t xml:space="preserve">AdMobBanner</w:t>
-      </w:r>
-      <w:r>
-        <w:rPr>
-          <w:rFonts w:ascii="Arial" w:hAnsi="Arial" w:eastAsia="Arial" w:cs="Arial"/>
-          <w:color w:val="bcbec4"/>
-          <w:sz w:val="20"/>
-        </w:rPr>
-        <w:t xml:space="preserve">()</w:t>
-        <w:br/>
-        <w:t xml:space="preserve">            </w:t>
-      </w:r>
-      <w:r>
-        <w:rPr>
-          <w:rFonts w:ascii="Arial" w:hAnsi="Arial" w:eastAsia="Arial" w:cs="Arial"/>
-          <w:b/>
-          <w:color w:val="bcbec4"/>
-          <w:sz w:val="20"/>
-        </w:rPr>
-        <w:t xml:space="preserve">}            </w:t>
-      </w:r>
-      <w:r>
-        <w:rPr>
-          <w:rFonts w:ascii="Arial" w:hAnsi="Arial" w:eastAsia="Arial" w:cs="Arial"/>
-          <w:color w:val="0da19e"/>
-          <w:sz w:val="20"/>
-        </w:rPr>
-        <w:t xml:space="preserve">Column</w:t>
-      </w:r>
-      <w:r>
-        <w:rPr>
-          <w:rFonts w:ascii="Arial" w:hAnsi="Arial" w:eastAsia="Arial" w:cs="Arial"/>
-          <w:color w:val="bcbec4"/>
-          <w:sz w:val="20"/>
-        </w:rPr>
-        <w:t xml:space="preserve">(</w:t>
-      </w:r>
-      <w:r>
-        <w:rPr>
-          <w:rFonts w:ascii="Arial" w:hAnsi="Arial" w:eastAsia="Arial" w:cs="Arial"/>
-          <w:color w:val="56c1d6"/>
-          <w:sz w:val="20"/>
-        </w:rPr>
-        <w:t xml:space="preserve">modifier = </w:t>
-      </w:r>
-      <w:r>
-        <w:rPr>
-          <w:rFonts w:ascii="Arial" w:hAnsi="Arial" w:eastAsia="Arial" w:cs="Arial"/>
-          <w:color w:val="bcbec4"/>
-          <w:sz w:val="20"/>
-        </w:rPr>
-        <w:t xml:space="preserve">Modifier.</w:t>
-      </w:r>
-      <w:r>
-        <w:rPr>
-          <w:rFonts w:ascii="Arial" w:hAnsi="Arial" w:eastAsia="Arial" w:cs="Arial"/>
-          <w:color w:val="0da19e"/>
-          <w:sz w:val="20"/>
-        </w:rPr>
-        <w:t xml:space="preserve">weight</w:t>
-      </w:r>
-      <w:r>
-        <w:rPr>
-          <w:rFonts w:ascii="Arial" w:hAnsi="Arial" w:eastAsia="Arial" w:cs="Arial"/>
-          <w:color w:val="bcbec4"/>
-          <w:sz w:val="20"/>
-        </w:rPr>
-        <w:t xml:space="preserve">(</w:t>
-      </w:r>
-      <w:r>
-        <w:rPr>
-          <w:rFonts w:ascii="Arial" w:hAnsi="Arial" w:eastAsia="Arial" w:cs="Arial"/>
-          <w:color w:val="2aacb8"/>
-          <w:sz w:val="20"/>
-        </w:rPr>
-        <w:t xml:space="preserve">9F</w:t>
-      </w:r>
-      <w:r>
-        <w:rPr>
-          <w:rFonts w:ascii="Arial" w:hAnsi="Arial" w:eastAsia="Arial" w:cs="Arial"/>
-          <w:color w:val="bcbec4"/>
-          <w:sz w:val="20"/>
-        </w:rPr>
-        <w:t xml:space="preserve">).</w:t>
-      </w:r>
-      <w:r>
-        <w:rPr>
-          <w:rFonts w:ascii="Arial" w:hAnsi="Arial" w:eastAsia="Arial" w:cs="Arial"/>
-          <w:i/>
-          <w:color w:val="57aaf7"/>
-          <w:sz w:val="20"/>
-        </w:rPr>
-        <w:t xml:space="preserve">fillMaxWidth</w:t>
-      </w:r>
-      <w:r>
-        <w:rPr>
-          <w:rFonts w:ascii="Arial" w:hAnsi="Arial" w:eastAsia="Arial" w:cs="Arial"/>
-          <w:color w:val="bcbec4"/>
-          <w:sz w:val="20"/>
-        </w:rPr>
-        <w:t xml:space="preserve">()</w:t>
-      </w:r>
-      <w:r>
-        <w:rPr>
-          <w:rFonts w:ascii="Arial" w:hAnsi="Arial" w:eastAsia="Arial" w:cs="Arial"/>
-          <w:color w:val="7a7e85"/>
-          <w:sz w:val="20"/>
-        </w:rPr>
-        <w:t xml:space="preserve">/*.border(width = 1.dp, color = Color.Blue)*/</w:t>
-      </w:r>
-      <w:r>
-        <w:rPr>
-          <w:rFonts w:ascii="Arial" w:hAnsi="Arial" w:eastAsia="Arial" w:cs="Arial"/>
-          <w:color w:val="bcbec4"/>
-          <w:sz w:val="20"/>
-        </w:rPr>
-        <w:t xml:space="preserve">) </w:t>
-      </w:r>
-      <w:r>
-        <w:rPr>
-          <w:rFonts w:ascii="Arial" w:hAnsi="Arial" w:eastAsia="Arial" w:cs="Arial"/>
-          <w:b/>
-          <w:color w:val="bcbec4"/>
-          <w:sz w:val="20"/>
-        </w:rPr>
-        <w:t xml:space="preserve">{                    </w:t>
-      </w:r>
-      <w:r>
-        <w:rPr>
-          <w:rFonts w:ascii="Arial" w:hAnsi="Arial" w:eastAsia="Arial" w:cs="Arial"/>
-          <w:color w:val="6bb38a"/>
-          <w:sz w:val="20"/>
-        </w:rPr>
-        <w:t xml:space="preserve">Encabezado</w:t>
-      </w:r>
-      <w:r>
-        <w:rPr>
-          <w:rFonts w:ascii="Arial" w:hAnsi="Arial" w:eastAsia="Arial" w:cs="Arial"/>
-          <w:color w:val="bcbec4"/>
-          <w:sz w:val="20"/>
-        </w:rPr>
-        <w:t xml:space="preserve">(navController)</w:t>
-        <w:br/>
-        <w:t xml:space="preserve">                    </w:t>
-      </w:r>
-      <w:r>
-        <w:rPr>
-          <w:rFonts w:ascii="Arial" w:hAnsi="Arial" w:eastAsia="Arial" w:cs="Arial"/>
-          <w:color w:val="6bb38a"/>
-          <w:sz w:val="20"/>
-        </w:rPr>
-        <w:t xml:space="preserve">Navegacion</w:t>
-      </w:r>
-      <w:r>
-        <w:rPr>
-          <w:rFonts w:ascii="Arial" w:hAnsi="Arial" w:eastAsia="Arial" w:cs="Arial"/>
-          <w:color w:val="bcbec4"/>
-          <w:sz w:val="20"/>
-        </w:rPr>
-        <w:t xml:space="preserve">(</w:t>
-      </w:r>
-      <w:r>
-        <w:rPr>
-          <w:rFonts w:ascii="Arial" w:hAnsi="Arial" w:eastAsia="Arial" w:cs="Arial"/>
-          <w:color w:val="56c1d6"/>
-          <w:sz w:val="20"/>
-        </w:rPr>
-        <w:t xml:space="preserve">navController = </w:t>
-      </w:r>
-      <w:r>
-        <w:rPr>
-          <w:rFonts w:ascii="Arial" w:hAnsi="Arial" w:eastAsia="Arial" w:cs="Arial"/>
-          <w:color w:val="bcbec4"/>
-          <w:sz w:val="20"/>
-        </w:rPr>
-        <w:t xml:space="preserve">navController)</w:t>
-        <w:br/>
-        <w:t xml:space="preserve">            </w:t>
-      </w:r>
-      <w:r>
-        <w:rPr>
-          <w:rFonts w:ascii="Arial" w:hAnsi="Arial" w:eastAsia="Arial" w:cs="Arial"/>
-          <w:b/>
-          <w:color w:val="bcbec4"/>
-          <w:sz w:val="20"/>
-        </w:rPr>
-        <w:t xml:space="preserve">}            </w:t>
-      </w:r>
-      <w:r>
-        <w:rPr>
-          <w:rFonts w:ascii="Arial" w:hAnsi="Arial" w:eastAsia="Arial" w:cs="Arial"/>
-          <w:color w:val="0da19e"/>
-          <w:sz w:val="20"/>
-        </w:rPr>
-        <w:t xml:space="preserve">Column</w:t>
-      </w:r>
-      <w:r>
-        <w:rPr>
-          <w:rFonts w:ascii="Arial" w:hAnsi="Arial" w:eastAsia="Arial" w:cs="Arial"/>
-          <w:color w:val="bcbec4"/>
-          <w:sz w:val="20"/>
-        </w:rPr>
-        <w:t xml:space="preserve">(</w:t>
-      </w:r>
-      <w:r>
-        <w:rPr>
-          <w:rFonts w:ascii="Arial" w:hAnsi="Arial" w:eastAsia="Arial" w:cs="Arial"/>
-          <w:color w:val="56c1d6"/>
-          <w:sz w:val="20"/>
-        </w:rPr>
-        <w:t xml:space="preserve">modifier = </w:t>
-      </w:r>
-      <w:r>
-        <w:rPr>
-          <w:rFonts w:ascii="Arial" w:hAnsi="Arial" w:eastAsia="Arial" w:cs="Arial"/>
-          <w:color w:val="bcbec4"/>
-          <w:sz w:val="20"/>
-        </w:rPr>
-        <w:t xml:space="preserve">Modifier.</w:t>
-      </w:r>
-      <w:r>
-        <w:rPr>
-          <w:rFonts w:ascii="Arial" w:hAnsi="Arial" w:eastAsia="Arial" w:cs="Arial"/>
-          <w:color w:val="0da19e"/>
-          <w:sz w:val="20"/>
-        </w:rPr>
-        <w:t xml:space="preserve">weight</w:t>
-      </w:r>
-      <w:r>
-        <w:rPr>
-          <w:rFonts w:ascii="Arial" w:hAnsi="Arial" w:eastAsia="Arial" w:cs="Arial"/>
-          <w:color w:val="bcbec4"/>
-          <w:sz w:val="20"/>
-        </w:rPr>
-        <w:t xml:space="preserve">(</w:t>
-      </w:r>
-      <w:r>
-        <w:rPr>
-          <w:rFonts w:ascii="Arial" w:hAnsi="Arial" w:eastAsia="Arial" w:cs="Arial"/>
-          <w:color w:val="2aacb8"/>
-          <w:sz w:val="20"/>
-        </w:rPr>
-        <w:t xml:space="preserve">1F</w:t>
-      </w:r>
-      <w:r>
-        <w:rPr>
-          <w:rFonts w:ascii="Arial" w:hAnsi="Arial" w:eastAsia="Arial" w:cs="Arial"/>
-          <w:color w:val="bcbec4"/>
-          <w:sz w:val="20"/>
-        </w:rPr>
-        <w:t xml:space="preserve">).</w:t>
-      </w:r>
-      <w:r>
-        <w:rPr>
-          <w:rFonts w:ascii="Arial" w:hAnsi="Arial" w:eastAsia="Arial" w:cs="Arial"/>
-          <w:i/>
-          <w:color w:val="57aaf7"/>
-          <w:sz w:val="20"/>
-        </w:rPr>
-        <w:t xml:space="preserve">fillMaxWidth</w:t>
-      </w:r>
-      <w:r>
-        <w:rPr>
-          <w:rFonts w:ascii="Arial" w:hAnsi="Arial" w:eastAsia="Arial" w:cs="Arial"/>
-          <w:color w:val="bcbec4"/>
-          <w:sz w:val="20"/>
-        </w:rPr>
-        <w:t xml:space="preserve">()</w:t>
-      </w:r>
-      <w:r>
-        <w:rPr>
-          <w:rFonts w:ascii="Arial" w:hAnsi="Arial" w:eastAsia="Arial" w:cs="Arial"/>
-          <w:color w:val="7a7e85"/>
-          <w:sz w:val="20"/>
-        </w:rPr>
-        <w:t xml:space="preserve">/*.border(width = 1.dp, color = Color.Red)*/</w:t>
-      </w:r>
-      <w:r>
-        <w:rPr>
-          <w:rFonts w:ascii="Arial" w:hAnsi="Arial" w:eastAsia="Arial" w:cs="Arial"/>
-          <w:color w:val="bcbec4"/>
-          <w:sz w:val="20"/>
-        </w:rPr>
-        <w:t xml:space="preserve">) </w:t>
-      </w:r>
-      <w:r>
-        <w:rPr>
-          <w:rFonts w:ascii="Arial" w:hAnsi="Arial" w:eastAsia="Arial" w:cs="Arial"/>
-          <w:b/>
-          <w:color w:val="bcbec4"/>
-          <w:sz w:val="20"/>
-        </w:rPr>
-        <w:t xml:space="preserve">{                </w:t>
-      </w:r>
-      <w:r>
-        <w:rPr>
-          <w:rFonts w:ascii="Arial" w:hAnsi="Arial" w:eastAsia="Arial" w:cs="Arial"/>
-          <w:color w:val="6bb38a"/>
-          <w:sz w:val="20"/>
-        </w:rPr>
-        <w:t xml:space="preserve">AdMobBanner</w:t>
-      </w:r>
-      <w:r>
-        <w:rPr>
-          <w:rFonts w:ascii="Arial" w:hAnsi="Arial" w:eastAsia="Arial" w:cs="Arial"/>
-          <w:color w:val="bcbec4"/>
-          <w:sz w:val="20"/>
-        </w:rPr>
-        <w:t xml:space="preserve">()</w:t>
-        <w:br/>
-        <w:t xml:space="preserve">            </w:t>
-      </w:r>
-      <w:r>
-        <w:rPr>
-          <w:rFonts w:ascii="Arial" w:hAnsi="Arial" w:eastAsia="Arial" w:cs="Arial"/>
-          <w:b/>
-          <w:color w:val="bcbec4"/>
-          <w:sz w:val="20"/>
-        </w:rPr>
-        <w:t xml:space="preserve">}        </w:t>
-      </w:r>
-      <w:r>
-        <w:rPr>
-          <w:rFonts w:ascii="Arial" w:hAnsi="Arial" w:eastAsia="Arial" w:cs="Arial"/>
-          <w:color w:val="bcbec4"/>
-          <w:sz w:val="20"/>
-        </w:rPr>
-        <w:t xml:space="preserve">}</w:t>
-        <w:br/>
-        <w:t xml:space="preserve">    </w:t>
-      </w:r>
-      <w:r>
-        <w:rPr>
-          <w:rFonts w:ascii="Arial" w:hAnsi="Arial" w:eastAsia="Arial" w:cs="Arial"/>
-          <w:b/>
-          <w:color w:val="bcbec4"/>
-          <w:sz w:val="20"/>
-        </w:rPr>
-        <w:t xml:space="preserve">}</w:t>
-      </w:r>
-      <w:r>
-        <w:rPr>
-          <w:rFonts w:ascii="Arial" w:hAnsi="Arial" w:eastAsia="Arial" w:cs="Arial"/>
-          <w:color w:val="bcbec4"/>
-          <w:sz w:val="20"/>
-        </w:rPr>
-        <w:t xml:space="preserve">}</w:t>
-      </w:r>
-      <w:r>
-        <w:rPr>
-          <w:sz w:val="24"/>
-        </w:rPr>
-      </w:r>
-      <w:r/>
-    </w:p>
-    <w:p>
-      <w:pPr>
-        <w:pStyle w:val="828"/>
-        <w:pBdr/>
-        <w:spacing w:after="0"/>
-        <w:ind/>
-        <w:rPr/>
-      </w:pPr>
-      <w:r>
-        <w:rPr>
-          <w:highlight w:val="none"/>
-        </w:rPr>
-      </w:r>
-      <w:r>
-        <w:rPr>
-          <w:rStyle w:val="838"/>
-        </w:rPr>
-        <w:t xml:space="preserve">Diseño de interfaz gr</w:t>
-      </w:r>
-      <w:r>
-        <w:rPr>
-          <w:rStyle w:val="838"/>
-        </w:rPr>
-        <w:t xml:space="preserve">áfica del AdMob</w:t>
-      </w:r>
-      <w:r/>
-    </w:p>
-    <w:p>
-      <w:pPr>
-        <w:pBdr>
-          <w:top w:val="none" w:color="000000" w:sz="4" w:space="0"/>
-          <w:left w:val="none" w:color="000000" w:sz="4" w:space="0"/>
-          <w:bottom w:val="none" w:color="000000" w:sz="4" w:space="0"/>
-          <w:right w:val="none" w:color="000000" w:sz="4" w:space="0"/>
-        </w:pBdr>
-        <w:shd w:val="clear" w:color="191a1c" w:fill="191a1c"/>
-        <w:spacing/>
-        <w:ind w:right="0" w:firstLine="0" w:left="0"/>
-        <w:rPr/>
-      </w:pPr>
-      <w:r>
-        <w:rPr>
-          <w:rFonts w:ascii="Arial" w:hAnsi="Arial" w:eastAsia="Arial" w:cs="Arial"/>
-          <w:color w:val="b3ae60"/>
-          <w:sz w:val="20"/>
-        </w:rPr>
-        <w:t xml:space="preserve">@Composable</w:t>
-      </w:r>
-      <w:r>
-        <w:rPr>
-          <w:rFonts w:ascii="Arial" w:hAnsi="Arial" w:eastAsia="Arial" w:cs="Arial"/>
-          <w:color w:val="cf8e6d"/>
-          <w:sz w:val="20"/>
-        </w:rPr>
-        <w:t xml:space="preserve">fun </w:t>
-      </w:r>
-      <w:r>
-        <w:rPr>
-          <w:rFonts w:ascii="Arial" w:hAnsi="Arial" w:eastAsia="Arial" w:cs="Arial"/>
-          <w:color w:val="56a8f5"/>
-          <w:sz w:val="20"/>
-        </w:rPr>
-        <w:t xml:space="preserve">AdMobBanner</w:t>
-      </w:r>
-      <w:r>
-        <w:rPr>
-          <w:rFonts w:ascii="Arial" w:hAnsi="Arial" w:eastAsia="Arial" w:cs="Arial"/>
-          <w:color w:val="bcbec4"/>
-          <w:sz w:val="20"/>
-        </w:rPr>
-        <w:t xml:space="preserve">(){</w:t>
-        <w:br/>
-        <w:t xml:space="preserve">    </w:t>
-      </w:r>
-      <w:r>
-        <w:rPr>
-          <w:rFonts w:ascii="Arial" w:hAnsi="Arial" w:eastAsia="Arial" w:cs="Arial"/>
-          <w:color w:val="cf8e6d"/>
-          <w:sz w:val="20"/>
-        </w:rPr>
-        <w:t xml:space="preserve">val </w:t>
-      </w:r>
-      <w:r>
-        <w:rPr>
-          <w:rFonts w:ascii="Arial" w:hAnsi="Arial" w:eastAsia="Arial" w:cs="Arial"/>
-          <w:color w:val="bcbec4"/>
-          <w:sz w:val="20"/>
-        </w:rPr>
-        <w:t xml:space="preserve">adUnitId = </w:t>
-      </w:r>
-      <w:r>
-        <w:rPr>
-          <w:rFonts w:ascii="Arial" w:hAnsi="Arial" w:eastAsia="Arial" w:cs="Arial"/>
-          <w:color w:val="6bb38a"/>
-          <w:sz w:val="20"/>
-        </w:rPr>
-        <w:t xml:space="preserve">stringResource</w:t>
-      </w:r>
-      <w:r>
-        <w:rPr>
-          <w:rFonts w:ascii="Arial" w:hAnsi="Arial" w:eastAsia="Arial" w:cs="Arial"/>
-          <w:color w:val="bcbec4"/>
-          <w:sz w:val="20"/>
-        </w:rPr>
-        <w:t xml:space="preserve">(R.string.</w:t>
-      </w:r>
-      <w:r>
-        <w:rPr>
-          <w:rFonts w:ascii="Arial" w:hAnsi="Arial" w:eastAsia="Arial" w:cs="Arial"/>
-          <w:i/>
-          <w:color w:val="c77dbb"/>
-          <w:sz w:val="20"/>
-        </w:rPr>
-        <w:t xml:space="preserve">banner_ad_unit_id_QA</w:t>
-      </w:r>
-      <w:r>
-        <w:rPr>
-          <w:rFonts w:ascii="Arial" w:hAnsi="Arial" w:eastAsia="Arial" w:cs="Arial"/>
-          <w:color w:val="bcbec4"/>
-          <w:sz w:val="20"/>
-        </w:rPr>
-        <w:t xml:space="preserve">)</w:t>
-        <w:br/>
-        <w:t xml:space="preserve">    </w:t>
-      </w:r>
-      <w:r>
-        <w:rPr>
-          <w:rFonts w:ascii="Arial" w:hAnsi="Arial" w:eastAsia="Arial" w:cs="Arial"/>
-          <w:color w:val="6bb38a"/>
-          <w:sz w:val="20"/>
-        </w:rPr>
-        <w:t xml:space="preserve">AndroidView</w:t>
-      </w:r>
-      <w:r>
-        <w:rPr>
-          <w:rFonts w:ascii="Arial" w:hAnsi="Arial" w:eastAsia="Arial" w:cs="Arial"/>
-          <w:color w:val="bcbec4"/>
-          <w:sz w:val="20"/>
-        </w:rPr>
-        <w:t xml:space="preserve">(</w:t>
-        <w:br/>
-        <w:t xml:space="preserve">        </w:t>
-      </w:r>
-      <w:r>
-        <w:rPr>
-          <w:rFonts w:ascii="Arial" w:hAnsi="Arial" w:eastAsia="Arial" w:cs="Arial"/>
-          <w:color w:val="56c1d6"/>
-          <w:sz w:val="20"/>
-        </w:rPr>
-        <w:t xml:space="preserve">modifier = </w:t>
-      </w:r>
-      <w:r>
-        <w:rPr>
-          <w:rFonts w:ascii="Arial" w:hAnsi="Arial" w:eastAsia="Arial" w:cs="Arial"/>
-          <w:color w:val="bcbec4"/>
-          <w:sz w:val="20"/>
-        </w:rPr>
-        <w:t xml:space="preserve">Modifier.</w:t>
-      </w:r>
-      <w:r>
-        <w:rPr>
-          <w:rFonts w:ascii="Arial" w:hAnsi="Arial" w:eastAsia="Arial" w:cs="Arial"/>
-          <w:i/>
-          <w:color w:val="57aaf7"/>
-          <w:sz w:val="20"/>
-        </w:rPr>
-        <w:t xml:space="preserve">fillMaxWidth</w:t>
-      </w:r>
-      <w:r>
-        <w:rPr>
-          <w:rFonts w:ascii="Arial" w:hAnsi="Arial" w:eastAsia="Arial" w:cs="Arial"/>
-          <w:color w:val="bcbec4"/>
-          <w:sz w:val="20"/>
-        </w:rPr>
-        <w:t xml:space="preserve">(),</w:t>
-        <w:br/>
-        <w:t xml:space="preserve">        </w:t>
-      </w:r>
-      <w:r>
-        <w:rPr>
-          <w:rFonts w:ascii="Arial" w:hAnsi="Arial" w:eastAsia="Arial" w:cs="Arial"/>
-          <w:color w:val="56c1d6"/>
-          <w:sz w:val="20"/>
-        </w:rPr>
-        <w:t xml:space="preserve">factory = </w:t>
-      </w:r>
-      <w:r>
-        <w:rPr>
-          <w:rFonts w:ascii="Arial" w:hAnsi="Arial" w:eastAsia="Arial" w:cs="Arial"/>
-          <w:b/>
-          <w:color w:val="bcbec4"/>
-          <w:sz w:val="20"/>
-        </w:rPr>
-        <w:t xml:space="preserve">{ </w:t>
-      </w:r>
-      <w:r>
-        <w:rPr>
-          <w:rFonts w:ascii="Arial" w:hAnsi="Arial" w:eastAsia="Arial" w:cs="Arial"/>
-          <w:color w:val="bcbec4"/>
-          <w:sz w:val="20"/>
-        </w:rPr>
-        <w:t xml:space="preserve">context </w:t>
-      </w:r>
-      <w:r>
-        <w:rPr>
-          <w:rFonts w:ascii="Arial" w:hAnsi="Arial" w:eastAsia="Arial" w:cs="Arial"/>
-          <w:b/>
-          <w:color w:val="bcbec4"/>
-          <w:sz w:val="20"/>
-        </w:rPr>
-        <w:t xml:space="preserve">-&gt;            </w:t>
-      </w:r>
-      <w:r>
-        <w:rPr>
-          <w:rFonts w:ascii="Arial" w:hAnsi="Arial" w:eastAsia="Arial" w:cs="Arial"/>
-          <w:color w:val="bcbec4"/>
-          <w:sz w:val="20"/>
-        </w:rPr>
-        <w:t xml:space="preserve">AdView(context).</w:t>
-      </w:r>
-      <w:r>
-        <w:rPr>
-          <w:rFonts w:ascii="Arial" w:hAnsi="Arial" w:eastAsia="Arial" w:cs="Arial"/>
-          <w:i/>
-          <w:color w:val="57aaf7"/>
-          <w:sz w:val="20"/>
-        </w:rPr>
-        <w:t xml:space="preserve">apply </w:t>
-      </w:r>
-      <w:r>
-        <w:rPr>
-          <w:rFonts w:ascii="Arial" w:hAnsi="Arial" w:eastAsia="Arial" w:cs="Arial"/>
-          <w:b/>
-          <w:color w:val="bcbec4"/>
-          <w:sz w:val="20"/>
-        </w:rPr>
-        <w:t xml:space="preserve">{                </w:t>
-      </w:r>
-      <w:r>
-        <w:rPr>
-          <w:rFonts w:ascii="Arial" w:hAnsi="Arial" w:eastAsia="Arial" w:cs="Arial"/>
-          <w:color w:val="bcbec4"/>
-          <w:sz w:val="20"/>
-        </w:rPr>
-        <w:t xml:space="preserve">setAdSize(AdSize.</w:t>
-      </w:r>
-      <w:r>
-        <w:rPr>
-          <w:rFonts w:ascii="Arial" w:hAnsi="Arial" w:eastAsia="Arial" w:cs="Arial"/>
-          <w:i/>
-          <w:color w:val="c77dbb"/>
-          <w:sz w:val="20"/>
-        </w:rPr>
-        <w:t xml:space="preserve">BANNER</w:t>
-      </w:r>
-      <w:r>
-        <w:rPr>
-          <w:rFonts w:ascii="Arial" w:hAnsi="Arial" w:eastAsia="Arial" w:cs="Arial"/>
-          <w:color w:val="bcbec4"/>
-          <w:sz w:val="20"/>
-        </w:rPr>
-        <w:t xml:space="preserve">)</w:t>
-        <w:br/>
-        <w:t xml:space="preserve">                setAdUnitId(adUnitId)</w:t>
-        <w:br/>
-        <w:t xml:space="preserve">                loadAd(AdRequest.Builder().build())</w:t>
-        <w:br/>
-        <w:t xml:space="preserve">            </w:t>
-      </w:r>
-      <w:r>
-        <w:rPr>
-          <w:rFonts w:ascii="Arial" w:hAnsi="Arial" w:eastAsia="Arial" w:cs="Arial"/>
-          <w:b/>
-          <w:color w:val="bcbec4"/>
-          <w:sz w:val="20"/>
-        </w:rPr>
-        <w:t xml:space="preserve">}        }    </w:t>
-      </w:r>
-      <w:r>
-        <w:rPr>
-          <w:rFonts w:ascii="Arial" w:hAnsi="Arial" w:eastAsia="Arial" w:cs="Arial"/>
-          <w:color w:val="bcbec4"/>
-          <w:sz w:val="20"/>
-        </w:rPr>
-        <w:t xml:space="preserve">)</w:t>
-        <w:br/>
-        <w:t xml:space="preserve">}</w:t>
       </w:r>
       <w:r/>
     </w:p>

</xml_diff>